<commit_message>
zp, gz at added
</commit_message>
<xml_diff>
--- a/templates/title_page.docx
+++ b/templates/title_page.docx
@@ -12254,10 +12254,13 @@
     <w:name w:val="ДОК Таблица Текст Центр"/>
     <w:basedOn w:val="affe"/>
     <w:qFormat/>
-    <w:rsid w:val="00901804"/>
+    <w:rsid w:val="00FC389C"/>
     <w:pPr>
       <w:jc w:val="center"/>
     </w:pPr>
+    <w:rPr>
+      <w:sz w:val="20"/>
+    </w:rPr>
   </w:style>
   <w:style w:type="paragraph" w:customStyle="1" w:styleId="afff2">
     <w:name w:val="ДОК Текст"/>

</xml_diff>

<commit_message>
Tables generating with codes of items
</commit_message>
<xml_diff>
--- a/templates/title_page.docx
+++ b/templates/title_page.docx
@@ -218,11 +218,9 @@
         </w:rPr>
         <w:t xml:space="preserve"> </w:t>
       </w:r>
-      <w:proofErr w:type="spellStart"/>
       <w:r>
         <w:t>Юнител</w:t>
       </w:r>
-      <w:proofErr w:type="spellEnd"/>
       <w:r>
         <w:rPr>
           <w:lang w:val="en-US"/>
@@ -495,14 +493,12 @@
       <w:r>
         <w:t>_</w:t>
       </w:r>
-      <w:proofErr w:type="spellStart"/>
       <w:r>
         <w:rPr>
           <w:lang w:val="en-US"/>
         </w:rPr>
         <w:t>shet</w:t>
       </w:r>
-      <w:proofErr w:type="spellEnd"/>
       <w:r>
         <w:t xml:space="preserve"> </w:t>
       </w:r>
@@ -524,14 +520,12 @@
       <w:r>
         <w:t>_</w:t>
       </w:r>
-      <w:proofErr w:type="spellStart"/>
       <w:r>
         <w:rPr>
           <w:lang w:val="en-US"/>
         </w:rPr>
         <w:t>shet</w:t>
       </w:r>
-      <w:proofErr w:type="spellEnd"/>
       <w:r>
         <w:t xml:space="preserve"> </w:t>
       </w:r>
@@ -826,23 +820,7 @@
           <w:rFonts w:ascii="Consolas" w:hAnsi="Consolas"/>
           <w:color w:val="0F1115"/>
         </w:rPr>
-        <w:t xml:space="preserve"> </w:t>
-      </w:r>
-      <w:proofErr w:type="spellStart"/>
-      <w:r>
-        <w:rPr>
-          <w:rFonts w:ascii="Consolas" w:hAnsi="Consolas"/>
-          <w:color w:val="0F1115"/>
-        </w:rPr>
-        <w:t>endif</w:t>
-      </w:r>
-      <w:proofErr w:type="spellEnd"/>
-      <w:r>
-        <w:rPr>
-          <w:rFonts w:ascii="Consolas" w:hAnsi="Consolas"/>
-          <w:color w:val="0F1115"/>
-        </w:rPr>
-        <w:t xml:space="preserve"> %}</w:t>
+        <w:t xml:space="preserve"> endif %}</w:t>
       </w:r>
     </w:p>
     <w:p>
@@ -1019,13 +997,8 @@
         <w:ind w:left="0" w:firstLine="567"/>
       </w:pPr>
       <w:r>
-        <w:t>СТО 34.01-23.1-001-2017 Объем и нормы испытаний электрооборудования. Утвержден распоряжением ПАО «</w:t>
-      </w:r>
-      <w:proofErr w:type="spellStart"/>
-      <w:r>
-        <w:t>Россети</w:t>
-      </w:r>
-      <w:proofErr w:type="spellEnd"/>
+        <w:t>СТО 34.01-23.1-001-2017 Объем и нормы испытаний электрооборудования. Утвержден распоряжением ПАО «Россети</w:t>
+      </w:r>
       <w:r>
         <w:t>» от 29.05.2017;</w:t>
       </w:r>
@@ -1120,14 +1093,12 @@
       <w:r>
         <w:t xml:space="preserve">- 35 </w:t>
       </w:r>
-      <w:proofErr w:type="spellStart"/>
       <w:r>
         <w:t>кВ</w:t>
       </w:r>
       <w:r>
         <w:t>.</w:t>
       </w:r>
-      <w:proofErr w:type="spellEnd"/>
       <w:r>
         <w:t xml:space="preserve"> 3-е издание, переработанное и дополненное.</w:t>
       </w:r>
@@ -4945,10 +4916,1854 @@
     <w:p/>
     <w:p/>
     <w:p/>
+    <w:p>
+      <w:pPr>
+        <w:sectPr>
+          <w:headerReference w:type="default" r:id="rId14"/>
+          <w:footerReference w:type="default" r:id="rId15"/>
+          <w:pgSz w:w="11907" w:h="16839" w:code="9"/>
+          <w:pgMar w:top="567" w:right="567" w:bottom="567" w:left="1418" w:header="227" w:footer="227" w:gutter="0"/>
+          <w:cols w:space="708"/>
+          <w:docGrid w:linePitch="360"/>
+        </w:sectPr>
+      </w:pPr>
+    </w:p>
+    <w:p>
+      <w:pPr>
+        <w:pStyle w:val="14"/>
+      </w:pPr>
+      <w:bookmarkStart w:id="0" w:name="X6df0dc407ac9d0d35d77f3b02cf3de2e76409b0"/>
+      <w:r>
+        <w:lastRenderedPageBreak/>
+        <w:t>1</w:t>
+      </w:r>
+      <w:r>
+        <w:tab/>
+        <w:t>Климатические условия проведения испытаний</w:t>
+      </w:r>
+    </w:p>
+    <w:p>
+      <w:pPr>
+        <w:pStyle w:val="311"/>
+        <w:rPr>
+          <w:lang w:val="ru-RU"/>
+        </w:rPr>
+      </w:pPr>
+      <w:r>
+        <w:rPr>
+          <w:lang w:val="ru-RU"/>
+        </w:rPr>
+        <w:t>Температура окружающей среды _____ºС;</w:t>
+      </w:r>
+    </w:p>
+    <w:p>
+      <w:pPr>
+        <w:pStyle w:val="311"/>
+        <w:rPr>
+          <w:lang w:val="ru-RU"/>
+        </w:rPr>
+      </w:pPr>
+      <w:r>
+        <w:rPr>
+          <w:lang w:val="ru-RU"/>
+        </w:rPr>
+        <w:t>Атмосферное давление _______ мм.рт.ст.;</w:t>
+      </w:r>
+    </w:p>
+    <w:p>
+      <w:pPr>
+        <w:pStyle w:val="311"/>
+        <w:rPr>
+          <w:lang w:val="ru-RU"/>
+        </w:rPr>
+      </w:pPr>
+      <w:r>
+        <w:rPr>
+          <w:lang w:val="ru-RU"/>
+        </w:rPr>
+        <w:t>Влажность воздуха ______ %.</w:t>
+      </w:r>
+    </w:p>
+    <w:p>
+      <w:pPr>
+        <w:pStyle w:val="14"/>
+      </w:pPr>
+      <w:bookmarkStart w:id="1" w:name="основные-технические-данные"/>
+      <w:bookmarkEnd w:id="0"/>
+      <w:r>
+        <w:t>2</w:t>
+      </w:r>
+      <w:r>
+        <w:tab/>
+        <w:t>Основные технические данные устройств</w:t>
+      </w:r>
+    </w:p>
+    <w:p>
+      <w:pPr>
+        <w:pStyle w:val="afffffff9"/>
+      </w:pPr>
+      <w:bookmarkStart w:id="2" w:name="устройство"/>
+      <w:r>
+        <w:t>Таблица 2.1</w:t>
+      </w:r>
+      <w:r>
+        <w:t xml:space="preserve"> – </w:t>
+      </w:r>
+      <w:r>
+        <w:t>Технические данные ЮНИТ</w:t>
+      </w:r>
+      <w:r>
+        <w:t xml:space="preserve"> </w:t>
+      </w:r>
+      <w:r>
+        <w:t>&lt;&lt;REPEAT_UNIT&gt;&gt;</w:t>
+      </w:r>
+    </w:p>
+    <w:tbl>
+      <w:tblPr>
+        <w:tblStyle w:val="aff7"/>
+        <w:tblW w:w="0" w:type="auto"/>
+        <w:tblLook w:val="04A0" w:firstRow="1" w:lastRow="0" w:firstColumn="1" w:lastColumn="0" w:noHBand="0" w:noVBand="1"/>
+      </w:tblPr>
+      <w:tblGrid>
+        <w:gridCol w:w="2689"/>
+        <w:gridCol w:w="7223"/>
+      </w:tblGrid>
+      <w:tr>
+        <w:tc>
+          <w:tcPr>
+            <w:tcW w:w="2689" w:type="dxa"/>
+            <w:shd w:val="clear" w:color="auto" w:fill="B8CCE4" w:themeFill="accent1" w:themeFillTint="66"/>
+            <w:vAlign w:val="center"/>
+          </w:tcPr>
+          <w:p>
+            <w:pPr>
+              <w:pStyle w:val="afff1"/>
+              <w:rPr>
+                <w:b/>
+                <w:bCs w:val="0"/>
+              </w:rPr>
+            </w:pPr>
+            <w:r>
+              <w:rPr>
+                <w:b/>
+                <w:bCs w:val="0"/>
+              </w:rPr>
+              <w:t>Код заказа ЮНИТ</w:t>
+            </w:r>
+          </w:p>
+        </w:tc>
+        <w:tc>
+          <w:tcPr>
+            <w:tcW w:w="7223" w:type="dxa"/>
+            <w:vAlign w:val="center"/>
+          </w:tcPr>
+          <w:p>
+            <w:pPr>
+              <w:pStyle w:val="afff1"/>
+            </w:pPr>
+            <w:r>
+              <w:t>&lt;&lt;CODE&gt;&gt;</w:t>
+            </w:r>
+          </w:p>
+        </w:tc>
+      </w:tr>
+      <w:tr>
+        <w:tc>
+          <w:tcPr>
+            <w:tcW w:w="2689" w:type="dxa"/>
+            <w:shd w:val="clear" w:color="auto" w:fill="B8CCE4" w:themeFill="accent1" w:themeFillTint="66"/>
+            <w:vAlign w:val="center"/>
+          </w:tcPr>
+          <w:p>
+            <w:pPr>
+              <w:pStyle w:val="afff1"/>
+              <w:rPr>
+                <w:b/>
+                <w:bCs w:val="0"/>
+              </w:rPr>
+            </w:pPr>
+            <w:r>
+              <w:rPr>
+                <w:b/>
+                <w:bCs w:val="0"/>
+              </w:rPr>
+              <w:t>Заводской номер</w:t>
+            </w:r>
+          </w:p>
+        </w:tc>
+        <w:tc>
+          <w:tcPr>
+            <w:tcW w:w="7223" w:type="dxa"/>
+            <w:vAlign w:val="center"/>
+          </w:tcPr>
+          <w:p>
+            <w:pPr>
+              <w:pStyle w:val="afff1"/>
+              <w:rPr>
+                <w:lang w:val="en-US"/>
+              </w:rPr>
+            </w:pPr>
+          </w:p>
+        </w:tc>
+      </w:tr>
+      <w:tr>
+        <w:tc>
+          <w:tcPr>
+            <w:tcW w:w="2689" w:type="dxa"/>
+            <w:shd w:val="clear" w:color="auto" w:fill="B8CCE4" w:themeFill="accent1" w:themeFillTint="66"/>
+            <w:vAlign w:val="center"/>
+          </w:tcPr>
+          <w:p>
+            <w:pPr>
+              <w:pStyle w:val="afff1"/>
+              <w:rPr>
+                <w:b/>
+                <w:bCs w:val="0"/>
+              </w:rPr>
+            </w:pPr>
+            <w:r>
+              <w:rPr>
+                <w:b/>
+                <w:bCs w:val="0"/>
+              </w:rPr>
+              <w:t>Завод-изготовитель</w:t>
+            </w:r>
+          </w:p>
+        </w:tc>
+        <w:tc>
+          <w:tcPr>
+            <w:tcW w:w="7223" w:type="dxa"/>
+            <w:vAlign w:val="center"/>
+          </w:tcPr>
+          <w:p>
+            <w:pPr>
+              <w:pStyle w:val="afff1"/>
+            </w:pPr>
+            <w:r>
+              <w:t>ООО Юнител Инжиниринг</w:t>
+            </w:r>
+          </w:p>
+        </w:tc>
+      </w:tr>
+      <w:tr>
+        <w:tc>
+          <w:tcPr>
+            <w:tcW w:w="2689" w:type="dxa"/>
+            <w:shd w:val="clear" w:color="auto" w:fill="B8CCE4" w:themeFill="accent1" w:themeFillTint="66"/>
+            <w:vAlign w:val="center"/>
+          </w:tcPr>
+          <w:p>
+            <w:pPr>
+              <w:pStyle w:val="afff1"/>
+              <w:rPr>
+                <w:b/>
+                <w:bCs w:val="0"/>
+              </w:rPr>
+            </w:pPr>
+            <w:r>
+              <w:rPr>
+                <w:b/>
+                <w:bCs w:val="0"/>
+              </w:rPr>
+              <w:t>Год выпуска</w:t>
+            </w:r>
+          </w:p>
+        </w:tc>
+        <w:tc>
+          <w:tcPr>
+            <w:tcW w:w="7223" w:type="dxa"/>
+            <w:vAlign w:val="center"/>
+          </w:tcPr>
+          <w:p>
+            <w:pPr>
+              <w:pStyle w:val="afff1"/>
+              <w:rPr>
+                <w:lang w:val="en-US"/>
+              </w:rPr>
+            </w:pPr>
+          </w:p>
+        </w:tc>
+      </w:tr>
+      <w:tr>
+        <w:tc>
+          <w:tcPr>
+            <w:tcW w:w="2689" w:type="dxa"/>
+            <w:shd w:val="clear" w:color="auto" w:fill="B8CCE4" w:themeFill="accent1" w:themeFillTint="66"/>
+            <w:vAlign w:val="center"/>
+          </w:tcPr>
+          <w:p>
+            <w:pPr>
+              <w:pStyle w:val="afff1"/>
+              <w:rPr>
+                <w:b/>
+                <w:bCs w:val="0"/>
+              </w:rPr>
+            </w:pPr>
+            <w:r>
+              <w:rPr>
+                <w:b/>
+                <w:bCs w:val="0"/>
+              </w:rPr>
+              <w:t>Uпит, В</w:t>
+            </w:r>
+          </w:p>
+        </w:tc>
+        <w:tc>
+          <w:tcPr>
+            <w:tcW w:w="7223" w:type="dxa"/>
+            <w:vAlign w:val="center"/>
+          </w:tcPr>
+          <w:p>
+            <w:pPr>
+              <w:pStyle w:val="afff1"/>
+            </w:pPr>
+            <w:r>
+              <w:t>=/~220</w:t>
+            </w:r>
+          </w:p>
+        </w:tc>
+      </w:tr>
+    </w:tbl>
+    <w:p>
+      <w:pPr>
+        <w:pStyle w:val="311"/>
+        <w:ind w:firstLine="0"/>
+        <w:rPr>
+          <w:lang w:val="ru-RU"/>
+        </w:rPr>
+      </w:pPr>
+      <w:bookmarkStart w:id="3" w:name="tbl:table21"/>
+      <w:bookmarkEnd w:id="1"/>
+    </w:p>
+    <w:p>
+      <w:pPr>
+        <w:pStyle w:val="afffffff9"/>
+      </w:pPr>
+      <w:bookmarkStart w:id="4" w:name="tbl:table22"/>
+      <w:r>
+        <w:t>Таблица 2.2</w:t>
+      </w:r>
+      <w:r>
+        <w:t xml:space="preserve"> – </w:t>
+      </w:r>
+      <w:r>
+        <w:t>Технические данные ИЧМ</w:t>
+      </w:r>
+      <w:r>
+        <w:t xml:space="preserve"> </w:t>
+      </w:r>
+      <w:r>
+        <w:t>&lt;&lt;REPEAT_HMI&gt;&gt;</w:t>
+      </w:r>
+    </w:p>
+    <w:tbl>
+      <w:tblPr>
+        <w:tblStyle w:val="aff7"/>
+        <w:tblW w:w="0" w:type="auto"/>
+        <w:tblLook w:val="04A0" w:firstRow="1" w:lastRow="0" w:firstColumn="1" w:lastColumn="0" w:noHBand="0" w:noVBand="1"/>
+      </w:tblPr>
+      <w:tblGrid>
+        <w:gridCol w:w="2689"/>
+        <w:gridCol w:w="7223"/>
+      </w:tblGrid>
+      <w:tr>
+        <w:tc>
+          <w:tcPr>
+            <w:tcW w:w="2689" w:type="dxa"/>
+            <w:shd w:val="clear" w:color="auto" w:fill="B8CCE4" w:themeFill="accent1" w:themeFillTint="66"/>
+            <w:vAlign w:val="center"/>
+          </w:tcPr>
+          <w:p>
+            <w:pPr>
+              <w:pStyle w:val="afff1"/>
+              <w:rPr>
+                <w:b/>
+                <w:bCs w:val="0"/>
+                <w:lang w:val="en-US"/>
+              </w:rPr>
+            </w:pPr>
+            <w:r>
+              <w:rPr>
+                <w:b/>
+                <w:bCs w:val="0"/>
+              </w:rPr>
+              <w:t xml:space="preserve">Код заказа </w:t>
+            </w:r>
+            <w:r>
+              <w:rPr>
+                <w:b/>
+                <w:bCs w:val="0"/>
+              </w:rPr>
+              <w:t>ИЧМ</w:t>
+            </w:r>
+          </w:p>
+        </w:tc>
+        <w:tc>
+          <w:tcPr>
+            <w:tcW w:w="7223" w:type="dxa"/>
+            <w:vAlign w:val="center"/>
+          </w:tcPr>
+          <w:p>
+            <w:pPr>
+              <w:pStyle w:val="afff1"/>
+            </w:pPr>
+            <w:r>
+              <w:t>&lt;&lt;CODE&gt;&gt;</w:t>
+            </w:r>
+          </w:p>
+        </w:tc>
+      </w:tr>
+      <w:tr>
+        <w:tc>
+          <w:tcPr>
+            <w:tcW w:w="2689" w:type="dxa"/>
+            <w:shd w:val="clear" w:color="auto" w:fill="B8CCE4" w:themeFill="accent1" w:themeFillTint="66"/>
+            <w:vAlign w:val="center"/>
+          </w:tcPr>
+          <w:p>
+            <w:pPr>
+              <w:pStyle w:val="afff1"/>
+              <w:rPr>
+                <w:b/>
+                <w:bCs w:val="0"/>
+              </w:rPr>
+            </w:pPr>
+            <w:r>
+              <w:rPr>
+                <w:b/>
+                <w:bCs w:val="0"/>
+              </w:rPr>
+              <w:t>Заводской номер</w:t>
+            </w:r>
+          </w:p>
+        </w:tc>
+        <w:tc>
+          <w:tcPr>
+            <w:tcW w:w="7223" w:type="dxa"/>
+            <w:vAlign w:val="center"/>
+          </w:tcPr>
+          <w:p>
+            <w:pPr>
+              <w:pStyle w:val="afff1"/>
+              <w:rPr>
+                <w:lang w:val="en-US"/>
+              </w:rPr>
+            </w:pPr>
+          </w:p>
+        </w:tc>
+      </w:tr>
+      <w:tr>
+        <w:tc>
+          <w:tcPr>
+            <w:tcW w:w="2689" w:type="dxa"/>
+            <w:shd w:val="clear" w:color="auto" w:fill="B8CCE4" w:themeFill="accent1" w:themeFillTint="66"/>
+            <w:vAlign w:val="center"/>
+          </w:tcPr>
+          <w:p>
+            <w:pPr>
+              <w:pStyle w:val="afff1"/>
+              <w:rPr>
+                <w:b/>
+                <w:bCs w:val="0"/>
+              </w:rPr>
+            </w:pPr>
+            <w:r>
+              <w:rPr>
+                <w:b/>
+                <w:bCs w:val="0"/>
+              </w:rPr>
+              <w:t>Завод-изготовитель</w:t>
+            </w:r>
+          </w:p>
+        </w:tc>
+        <w:tc>
+          <w:tcPr>
+            <w:tcW w:w="7223" w:type="dxa"/>
+            <w:vAlign w:val="center"/>
+          </w:tcPr>
+          <w:p>
+            <w:pPr>
+              <w:pStyle w:val="afff1"/>
+            </w:pPr>
+            <w:r>
+              <w:t>ООО Юнител Инжиниринг</w:t>
+            </w:r>
+          </w:p>
+        </w:tc>
+      </w:tr>
+      <w:tr>
+        <w:tc>
+          <w:tcPr>
+            <w:tcW w:w="2689" w:type="dxa"/>
+            <w:shd w:val="clear" w:color="auto" w:fill="B8CCE4" w:themeFill="accent1" w:themeFillTint="66"/>
+            <w:vAlign w:val="center"/>
+          </w:tcPr>
+          <w:p>
+            <w:pPr>
+              <w:pStyle w:val="afff1"/>
+              <w:rPr>
+                <w:b/>
+                <w:bCs w:val="0"/>
+              </w:rPr>
+            </w:pPr>
+            <w:r>
+              <w:rPr>
+                <w:b/>
+                <w:bCs w:val="0"/>
+              </w:rPr>
+              <w:t>Год выпуска</w:t>
+            </w:r>
+          </w:p>
+        </w:tc>
+        <w:tc>
+          <w:tcPr>
+            <w:tcW w:w="7223" w:type="dxa"/>
+            <w:vAlign w:val="center"/>
+          </w:tcPr>
+          <w:p>
+            <w:pPr>
+              <w:pStyle w:val="afff1"/>
+              <w:rPr>
+                <w:lang w:val="en-US"/>
+              </w:rPr>
+            </w:pPr>
+          </w:p>
+        </w:tc>
+      </w:tr>
+      <w:tr>
+        <w:tc>
+          <w:tcPr>
+            <w:tcW w:w="2689" w:type="dxa"/>
+            <w:shd w:val="clear" w:color="auto" w:fill="B8CCE4" w:themeFill="accent1" w:themeFillTint="66"/>
+            <w:vAlign w:val="center"/>
+          </w:tcPr>
+          <w:p>
+            <w:pPr>
+              <w:pStyle w:val="afff1"/>
+              <w:rPr>
+                <w:b/>
+                <w:bCs w:val="0"/>
+              </w:rPr>
+            </w:pPr>
+            <w:r>
+              <w:rPr>
+                <w:b/>
+                <w:bCs w:val="0"/>
+              </w:rPr>
+              <w:t>Uпит, В</w:t>
+            </w:r>
+          </w:p>
+        </w:tc>
+        <w:tc>
+          <w:tcPr>
+            <w:tcW w:w="7223" w:type="dxa"/>
+            <w:vAlign w:val="center"/>
+          </w:tcPr>
+          <w:p>
+            <w:pPr>
+              <w:pStyle w:val="afff1"/>
+            </w:pPr>
+            <w:r>
+              <w:t>=/~220</w:t>
+            </w:r>
+          </w:p>
+        </w:tc>
+      </w:tr>
+    </w:tbl>
+    <w:p>
+      <w:pPr>
+        <w:pStyle w:val="311"/>
+        <w:ind w:firstLine="0"/>
+        <w:rPr>
+          <w:lang w:val="ru-RU"/>
+        </w:rPr>
+      </w:pPr>
+      <w:bookmarkStart w:id="5" w:name="защищаемое-оборудование"/>
+      <w:bookmarkStart w:id="6" w:name="tbl:table23"/>
+      <w:bookmarkEnd w:id="2"/>
+      <w:bookmarkEnd w:id="3"/>
+    </w:p>
+    <w:p>
+      <w:pPr>
+        <w:pStyle w:val="afffffff9"/>
+      </w:pPr>
+      <w:r>
+        <w:t>Таблица 2.3</w:t>
+      </w:r>
+      <w:r>
+        <w:t xml:space="preserve"> – </w:t>
+      </w:r>
+      <w:r>
+        <w:t>Технические данные ВЧ ПРМ/ПРД</w:t>
+      </w:r>
+      <w:r>
+        <w:t xml:space="preserve"> </w:t>
+      </w:r>
+      <w:r>
+        <w:t>&lt;&lt;REPEAT_PRV&gt;&gt;</w:t>
+      </w:r>
+    </w:p>
+    <w:tbl>
+      <w:tblPr>
+        <w:tblStyle w:val="aff7"/>
+        <w:tblW w:w="0" w:type="auto"/>
+        <w:tblLook w:val="04A0" w:firstRow="1" w:lastRow="0" w:firstColumn="1" w:lastColumn="0" w:noHBand="0" w:noVBand="1"/>
+      </w:tblPr>
+      <w:tblGrid>
+        <w:gridCol w:w="2689"/>
+        <w:gridCol w:w="7223"/>
+      </w:tblGrid>
+      <w:tr>
+        <w:tc>
+          <w:tcPr>
+            <w:tcW w:w="2689" w:type="dxa"/>
+            <w:shd w:val="clear" w:color="auto" w:fill="B8CCE4" w:themeFill="accent1" w:themeFillTint="66"/>
+            <w:vAlign w:val="center"/>
+          </w:tcPr>
+          <w:p>
+            <w:pPr>
+              <w:pStyle w:val="afff1"/>
+              <w:rPr>
+                <w:b/>
+                <w:bCs w:val="0"/>
+              </w:rPr>
+            </w:pPr>
+            <w:r>
+              <w:rPr>
+                <w:b/>
+                <w:bCs w:val="0"/>
+              </w:rPr>
+              <w:t>Код заказа ВЧ ПРМ/ПРД</w:t>
+            </w:r>
+          </w:p>
+        </w:tc>
+        <w:tc>
+          <w:tcPr>
+            <w:tcW w:w="7223" w:type="dxa"/>
+            <w:vAlign w:val="center"/>
+          </w:tcPr>
+          <w:p>
+            <w:pPr>
+              <w:pStyle w:val="afff1"/>
+            </w:pPr>
+            <w:r>
+              <w:t>&lt;&lt;CODE&gt;&gt;</w:t>
+            </w:r>
+          </w:p>
+        </w:tc>
+      </w:tr>
+      <w:tr>
+        <w:tc>
+          <w:tcPr>
+            <w:tcW w:w="2689" w:type="dxa"/>
+            <w:shd w:val="clear" w:color="auto" w:fill="B8CCE4" w:themeFill="accent1" w:themeFillTint="66"/>
+            <w:vAlign w:val="center"/>
+          </w:tcPr>
+          <w:p>
+            <w:pPr>
+              <w:pStyle w:val="afff1"/>
+              <w:rPr>
+                <w:b/>
+                <w:bCs w:val="0"/>
+              </w:rPr>
+            </w:pPr>
+            <w:r>
+              <w:rPr>
+                <w:b/>
+                <w:bCs w:val="0"/>
+              </w:rPr>
+              <w:t>Заводской номер</w:t>
+            </w:r>
+          </w:p>
+        </w:tc>
+        <w:tc>
+          <w:tcPr>
+            <w:tcW w:w="7223" w:type="dxa"/>
+            <w:vAlign w:val="center"/>
+          </w:tcPr>
+          <w:p>
+            <w:pPr>
+              <w:pStyle w:val="afff1"/>
+              <w:rPr>
+                <w:lang w:val="en-US"/>
+              </w:rPr>
+            </w:pPr>
+          </w:p>
+        </w:tc>
+      </w:tr>
+      <w:tr>
+        <w:tc>
+          <w:tcPr>
+            <w:tcW w:w="2689" w:type="dxa"/>
+            <w:shd w:val="clear" w:color="auto" w:fill="B8CCE4" w:themeFill="accent1" w:themeFillTint="66"/>
+            <w:vAlign w:val="center"/>
+          </w:tcPr>
+          <w:p>
+            <w:pPr>
+              <w:pStyle w:val="afff1"/>
+              <w:rPr>
+                <w:b/>
+                <w:bCs w:val="0"/>
+              </w:rPr>
+            </w:pPr>
+            <w:r>
+              <w:rPr>
+                <w:b/>
+                <w:bCs w:val="0"/>
+              </w:rPr>
+              <w:t>Завод-изготовитель</w:t>
+            </w:r>
+          </w:p>
+        </w:tc>
+        <w:tc>
+          <w:tcPr>
+            <w:tcW w:w="7223" w:type="dxa"/>
+            <w:vAlign w:val="center"/>
+          </w:tcPr>
+          <w:p>
+            <w:pPr>
+              <w:pStyle w:val="afff1"/>
+            </w:pPr>
+            <w:r>
+              <w:t>ООО Юнител Инжиниринг</w:t>
+            </w:r>
+          </w:p>
+        </w:tc>
+      </w:tr>
+      <w:tr>
+        <w:tc>
+          <w:tcPr>
+            <w:tcW w:w="2689" w:type="dxa"/>
+            <w:shd w:val="clear" w:color="auto" w:fill="B8CCE4" w:themeFill="accent1" w:themeFillTint="66"/>
+            <w:vAlign w:val="center"/>
+          </w:tcPr>
+          <w:p>
+            <w:pPr>
+              <w:pStyle w:val="afff1"/>
+              <w:rPr>
+                <w:b/>
+                <w:bCs w:val="0"/>
+              </w:rPr>
+            </w:pPr>
+            <w:r>
+              <w:rPr>
+                <w:b/>
+                <w:bCs w:val="0"/>
+              </w:rPr>
+              <w:t>Год выпуска</w:t>
+            </w:r>
+          </w:p>
+        </w:tc>
+        <w:tc>
+          <w:tcPr>
+            <w:tcW w:w="7223" w:type="dxa"/>
+            <w:vAlign w:val="center"/>
+          </w:tcPr>
+          <w:p>
+            <w:pPr>
+              <w:pStyle w:val="afff1"/>
+              <w:rPr>
+                <w:lang w:val="en-US"/>
+              </w:rPr>
+            </w:pPr>
+          </w:p>
+        </w:tc>
+      </w:tr>
+      <w:tr>
+        <w:tc>
+          <w:tcPr>
+            <w:tcW w:w="2689" w:type="dxa"/>
+            <w:shd w:val="clear" w:color="auto" w:fill="B8CCE4" w:themeFill="accent1" w:themeFillTint="66"/>
+            <w:vAlign w:val="center"/>
+          </w:tcPr>
+          <w:p>
+            <w:pPr>
+              <w:pStyle w:val="afff1"/>
+              <w:rPr>
+                <w:b/>
+                <w:bCs w:val="0"/>
+              </w:rPr>
+            </w:pPr>
+            <w:r>
+              <w:rPr>
+                <w:b/>
+                <w:bCs w:val="0"/>
+              </w:rPr>
+              <w:t>Uпит, В</w:t>
+            </w:r>
+          </w:p>
+        </w:tc>
+        <w:tc>
+          <w:tcPr>
+            <w:tcW w:w="7223" w:type="dxa"/>
+            <w:vAlign w:val="center"/>
+          </w:tcPr>
+          <w:p>
+            <w:pPr>
+              <w:pStyle w:val="afff1"/>
+            </w:pPr>
+            <w:r>
+              <w:t>=/~220</w:t>
+            </w:r>
+          </w:p>
+        </w:tc>
+      </w:tr>
+    </w:tbl>
+    <w:p>
+      <w:pPr>
+        <w:pStyle w:val="311"/>
+        <w:ind w:firstLine="0"/>
+        <w:rPr>
+          <w:lang w:val="ru-RU"/>
+        </w:rPr>
+      </w:pPr>
+    </w:p>
+    <w:p>
+      <w:pPr>
+        <w:pStyle w:val="14"/>
+      </w:pPr>
+      <w:bookmarkStart w:id="7" w:name="дополнительные-сведения"/>
+      <w:bookmarkEnd w:id="4"/>
+      <w:bookmarkEnd w:id="5"/>
+      <w:bookmarkEnd w:id="6"/>
+      <w:r>
+        <w:t>3</w:t>
+      </w:r>
+      <w:r>
+        <w:tab/>
+        <w:t>Дополнительные сведения</w:t>
+      </w:r>
+    </w:p>
+    <w:p>
+      <w:pPr>
+        <w:pStyle w:val="311"/>
+        <w:rPr>
+          <w:lang w:val="ru-RU"/>
+        </w:rPr>
+      </w:pPr>
+      <w:r>
+        <w:rPr>
+          <w:lang w:val="ru-RU"/>
+        </w:rPr>
+        <w:t>Устройство подключено к трансформаторам тока типа___________________________________ ____________________________________________________________________________________________________________________________________________________________________________________ ______________________________________________________________________________________________________________________________________________________ с коэффициентами трансформации ____________________________________________________________________________________________________________________________________________________________________________________ __________________________________________________________________________________________ __________________________________________________________________________________________</w:t>
+      </w:r>
+    </w:p>
+    <w:p>
+      <w:pPr>
+        <w:pStyle w:val="14"/>
+      </w:pPr>
+      <w:bookmarkStart w:id="8" w:name="уставки-и-конфигурация"/>
+      <w:bookmarkEnd w:id="7"/>
+      <w:r>
+        <w:t>4</w:t>
+      </w:r>
+      <w:r>
+        <w:tab/>
+        <w:t>Уставки и конфигурация</w:t>
+      </w:r>
+    </w:p>
+    <w:p>
+      <w:pPr>
+        <w:pStyle w:val="311"/>
+        <w:rPr>
+          <w:lang w:val="ru-RU"/>
+        </w:rPr>
+      </w:pPr>
+      <w:r>
+        <w:rPr>
+          <w:lang w:val="ru-RU"/>
+        </w:rPr>
+        <w:t xml:space="preserve">Уставки РЗА и параметры конфигурации установлены согласно рабочей документации ______________________________________________________ и бланку уставок___________________ __________________________________________________________________________________________ </w:t>
+      </w:r>
+      <w:r>
+        <w:rPr>
+          <w:lang w:val="ru-RU"/>
+        </w:rPr>
+        <w:lastRenderedPageBreak/>
+        <w:t>В работу введена ____ группа уставок. Рабочие уставки функций РЗА задаются в устройстве с использованием ПО «ЮНИТ-СЕРВИС РЗА» согласно утверждённому бланку уставок. Проверяется возможность считывания информации, а также активации группы уставок с использованием дисплея и кнопок на панели ИЧМ (при наличии модуля ИЧМ). Результат проверки: _______________________________________________________</w:t>
+      </w:r>
+    </w:p>
+    <w:p>
+      <w:pPr>
+        <w:pStyle w:val="14"/>
+      </w:pPr>
+      <w:bookmarkStart w:id="9" w:name="внешний-осмотр"/>
+      <w:bookmarkEnd w:id="8"/>
+      <w:r>
+        <w:t>5</w:t>
+      </w:r>
+      <w:r>
+        <w:tab/>
+        <w:t>Внешний осмотр</w:t>
+      </w:r>
+    </w:p>
+    <w:p>
+      <w:pPr>
+        <w:pStyle w:val="311"/>
+        <w:rPr>
+          <w:lang w:val="ru-RU"/>
+        </w:rPr>
+      </w:pPr>
+      <w:r>
+        <w:rPr>
+          <w:lang w:val="ru-RU"/>
+        </w:rPr>
+        <w:t>Произведен внешний осмотр устройства «ЮНИТ-М300-ДЗТ2», на предмет:</w:t>
+      </w:r>
+    </w:p>
+    <w:p>
+      <w:pPr>
+        <w:pStyle w:val="311"/>
+        <w:numPr>
+          <w:ilvl w:val="0"/>
+          <w:numId w:val="46"/>
+        </w:numPr>
+        <w:rPr>
+          <w:lang w:val="ru-RU"/>
+        </w:rPr>
+      </w:pPr>
+      <w:r>
+        <w:rPr>
+          <w:lang w:val="ru-RU"/>
+        </w:rPr>
+        <w:t>отсутствия повреждений, подтеков воды, в том числе, высохших;</w:t>
+      </w:r>
+    </w:p>
+    <w:p>
+      <w:pPr>
+        <w:pStyle w:val="311"/>
+        <w:numPr>
+          <w:ilvl w:val="0"/>
+          <w:numId w:val="46"/>
+        </w:numPr>
+        <w:rPr>
+          <w:lang w:val="ru-RU"/>
+        </w:rPr>
+      </w:pPr>
+      <w:r>
+        <w:rPr>
+          <w:lang w:val="ru-RU"/>
+        </w:rPr>
+        <w:t>отсутствия налета окислов на металлических поверхностях, отсутствия запыленности;</w:t>
+      </w:r>
+    </w:p>
+    <w:p>
+      <w:pPr>
+        <w:pStyle w:val="311"/>
+        <w:numPr>
+          <w:ilvl w:val="0"/>
+          <w:numId w:val="46"/>
+        </w:numPr>
+        <w:rPr>
+          <w:lang w:val="ru-RU"/>
+        </w:rPr>
+      </w:pPr>
+      <w:r>
+        <w:rPr>
+          <w:lang w:val="ru-RU"/>
+        </w:rPr>
+        <w:t>состояния контактных поверхностей клемм рядов зажимов, в клеммных коробках и сборках (протяжка при необходимости), разъемов интерфейса связи;</w:t>
+      </w:r>
+    </w:p>
+    <w:p>
+      <w:pPr>
+        <w:pStyle w:val="311"/>
+        <w:numPr>
+          <w:ilvl w:val="0"/>
+          <w:numId w:val="46"/>
+        </w:numPr>
+        <w:rPr>
+          <w:lang w:val="ru-RU"/>
+        </w:rPr>
+      </w:pPr>
+      <w:r>
+        <w:rPr>
+          <w:lang w:val="ru-RU"/>
+        </w:rPr>
+        <w:t>отсутствия механических повреждений элементов управления;</w:t>
+      </w:r>
+    </w:p>
+    <w:p>
+      <w:pPr>
+        <w:pStyle w:val="311"/>
+        <w:numPr>
+          <w:ilvl w:val="0"/>
+          <w:numId w:val="46"/>
+        </w:numPr>
+        <w:rPr>
+          <w:lang w:val="ru-RU"/>
+        </w:rPr>
+      </w:pPr>
+      <w:r>
+        <w:rPr>
+          <w:lang w:val="ru-RU"/>
+        </w:rPr>
+        <w:t>соответствия типов, установленных в шкафу аппаратов заводской спецификации и проектной документации (производится только при новом включении устройства);</w:t>
+      </w:r>
+    </w:p>
+    <w:p>
+      <w:pPr>
+        <w:pStyle w:val="311"/>
+        <w:numPr>
+          <w:ilvl w:val="0"/>
+          <w:numId w:val="46"/>
+        </w:numPr>
+        <w:rPr>
+          <w:lang w:val="ru-RU"/>
+        </w:rPr>
+      </w:pPr>
+      <w:r>
+        <w:rPr>
+          <w:lang w:val="ru-RU"/>
+        </w:rPr>
+        <w:t>правильности выполнения концевых разделок контрольных кабелей, уплотнений проходных отверстий;</w:t>
+      </w:r>
+    </w:p>
+    <w:p>
+      <w:pPr>
+        <w:pStyle w:val="311"/>
+        <w:numPr>
+          <w:ilvl w:val="0"/>
+          <w:numId w:val="46"/>
+        </w:numPr>
+        <w:rPr>
+          <w:lang w:val="ru-RU"/>
+        </w:rPr>
+      </w:pPr>
+      <w:r>
+        <w:rPr>
+          <w:lang w:val="ru-RU"/>
+        </w:rPr>
+        <w:t>состояния уплотнений дверей шкафов, кожухов, вторичных выводов трансформаторов тока и напряжения, кабельных вводов, крышек технологических отверстий и т.п.;</w:t>
+      </w:r>
+    </w:p>
+    <w:p>
+      <w:pPr>
+        <w:pStyle w:val="311"/>
+        <w:numPr>
+          <w:ilvl w:val="0"/>
+          <w:numId w:val="46"/>
+        </w:numPr>
+        <w:rPr>
+          <w:lang w:val="ru-RU"/>
+        </w:rPr>
+      </w:pPr>
+      <w:r>
+        <w:rPr>
+          <w:lang w:val="ru-RU"/>
+        </w:rPr>
+        <w:t>состояния и правильности выполнения заземлений цепей вторичных соединений и аппаратуры устройства;</w:t>
+      </w:r>
+    </w:p>
+    <w:p>
+      <w:pPr>
+        <w:pStyle w:val="311"/>
+        <w:numPr>
+          <w:ilvl w:val="0"/>
+          <w:numId w:val="46"/>
+        </w:numPr>
+        <w:rPr>
+          <w:lang w:val="ru-RU"/>
+        </w:rPr>
+      </w:pPr>
+      <w:r>
+        <w:rPr>
+          <w:lang w:val="ru-RU"/>
+        </w:rPr>
+        <w:t>наличия и правильности надписей на элементах устройства и соответствие их функциональному назначению, наличие и правильность маркировки кабелей, жил кабелей и проводов.</w:t>
+      </w:r>
+    </w:p>
+    <w:p>
+      <w:pPr>
+        <w:pStyle w:val="311"/>
+        <w:rPr>
+          <w:lang w:val="ru-RU"/>
+        </w:rPr>
+      </w:pPr>
+      <w:r>
+        <w:rPr>
+          <w:lang w:val="ru-RU"/>
+        </w:rPr>
+        <w:t>Результат проверки: _______________________________________________________</w:t>
+      </w:r>
+    </w:p>
+    <w:p>
+      <w:pPr>
+        <w:pStyle w:val="14"/>
+      </w:pPr>
+      <w:bookmarkStart w:id="10" w:name="X0e50c966c55b2f6f4209c430f930650427220e2"/>
+      <w:bookmarkEnd w:id="9"/>
+      <w:r>
+        <w:t>6</w:t>
+      </w:r>
+      <w:r>
+        <w:tab/>
+        <w:t>Проверка конфигурирования и параметрирования устройства</w:t>
+      </w:r>
+    </w:p>
+    <w:p>
+      <w:pPr>
+        <w:pStyle w:val="311"/>
+        <w:rPr>
+          <w:lang w:val="ru-RU"/>
+        </w:rPr>
+      </w:pPr>
+      <w:r>
+        <w:rPr>
+          <w:lang w:val="ru-RU"/>
+        </w:rPr>
+        <w:t>С помощью ПО «ЮНИТ-СЕРВИС РЗА» загружены текущие настройки конфигурирования и параметрирования устройства (матрица входных и выходных сигналов, настройки светодиодов и функциональных клавиш, конфигурация устройства, настройки регистрации) и произведено сравнение их с последними корректированными настройками.</w:t>
+      </w:r>
+    </w:p>
+    <w:p>
+      <w:pPr>
+        <w:pStyle w:val="311"/>
+        <w:rPr>
+          <w:lang w:val="ru-RU"/>
+        </w:rPr>
+      </w:pPr>
+      <w:r>
+        <w:rPr>
+          <w:lang w:val="ru-RU"/>
+        </w:rPr>
+        <w:t>Результат проверки: _______________________________________________________</w:t>
+      </w:r>
+    </w:p>
+    <w:p>
+      <w:pPr>
+        <w:pStyle w:val="14"/>
+      </w:pPr>
+      <w:bookmarkStart w:id="11" w:name="проверка-состояния-изоляции"/>
+      <w:bookmarkEnd w:id="10"/>
+      <w:r>
+        <w:t>7</w:t>
+      </w:r>
+      <w:r>
+        <w:tab/>
+        <w:t>Проверка состояния изоляции</w:t>
+      </w:r>
+    </w:p>
+    <w:p>
+      <w:pPr>
+        <w:pStyle w:val="22"/>
+      </w:pPr>
+      <w:bookmarkStart w:id="12" w:name="X9687952bc1d30db593d75bc5681b56e0d46ca55"/>
+      <w:r>
+        <w:t>7.1</w:t>
+      </w:r>
+      <w:r>
+        <w:tab/>
+        <w:t>Измерение сопротивления изоляции устройства</w:t>
+      </w:r>
+    </w:p>
+    <w:p>
+      <w:pPr>
+        <w:pStyle w:val="311"/>
+        <w:rPr>
+          <w:lang w:val="ru-RU"/>
+        </w:rPr>
+      </w:pPr>
+      <w:r>
+        <w:rPr>
+          <w:lang w:val="ru-RU"/>
+        </w:rPr>
+        <w:t xml:space="preserve">Произведено измерение сопротивления изоляции всех групп цепей относительно корпуса устройства и между собой мегаомметром с номинальным напряжением 1000 В. Результаты измерений занесены в таблицу </w:t>
+      </w:r>
+      <w:r>
+        <w:t> </w:t>
+      </w:r>
+      <w:hyperlink w:anchor="tbl:table71">
+        <w:r>
+          <w:rPr>
+            <w:rStyle w:val="afff4"/>
+            <w:lang w:val="ru-RU"/>
+          </w:rPr>
+          <w:t>7.1</w:t>
+        </w:r>
+      </w:hyperlink>
+      <w:r>
+        <w:rPr>
+          <w:lang w:val="ru-RU"/>
+        </w:rPr>
+        <w:t>. Норма сопротивления изоляции - не менее 100 МОм.</w:t>
+      </w:r>
+    </w:p>
+    <w:p>
+      <w:pPr>
+        <w:pStyle w:val="afffffff9"/>
+      </w:pPr>
+      <w:bookmarkStart w:id="13" w:name="tbl:table71"/>
+      <w:r>
+        <w:lastRenderedPageBreak/>
+        <w:t>Таблица 7.1. Проверка сопротивления изоляции цепей</w:t>
+      </w:r>
+    </w:p>
+    <w:tbl>
+      <w:tblPr>
+        <w:tblStyle w:val="Table"/>
+        <w:tblW w:w="5000" w:type="pct"/>
+        <w:tblLayout w:type="fixed"/>
+        <w:tblLook w:val="0020" w:firstRow="1" w:lastRow="0" w:firstColumn="0" w:lastColumn="0" w:noHBand="0" w:noVBand="0"/>
+        <w:tblCaption w:val="Таблица 7.1. Проверка сопротивления изоляции цепей"/>
+      </w:tblPr>
+      <w:tblGrid>
+        <w:gridCol w:w="1367"/>
+        <w:gridCol w:w="6039"/>
+        <w:gridCol w:w="2506"/>
+      </w:tblGrid>
+      <w:tr>
+        <w:trPr>
+          <w:cnfStyle w:val="100000000000" w:firstRow="1" w:lastRow="0" w:firstColumn="0" w:lastColumn="0" w:oddVBand="0" w:evenVBand="0" w:oddHBand="0" w:evenHBand="0" w:firstRowFirstColumn="0" w:firstRowLastColumn="0" w:lastRowFirstColumn="0" w:lastRowLastColumn="0"/>
+          <w:tblHeader/>
+        </w:trPr>
+        <w:tc>
+          <w:tcPr>
+            <w:tcW w:w="1092" w:type="dxa"/>
+          </w:tcPr>
+          <w:p>
+            <w:pPr>
+              <w:pStyle w:val="afff1"/>
+            </w:pPr>
+            <w:r>
+              <w:t>Группа №</w:t>
+            </w:r>
+          </w:p>
+        </w:tc>
+        <w:tc>
+          <w:tcPr>
+            <w:tcW w:w="4824" w:type="dxa"/>
+          </w:tcPr>
+          <w:p>
+            <w:pPr>
+              <w:pStyle w:val="afff1"/>
+            </w:pPr>
+            <w:r>
+              <w:t>Наименование цепи</w:t>
+            </w:r>
+          </w:p>
+        </w:tc>
+        <w:tc>
+          <w:tcPr>
+            <w:tcW w:w="2002" w:type="dxa"/>
+          </w:tcPr>
+          <w:p>
+            <w:pPr>
+              <w:pStyle w:val="afff1"/>
+            </w:pPr>
+            <w:r>
+              <w:t>Сопротивление, МОм</w:t>
+            </w:r>
+          </w:p>
+        </w:tc>
+      </w:tr>
+      <w:tr>
+        <w:tc>
+          <w:tcPr>
+            <w:tcW w:w="1092" w:type="dxa"/>
+          </w:tcPr>
+          <w:p>
+            <w:pPr>
+              <w:pStyle w:val="afff1"/>
+            </w:pPr>
+            <w:r>
+              <w:t>1</w:t>
+            </w:r>
+          </w:p>
+        </w:tc>
+        <w:tc>
+          <w:tcPr>
+            <w:tcW w:w="4824" w:type="dxa"/>
+          </w:tcPr>
+          <w:p>
+            <w:pPr>
+              <w:pStyle w:val="afff1"/>
+            </w:pPr>
+            <w:r>
+              <w:t>Цепи переменного тока</w:t>
+            </w:r>
+          </w:p>
+        </w:tc>
+        <w:tc>
+          <w:tcPr>
+            <w:tcW w:w="2002" w:type="dxa"/>
+          </w:tcPr>
+          <w:p>
+            <w:pPr>
+              <w:pStyle w:val="afff1"/>
+            </w:pPr>
+          </w:p>
+        </w:tc>
+      </w:tr>
+      <w:tr>
+        <w:tc>
+          <w:tcPr>
+            <w:tcW w:w="1092" w:type="dxa"/>
+          </w:tcPr>
+          <w:p>
+            <w:pPr>
+              <w:pStyle w:val="afff1"/>
+            </w:pPr>
+            <w:r>
+              <w:t>2</w:t>
+            </w:r>
+          </w:p>
+        </w:tc>
+        <w:tc>
+          <w:tcPr>
+            <w:tcW w:w="4824" w:type="dxa"/>
+          </w:tcPr>
+          <w:p>
+            <w:pPr>
+              <w:pStyle w:val="afff1"/>
+            </w:pPr>
+            <w:r>
+              <w:t>Цепи питания оперативным током</w:t>
+            </w:r>
+          </w:p>
+        </w:tc>
+        <w:tc>
+          <w:tcPr>
+            <w:tcW w:w="2002" w:type="dxa"/>
+          </w:tcPr>
+          <w:p>
+            <w:pPr>
+              <w:pStyle w:val="afff1"/>
+            </w:pPr>
+          </w:p>
+        </w:tc>
+      </w:tr>
+      <w:tr>
+        <w:tc>
+          <w:tcPr>
+            <w:tcW w:w="1092" w:type="dxa"/>
+          </w:tcPr>
+          <w:p>
+            <w:pPr>
+              <w:pStyle w:val="afff1"/>
+            </w:pPr>
+            <w:r>
+              <w:t>3</w:t>
+            </w:r>
+          </w:p>
+        </w:tc>
+        <w:tc>
+          <w:tcPr>
+            <w:tcW w:w="4824" w:type="dxa"/>
+          </w:tcPr>
+          <w:p>
+            <w:pPr>
+              <w:pStyle w:val="afff1"/>
+            </w:pPr>
+            <w:r>
+              <w:t>Цепи выходных реле</w:t>
+            </w:r>
+          </w:p>
+        </w:tc>
+        <w:tc>
+          <w:tcPr>
+            <w:tcW w:w="2002" w:type="dxa"/>
+          </w:tcPr>
+          <w:p>
+            <w:pPr>
+              <w:pStyle w:val="afff1"/>
+            </w:pPr>
+          </w:p>
+        </w:tc>
+      </w:tr>
+      <w:tr>
+        <w:tc>
+          <w:tcPr>
+            <w:tcW w:w="1092" w:type="dxa"/>
+          </w:tcPr>
+          <w:p>
+            <w:pPr>
+              <w:pStyle w:val="afff1"/>
+            </w:pPr>
+            <w:r>
+              <w:t>4</w:t>
+            </w:r>
+          </w:p>
+        </w:tc>
+        <w:tc>
+          <w:tcPr>
+            <w:tcW w:w="4824" w:type="dxa"/>
+          </w:tcPr>
+          <w:p>
+            <w:pPr>
+              <w:pStyle w:val="afff1"/>
+            </w:pPr>
+            <w:r>
+              <w:t>Выходные цепи дискретных сигналов от выходных реле</w:t>
+            </w:r>
+          </w:p>
+        </w:tc>
+        <w:tc>
+          <w:tcPr>
+            <w:tcW w:w="2002" w:type="dxa"/>
+          </w:tcPr>
+          <w:p>
+            <w:pPr>
+              <w:pStyle w:val="afff1"/>
+            </w:pPr>
+          </w:p>
+        </w:tc>
+      </w:tr>
+      <w:tr>
+        <w:tc>
+          <w:tcPr>
+            <w:tcW w:w="1092" w:type="dxa"/>
+          </w:tcPr>
+          <w:p>
+            <w:pPr>
+              <w:pStyle w:val="afff1"/>
+            </w:pPr>
+            <w:r>
+              <w:t>5</w:t>
+            </w:r>
+          </w:p>
+        </w:tc>
+        <w:tc>
+          <w:tcPr>
+            <w:tcW w:w="4824" w:type="dxa"/>
+          </w:tcPr>
+          <w:p>
+            <w:pPr>
+              <w:pStyle w:val="afff1"/>
+            </w:pPr>
+            <w:r>
+              <w:t>Цепи сигнализации</w:t>
+            </w:r>
+          </w:p>
+        </w:tc>
+        <w:tc>
+          <w:tcPr>
+            <w:tcW w:w="2002" w:type="dxa"/>
+          </w:tcPr>
+          <w:p>
+            <w:pPr>
+              <w:pStyle w:val="afff1"/>
+            </w:pPr>
+          </w:p>
+        </w:tc>
+      </w:tr>
+    </w:tbl>
+    <w:bookmarkEnd w:id="11"/>
+    <w:p>
+      <w:pPr>
+        <w:pStyle w:val="311"/>
+      </w:pPr>
+      <w:r>
+        <w:t>Результат проверки: _______________________________________________________</w:t>
+      </w:r>
+    </w:p>
+    <w:p>
+      <w:pPr>
+        <w:pStyle w:val="22"/>
+      </w:pPr>
+      <w:bookmarkStart w:id="14" w:name="Xfe84b6805b603ed1e9a2c84fcd68ec5c091cc8c"/>
+      <w:bookmarkEnd w:id="12"/>
+      <w:r>
+        <w:t>7.2</w:t>
+      </w:r>
+      <w:r>
+        <w:tab/>
+        <w:t>Измерение сопротивления изоляции шкафа с подключенными внешними цепями</w:t>
+      </w:r>
+    </w:p>
+    <w:p>
+      <w:pPr>
+        <w:pStyle w:val="311"/>
+        <w:rPr>
+          <w:lang w:val="ru-RU"/>
+        </w:rPr>
+      </w:pPr>
+      <w:r>
+        <w:rPr>
+          <w:lang w:val="ru-RU"/>
+        </w:rPr>
+        <w:t xml:space="preserve">Произведено измерение сопротивления изоляции всех групп цепей относительно шкафа со всеми подключенными внешними кабельными связями и между собой мегаомметром с номинальным напряжением 1000 В. Результаты измерений занесены в таблицу </w:t>
+      </w:r>
+      <w:r>
+        <w:t> </w:t>
+      </w:r>
+      <w:hyperlink w:anchor="tbl:table72">
+        <w:r>
+          <w:rPr>
+            <w:rStyle w:val="afff4"/>
+            <w:lang w:val="ru-RU"/>
+          </w:rPr>
+          <w:t>7.2</w:t>
+        </w:r>
+      </w:hyperlink>
+      <w:r>
+        <w:rPr>
+          <w:lang w:val="ru-RU"/>
+        </w:rPr>
+        <w:t>. Норма сопротивления изоляции - не менее 1 МОм.</w:t>
+      </w:r>
+    </w:p>
+    <w:p>
+      <w:pPr>
+        <w:pStyle w:val="afffffff9"/>
+      </w:pPr>
+      <w:bookmarkStart w:id="15" w:name="tbl:table72"/>
+      <w:r>
+        <w:t>Таблица 7.2. Проверка сопротивления изоляции цепей</w:t>
+      </w:r>
+    </w:p>
+    <w:tbl>
+      <w:tblPr>
+        <w:tblStyle w:val="Table"/>
+        <w:tblW w:w="5000" w:type="pct"/>
+        <w:tblLayout w:type="fixed"/>
+        <w:tblLook w:val="0020" w:firstRow="1" w:lastRow="0" w:firstColumn="0" w:lastColumn="0" w:noHBand="0" w:noVBand="0"/>
+        <w:tblCaption w:val="Таблица 7.2. Проверка сопротивления изоляции цепей"/>
+      </w:tblPr>
+      <w:tblGrid>
+        <w:gridCol w:w="1367"/>
+        <w:gridCol w:w="6039"/>
+        <w:gridCol w:w="2506"/>
+      </w:tblGrid>
+      <w:tr>
+        <w:trPr>
+          <w:cnfStyle w:val="100000000000" w:firstRow="1" w:lastRow="0" w:firstColumn="0" w:lastColumn="0" w:oddVBand="0" w:evenVBand="0" w:oddHBand="0" w:evenHBand="0" w:firstRowFirstColumn="0" w:firstRowLastColumn="0" w:lastRowFirstColumn="0" w:lastRowLastColumn="0"/>
+          <w:tblHeader/>
+        </w:trPr>
+        <w:tc>
+          <w:tcPr>
+            <w:tcW w:w="1092" w:type="dxa"/>
+          </w:tcPr>
+          <w:p>
+            <w:pPr>
+              <w:pStyle w:val="afff1"/>
+            </w:pPr>
+            <w:r>
+              <w:t>Группа №</w:t>
+            </w:r>
+          </w:p>
+        </w:tc>
+        <w:tc>
+          <w:tcPr>
+            <w:tcW w:w="4824" w:type="dxa"/>
+          </w:tcPr>
+          <w:p>
+            <w:pPr>
+              <w:pStyle w:val="afff1"/>
+            </w:pPr>
+            <w:r>
+              <w:t>Наименование цепи</w:t>
+            </w:r>
+          </w:p>
+        </w:tc>
+        <w:tc>
+          <w:tcPr>
+            <w:tcW w:w="2002" w:type="dxa"/>
+          </w:tcPr>
+          <w:p>
+            <w:pPr>
+              <w:pStyle w:val="afff1"/>
+            </w:pPr>
+            <w:r>
+              <w:t>Сопротивление, МОм</w:t>
+            </w:r>
+          </w:p>
+        </w:tc>
+      </w:tr>
+      <w:tr>
+        <w:tc>
+          <w:tcPr>
+            <w:tcW w:w="1092" w:type="dxa"/>
+          </w:tcPr>
+          <w:p>
+            <w:pPr>
+              <w:pStyle w:val="afff1"/>
+            </w:pPr>
+            <w:r>
+              <w:t>1</w:t>
+            </w:r>
+          </w:p>
+        </w:tc>
+        <w:tc>
+          <w:tcPr>
+            <w:tcW w:w="4824" w:type="dxa"/>
+          </w:tcPr>
+          <w:p>
+            <w:pPr>
+              <w:pStyle w:val="afff1"/>
+            </w:pPr>
+            <w:r>
+              <w:t>Цепи переменного тока</w:t>
+            </w:r>
+          </w:p>
+        </w:tc>
+        <w:tc>
+          <w:tcPr>
+            <w:tcW w:w="2002" w:type="dxa"/>
+          </w:tcPr>
+          <w:p>
+            <w:pPr>
+              <w:pStyle w:val="afff1"/>
+            </w:pPr>
+          </w:p>
+        </w:tc>
+      </w:tr>
+      <w:tr>
+        <w:tc>
+          <w:tcPr>
+            <w:tcW w:w="1092" w:type="dxa"/>
+          </w:tcPr>
+          <w:p>
+            <w:pPr>
+              <w:pStyle w:val="afff1"/>
+            </w:pPr>
+            <w:r>
+              <w:t>2</w:t>
+            </w:r>
+          </w:p>
+        </w:tc>
+        <w:tc>
+          <w:tcPr>
+            <w:tcW w:w="4824" w:type="dxa"/>
+          </w:tcPr>
+          <w:p>
+            <w:pPr>
+              <w:pStyle w:val="afff1"/>
+            </w:pPr>
+            <w:r>
+              <w:t>Цепи питания оперативным током</w:t>
+            </w:r>
+          </w:p>
+        </w:tc>
+        <w:tc>
+          <w:tcPr>
+            <w:tcW w:w="2002" w:type="dxa"/>
+          </w:tcPr>
+          <w:p>
+            <w:pPr>
+              <w:pStyle w:val="afff1"/>
+            </w:pPr>
+          </w:p>
+        </w:tc>
+      </w:tr>
+      <w:tr>
+        <w:tc>
+          <w:tcPr>
+            <w:tcW w:w="1092" w:type="dxa"/>
+          </w:tcPr>
+          <w:p>
+            <w:pPr>
+              <w:pStyle w:val="afff1"/>
+            </w:pPr>
+            <w:r>
+              <w:t>3</w:t>
+            </w:r>
+          </w:p>
+        </w:tc>
+        <w:tc>
+          <w:tcPr>
+            <w:tcW w:w="4824" w:type="dxa"/>
+          </w:tcPr>
+          <w:p>
+            <w:pPr>
+              <w:pStyle w:val="afff1"/>
+            </w:pPr>
+            <w:r>
+              <w:t>Цепи выходных реле</w:t>
+            </w:r>
+          </w:p>
+        </w:tc>
+        <w:tc>
+          <w:tcPr>
+            <w:tcW w:w="2002" w:type="dxa"/>
+          </w:tcPr>
+          <w:p>
+            <w:pPr>
+              <w:pStyle w:val="afff1"/>
+            </w:pPr>
+          </w:p>
+        </w:tc>
+      </w:tr>
+      <w:tr>
+        <w:tc>
+          <w:tcPr>
+            <w:tcW w:w="1092" w:type="dxa"/>
+          </w:tcPr>
+          <w:p>
+            <w:pPr>
+              <w:pStyle w:val="afff1"/>
+            </w:pPr>
+            <w:r>
+              <w:t>4</w:t>
+            </w:r>
+          </w:p>
+        </w:tc>
+        <w:tc>
+          <w:tcPr>
+            <w:tcW w:w="4824" w:type="dxa"/>
+          </w:tcPr>
+          <w:p>
+            <w:pPr>
+              <w:pStyle w:val="afff1"/>
+            </w:pPr>
+            <w:r>
+              <w:t>Выходные цепи дискретных сигналов от выходных реле</w:t>
+            </w:r>
+          </w:p>
+        </w:tc>
+        <w:tc>
+          <w:tcPr>
+            <w:tcW w:w="2002" w:type="dxa"/>
+          </w:tcPr>
+          <w:p>
+            <w:pPr>
+              <w:pStyle w:val="afff1"/>
+            </w:pPr>
+          </w:p>
+        </w:tc>
+      </w:tr>
+      <w:tr>
+        <w:tc>
+          <w:tcPr>
+            <w:tcW w:w="1092" w:type="dxa"/>
+          </w:tcPr>
+          <w:p>
+            <w:pPr>
+              <w:pStyle w:val="afff1"/>
+            </w:pPr>
+            <w:r>
+              <w:t>5</w:t>
+            </w:r>
+          </w:p>
+        </w:tc>
+        <w:tc>
+          <w:tcPr>
+            <w:tcW w:w="4824" w:type="dxa"/>
+          </w:tcPr>
+          <w:p>
+            <w:pPr>
+              <w:pStyle w:val="afff1"/>
+            </w:pPr>
+            <w:r>
+              <w:t>Цепи сигнализации</w:t>
+            </w:r>
+          </w:p>
+        </w:tc>
+        <w:tc>
+          <w:tcPr>
+            <w:tcW w:w="2002" w:type="dxa"/>
+          </w:tcPr>
+          <w:p>
+            <w:pPr>
+              <w:pStyle w:val="afff1"/>
+            </w:pPr>
+          </w:p>
+        </w:tc>
+      </w:tr>
+    </w:tbl>
+    <w:p>
+      <w:pPr>
+        <w:pStyle w:val="14"/>
+      </w:pPr>
+      <w:bookmarkStart w:id="16" w:name="X242d87850b64568d08d7180295cac2ddaededb8"/>
+      <w:bookmarkEnd w:id="13"/>
+      <w:bookmarkEnd w:id="14"/>
+      <w:bookmarkEnd w:id="15"/>
+      <w:r>
+        <w:t>8</w:t>
+      </w:r>
+      <w:r>
+        <w:tab/>
+        <w:t>Проверка на соответствие проектным решениям</w:t>
+      </w:r>
+    </w:p>
+    <w:p>
+      <w:pPr>
+        <w:pStyle w:val="311"/>
+        <w:rPr>
+          <w:lang w:val="ru-RU"/>
+        </w:rPr>
+      </w:pPr>
+      <w:r>
+        <w:rPr>
+          <w:lang w:val="ru-RU"/>
+        </w:rPr>
+        <w:t>Произведен анализ принципиальных схем, задания на настройку устройства РЗА на соответствие принятым проектным решениям и техническим характеристикам (функциям) устройства.</w:t>
+      </w:r>
+    </w:p>
+    <w:p>
+      <w:pPr>
+        <w:pStyle w:val="311"/>
+        <w:rPr>
+          <w:lang w:val="ru-RU"/>
+        </w:rPr>
+      </w:pPr>
+      <w:r>
+        <w:rPr>
+          <w:lang w:val="ru-RU"/>
+        </w:rPr>
+        <w:t>Результат проверки: _______________________________________________________</w:t>
+      </w:r>
+    </w:p>
+    <w:p>
+      <w:pPr>
+        <w:pStyle w:val="14"/>
+      </w:pPr>
+      <w:bookmarkStart w:id="17" w:name="X85ae948ceebeeb232a023f43459d7364299701d"/>
+      <w:bookmarkEnd w:id="16"/>
+      <w:r>
+        <w:t>9</w:t>
+      </w:r>
+      <w:r>
+        <w:tab/>
+        <w:t>Задание требуемой конфигурации, уставок и режимов работы (параметрирование) устройства</w:t>
+      </w:r>
+    </w:p>
+    <w:p>
+      <w:pPr>
+        <w:pStyle w:val="311"/>
+        <w:rPr>
+          <w:lang w:val="ru-RU"/>
+        </w:rPr>
+      </w:pPr>
+      <w:r>
+        <w:rPr>
+          <w:lang w:val="ru-RU"/>
+        </w:rPr>
+        <w:t>С помощью ПО «ЮНИТ-СЕРВИС РЗА» загружены проектные настройки конфигурирования и параметрирования устройства (матрица входных и выходных сигналов, настройки светодиодов и функциональных клавиш, конфигурация устройства, настройки регистрации).</w:t>
+      </w:r>
+    </w:p>
+    <w:p>
+      <w:pPr>
+        <w:pStyle w:val="311"/>
+        <w:rPr>
+          <w:lang w:val="ru-RU"/>
+        </w:rPr>
+      </w:pPr>
+      <w:r>
+        <w:rPr>
+          <w:lang w:val="ru-RU"/>
+        </w:rPr>
+        <w:t>Конфигурация и уставки устройства соответствуют проектным</w:t>
+      </w:r>
+      <w:proofErr w:type="gramStart"/>
+      <w:r>
+        <w:rPr>
+          <w:lang w:val="ru-RU"/>
+        </w:rPr>
+        <w:t>: Да</w:t>
+      </w:r>
+      <w:proofErr w:type="gramEnd"/>
+      <w:r>
+        <w:rPr>
+          <w:lang w:val="ru-RU"/>
+        </w:rPr>
+        <w:t xml:space="preserve"> / Нет</w:t>
+      </w:r>
+      <w:bookmarkEnd w:id="17"/>
+    </w:p>
     <w:p/>
     <w:sectPr>
-      <w:headerReference w:type="default" r:id="rId14"/>
-      <w:footerReference w:type="default" r:id="rId15"/>
       <w:pgSz w:w="11907" w:h="16839" w:code="9"/>
       <w:pgMar w:top="567" w:right="567" w:bottom="567" w:left="1418" w:header="227" w:footer="227" w:gutter="0"/>
       <w:cols w:space="708"/>
@@ -5084,7 +6899,6 @@
       </w:rPr>
       <w:t>://</w:t>
     </w:r>
-    <w:proofErr w:type="spellStart"/>
     <w:r>
       <w:rPr>
         <w:rStyle w:val="afff3"/>
@@ -5094,7 +6908,6 @@
       </w:rPr>
       <w:t>uni</w:t>
     </w:r>
-    <w:proofErr w:type="spellEnd"/>
     <w:r>
       <w:rPr>
         <w:rStyle w:val="afff3"/>
@@ -5103,7 +6916,6 @@
       </w:rPr>
       <w:t>-</w:t>
     </w:r>
-    <w:proofErr w:type="spellStart"/>
     <w:r>
       <w:rPr>
         <w:rStyle w:val="afff3"/>
@@ -5113,7 +6925,6 @@
       </w:rPr>
       <w:t>eng</w:t>
     </w:r>
-    <w:proofErr w:type="spellEnd"/>
     <w:r>
       <w:rPr>
         <w:rStyle w:val="afff3"/>
@@ -5122,7 +6933,6 @@
       </w:rPr>
       <w:t>.</w:t>
     </w:r>
-    <w:proofErr w:type="spellStart"/>
     <w:r>
       <w:rPr>
         <w:rStyle w:val="afff3"/>
@@ -5132,7 +6942,6 @@
       </w:rPr>
       <w:t>ru</w:t>
     </w:r>
-    <w:proofErr w:type="spellEnd"/>
     <w:r>
       <w:rPr>
         <w:b/>
@@ -5149,21 +6958,7 @@
       <w:rPr>
         <w:sz w:val="20"/>
       </w:rPr>
-      <w:t>ООО «</w:t>
-    </w:r>
-    <w:proofErr w:type="spellStart"/>
-    <w:r>
-      <w:rPr>
-        <w:sz w:val="20"/>
-      </w:rPr>
-      <w:t>Юнител</w:t>
-    </w:r>
-    <w:proofErr w:type="spellEnd"/>
-    <w:r>
-      <w:rPr>
-        <w:sz w:val="20"/>
-      </w:rPr>
-      <w:t xml:space="preserve"> Инжиниринг»</w:t>
+      <w:t>ООО «Юнител Инжиниринг»</w:t>
     </w:r>
   </w:p>
 </w:ftr>
@@ -5355,19 +7150,8 @@
         <w:sz w:val="20"/>
         <w:szCs w:val="16"/>
       </w:rPr>
-      <w:t xml:space="preserve">{{ </w:t>
+      <w:t>{{ code</w:t>
     </w:r>
-    <w:proofErr w:type="spellStart"/>
-    <w:r>
-      <w:rPr>
-        <w:rStyle w:val="afff3"/>
-        <w:bCs w:val="0"/>
-        <w:sz w:val="20"/>
-        <w:szCs w:val="16"/>
-      </w:rPr>
-      <w:t>code</w:t>
-    </w:r>
-    <w:proofErr w:type="spellEnd"/>
     <w:proofErr w:type="gramEnd"/>
     <w:r>
       <w:rPr>
@@ -5476,27 +7260,7 @@
         <w:sz w:val="20"/>
         <w:szCs w:val="16"/>
       </w:rPr>
-      <w:t xml:space="preserve">{{ </w:t>
-    </w:r>
-    <w:proofErr w:type="spellStart"/>
-    <w:r>
-      <w:rPr>
-        <w:rStyle w:val="afff3"/>
-        <w:bCs w:val="0"/>
-        <w:sz w:val="20"/>
-        <w:szCs w:val="16"/>
-      </w:rPr>
-      <w:t>name</w:t>
-    </w:r>
-    <w:proofErr w:type="spellEnd"/>
-    <w:r>
-      <w:rPr>
-        <w:rStyle w:val="afff3"/>
-        <w:bCs w:val="0"/>
-        <w:sz w:val="20"/>
-        <w:szCs w:val="16"/>
-      </w:rPr>
-      <w:t xml:space="preserve"> }}</w:t>
+      <w:t>{{ name }}</w:t>
     </w:r>
   </w:p>
 </w:hdr>
@@ -5619,19 +7383,8 @@
         <w:sz w:val="20"/>
         <w:szCs w:val="16"/>
       </w:rPr>
-      <w:t xml:space="preserve">{{ </w:t>
+      <w:t>{{ code</w:t>
     </w:r>
-    <w:proofErr w:type="spellStart"/>
-    <w:r>
-      <w:rPr>
-        <w:rStyle w:val="afff3"/>
-        <w:bCs w:val="0"/>
-        <w:sz w:val="20"/>
-        <w:szCs w:val="16"/>
-      </w:rPr>
-      <w:t>code</w:t>
-    </w:r>
-    <w:proofErr w:type="spellEnd"/>
     <w:proofErr w:type="gramEnd"/>
     <w:r>
       <w:rPr>
@@ -5740,27 +7493,7 @@
         <w:sz w:val="20"/>
         <w:szCs w:val="16"/>
       </w:rPr>
-      <w:t xml:space="preserve">{{ </w:t>
-    </w:r>
-    <w:proofErr w:type="spellStart"/>
-    <w:r>
-      <w:rPr>
-        <w:rStyle w:val="afff3"/>
-        <w:bCs w:val="0"/>
-        <w:sz w:val="20"/>
-        <w:szCs w:val="16"/>
-      </w:rPr>
-      <w:t>name</w:t>
-    </w:r>
-    <w:proofErr w:type="spellEnd"/>
-    <w:r>
-      <w:rPr>
-        <w:rStyle w:val="afff3"/>
-        <w:bCs w:val="0"/>
-        <w:sz w:val="20"/>
-        <w:szCs w:val="16"/>
-      </w:rPr>
-      <w:t xml:space="preserve"> }}</w:t>
+      <w:t>{{ name }}</w:t>
     </w:r>
   </w:p>
 </w:hdr>
@@ -5791,19 +7524,8 @@
         <w:sz w:val="20"/>
         <w:szCs w:val="16"/>
       </w:rPr>
-      <w:t xml:space="preserve">{{ </w:t>
+      <w:t>{{ code</w:t>
     </w:r>
-    <w:proofErr w:type="spellStart"/>
-    <w:r>
-      <w:rPr>
-        <w:rStyle w:val="afff3"/>
-        <w:bCs w:val="0"/>
-        <w:sz w:val="20"/>
-        <w:szCs w:val="16"/>
-      </w:rPr>
-      <w:t>code</w:t>
-    </w:r>
-    <w:proofErr w:type="spellEnd"/>
     <w:proofErr w:type="gramEnd"/>
     <w:r>
       <w:rPr>
@@ -5912,27 +7634,7 @@
         <w:sz w:val="20"/>
         <w:szCs w:val="16"/>
       </w:rPr>
-      <w:t xml:space="preserve">{{ </w:t>
-    </w:r>
-    <w:proofErr w:type="spellStart"/>
-    <w:r>
-      <w:rPr>
-        <w:rStyle w:val="afff3"/>
-        <w:bCs w:val="0"/>
-        <w:sz w:val="20"/>
-        <w:szCs w:val="16"/>
-      </w:rPr>
-      <w:t>name</w:t>
-    </w:r>
-    <w:proofErr w:type="spellEnd"/>
-    <w:r>
-      <w:rPr>
-        <w:rStyle w:val="afff3"/>
-        <w:bCs w:val="0"/>
-        <w:sz w:val="20"/>
-        <w:szCs w:val="16"/>
-      </w:rPr>
-      <w:t xml:space="preserve"> }}</w:t>
+      <w:t>{{ name }}</w:t>
     </w:r>
   </w:p>
 </w:hdr>
@@ -5941,6 +7643,110 @@
 <file path=word/numbering.xml><?xml version="1.0" encoding="utf-8"?>
 <w:numbering xmlns:wpc="http://schemas.microsoft.com/office/word/2010/wordprocessingCanvas" xmlns:cx="http://schemas.microsoft.com/office/drawing/2014/chartex" xmlns:cx1="http://schemas.microsoft.com/office/drawing/2015/9/8/chartex" xmlns:cx2="http://schemas.microsoft.com/office/drawing/2015/10/21/chartex" xmlns:cx3="http://schemas.microsoft.com/office/drawing/2016/5/9/chartex" xmlns:cx4="http://schemas.microsoft.com/office/drawing/2016/5/10/chartex" xmlns:cx5="http://schemas.microsoft.com/office/drawing/2016/5/11/chartex" xmlns:cx6="http://schemas.microsoft.com/office/drawing/2016/5/12/chartex" xmlns:cx7="http://schemas.microsoft.com/office/drawing/2016/5/13/chartex" xmlns:cx8="http://schemas.microsoft.com/office/drawing/2016/5/14/chartex" xmlns:mc="http://schemas.openxmlformats.org/markup-compatibility/2006" xmlns:aink="http://schemas.microsoft.com/office/drawing/2016/ink" xmlns:am3d="http://schemas.microsoft.com/office/drawing/2017/model3d" xmlns:o="urn:schemas-microsoft-com:office:office" xmlns:oel="http://schemas.microsoft.com/office/2019/extlst" xmlns:r="http://schemas.openxmlformats.org/officeDocument/2006/relationships" xmlns:m="http://schemas.openxmlformats.org/officeDocument/2006/math" xmlns:v="urn:schemas-microsoft-com:vml" xmlns:wp14="http://schemas.microsoft.com/office/word/2010/wordprocessingDrawing" xmlns:wp="http://schemas.openxmlformats.org/drawingml/2006/wordprocessingDrawing" xmlns:w10="urn:schemas-microsoft-com:office:word" xmlns:w="http://schemas.openxmlformats.org/wordprocessingml/2006/main" xmlns:w14="http://schemas.microsoft.com/office/word/2010/wordml" xmlns:w15="http://schemas.microsoft.com/office/word/2012/wordml" xmlns:w16cex="http://schemas.microsoft.com/office/word/2018/wordml/cex" xmlns:w16cid="http://schemas.microsoft.com/office/word/2016/wordml/cid" xmlns:w16="http://schemas.microsoft.com/office/word/2018/wordml" xmlns:w16sdtdh="http://schemas.microsoft.com/office/word/2020/wordml/sdtdatahash" xmlns:w16se="http://schemas.microsoft.com/office/word/2015/wordml/symex" xmlns:wpg="http://schemas.microsoft.com/office/word/2010/wordprocessingGroup" xmlns:wpi="http://schemas.microsoft.com/office/word/2010/wordprocessingInk" xmlns:wne="http://schemas.microsoft.com/office/word/2006/wordml" xmlns:wps="http://schemas.microsoft.com/office/word/2010/wordprocessingShape" mc:Ignorable="w14 w15 w16se w16cid w16 w16cex w16sdtdh wp14">
   <w:abstractNum w:abstractNumId="0" w15:restartNumberingAfterBreak="0">
+    <w:nsid w:val="012F81A4"/>
+    <w:multiLevelType w:val="multilevel"/>
+    <w:tmpl w:val="DB9462C4"/>
+    <w:lvl w:ilvl="0">
+      <w:numFmt w:val="bullet"/>
+      <w:lvlText w:val=""/>
+      <w:lvlJc w:val="left"/>
+      <w:pPr>
+        <w:ind w:left="720" w:hanging="360"/>
+      </w:pPr>
+      <w:rPr>
+        <w:rFonts w:ascii="Symbol" w:hAnsi="Symbol" w:cs="Symbol" w:hint="default"/>
+      </w:rPr>
+    </w:lvl>
+    <w:lvl w:ilvl="1">
+      <w:numFmt w:val="bullet"/>
+      <w:lvlText w:val="o"/>
+      <w:lvlJc w:val="left"/>
+      <w:pPr>
+        <w:ind w:left="1440" w:hanging="360"/>
+      </w:pPr>
+      <w:rPr>
+        <w:rFonts w:ascii="Courier New" w:hAnsi="Courier New" w:cs="Courier New" w:hint="default"/>
+      </w:rPr>
+    </w:lvl>
+    <w:lvl w:ilvl="2">
+      <w:numFmt w:val="bullet"/>
+      <w:lvlText w:val=""/>
+      <w:lvlJc w:val="left"/>
+      <w:pPr>
+        <w:ind w:left="2160" w:hanging="360"/>
+      </w:pPr>
+      <w:rPr>
+        <w:rFonts w:ascii="Wingdings" w:hAnsi="Wingdings" w:cs="Wingdings" w:hint="default"/>
+      </w:rPr>
+    </w:lvl>
+    <w:lvl w:ilvl="3">
+      <w:numFmt w:val="bullet"/>
+      <w:lvlText w:val=""/>
+      <w:lvlJc w:val="left"/>
+      <w:pPr>
+        <w:ind w:left="2880" w:hanging="360"/>
+      </w:pPr>
+      <w:rPr>
+        <w:rFonts w:ascii="Symbol" w:hAnsi="Symbol" w:cs="Symbol" w:hint="default"/>
+      </w:rPr>
+    </w:lvl>
+    <w:lvl w:ilvl="4">
+      <w:numFmt w:val="bullet"/>
+      <w:lvlText w:val="o"/>
+      <w:lvlJc w:val="left"/>
+      <w:pPr>
+        <w:ind w:left="3600" w:hanging="360"/>
+      </w:pPr>
+      <w:rPr>
+        <w:rFonts w:ascii="Courier New" w:hAnsi="Courier New" w:cs="Courier New" w:hint="default"/>
+      </w:rPr>
+    </w:lvl>
+    <w:lvl w:ilvl="5">
+      <w:numFmt w:val="bullet"/>
+      <w:lvlText w:val=""/>
+      <w:lvlJc w:val="left"/>
+      <w:pPr>
+        <w:ind w:left="4320" w:hanging="360"/>
+      </w:pPr>
+      <w:rPr>
+        <w:rFonts w:ascii="Wingdings" w:hAnsi="Wingdings" w:cs="Wingdings" w:hint="default"/>
+      </w:rPr>
+    </w:lvl>
+    <w:lvl w:ilvl="6">
+      <w:numFmt w:val="bullet"/>
+      <w:lvlText w:val=""/>
+      <w:lvlJc w:val="left"/>
+      <w:pPr>
+        <w:ind w:left="5040" w:hanging="360"/>
+      </w:pPr>
+      <w:rPr>
+        <w:rFonts w:ascii="Symbol" w:hAnsi="Symbol" w:cs="Symbol" w:hint="default"/>
+      </w:rPr>
+    </w:lvl>
+    <w:lvl w:ilvl="7">
+      <w:numFmt w:val="bullet"/>
+      <w:lvlText w:val="o"/>
+      <w:lvlJc w:val="left"/>
+      <w:pPr>
+        <w:ind w:left="5760" w:hanging="360"/>
+      </w:pPr>
+      <w:rPr>
+        <w:rFonts w:ascii="Courier New" w:hAnsi="Courier New" w:cs="Courier New" w:hint="default"/>
+      </w:rPr>
+    </w:lvl>
+    <w:lvl w:ilvl="8">
+      <w:numFmt w:val="bullet"/>
+      <w:lvlText w:val=""/>
+      <w:lvlJc w:val="left"/>
+      <w:pPr>
+        <w:ind w:left="6480" w:hanging="360"/>
+      </w:pPr>
+      <w:rPr>
+        <w:rFonts w:ascii="Wingdings" w:hAnsi="Wingdings" w:cs="Wingdings" w:hint="default"/>
+      </w:rPr>
+    </w:lvl>
+  </w:abstractNum>
+  <w:abstractNum w:abstractNumId="1" w15:restartNumberingAfterBreak="0">
     <w:nsid w:val="0159605E"/>
     <w:multiLevelType w:val="hybridMultilevel"/>
     <w:tmpl w:val="7D28FA00"/>
@@ -6058,7 +7864,7 @@
       </w:pPr>
     </w:lvl>
   </w:abstractNum>
-  <w:abstractNum w:abstractNumId="1" w15:restartNumberingAfterBreak="0">
+  <w:abstractNum w:abstractNumId="2" w15:restartNumberingAfterBreak="0">
     <w:nsid w:val="01C107D7"/>
     <w:multiLevelType w:val="hybridMultilevel"/>
     <w:tmpl w:val="DDBE5AC6"/>
@@ -6173,7 +7979,7 @@
       </w:rPr>
     </w:lvl>
   </w:abstractNum>
-  <w:abstractNum w:abstractNumId="2" w15:restartNumberingAfterBreak="0">
+  <w:abstractNum w:abstractNumId="3" w15:restartNumberingAfterBreak="0">
     <w:nsid w:val="02662521"/>
     <w:multiLevelType w:val="hybridMultilevel"/>
     <w:tmpl w:val="55A8637A"/>
@@ -6263,7 +8069,7 @@
       </w:pPr>
     </w:lvl>
   </w:abstractNum>
-  <w:abstractNum w:abstractNumId="3" w15:restartNumberingAfterBreak="0">
+  <w:abstractNum w:abstractNumId="4" w15:restartNumberingAfterBreak="0">
     <w:nsid w:val="05CF0B63"/>
     <w:multiLevelType w:val="hybridMultilevel"/>
     <w:tmpl w:val="7E3AE834"/>
@@ -6351,7 +8157,7 @@
       </w:pPr>
     </w:lvl>
   </w:abstractNum>
-  <w:abstractNum w:abstractNumId="4" w15:restartNumberingAfterBreak="0">
+  <w:abstractNum w:abstractNumId="5" w15:restartNumberingAfterBreak="0">
     <w:nsid w:val="0B5B4EDF"/>
     <w:multiLevelType w:val="hybridMultilevel"/>
     <w:tmpl w:val="9C90D258"/>
@@ -6439,7 +8245,7 @@
       </w:pPr>
     </w:lvl>
   </w:abstractNum>
-  <w:abstractNum w:abstractNumId="5" w15:restartNumberingAfterBreak="0">
+  <w:abstractNum w:abstractNumId="6" w15:restartNumberingAfterBreak="0">
     <w:nsid w:val="0B6C6D48"/>
     <w:multiLevelType w:val="hybridMultilevel"/>
     <w:tmpl w:val="78DCF446"/>
@@ -6554,7 +8360,7 @@
       </w:rPr>
     </w:lvl>
   </w:abstractNum>
-  <w:abstractNum w:abstractNumId="6" w15:restartNumberingAfterBreak="0">
+  <w:abstractNum w:abstractNumId="7" w15:restartNumberingAfterBreak="0">
     <w:nsid w:val="0EEF1815"/>
     <w:multiLevelType w:val="hybridMultilevel"/>
     <w:tmpl w:val="55A8637A"/>
@@ -6644,7 +8450,7 @@
       </w:pPr>
     </w:lvl>
   </w:abstractNum>
-  <w:abstractNum w:abstractNumId="7" w15:restartNumberingAfterBreak="0">
+  <w:abstractNum w:abstractNumId="8" w15:restartNumberingAfterBreak="0">
     <w:nsid w:val="19352F2E"/>
     <w:multiLevelType w:val="hybridMultilevel"/>
     <w:tmpl w:val="55A8637A"/>
@@ -6734,7 +8540,7 @@
       </w:pPr>
     </w:lvl>
   </w:abstractNum>
-  <w:abstractNum w:abstractNumId="8" w15:restartNumberingAfterBreak="0">
+  <w:abstractNum w:abstractNumId="9" w15:restartNumberingAfterBreak="0">
     <w:nsid w:val="1B6E0CFC"/>
     <w:multiLevelType w:val="multilevel"/>
     <w:tmpl w:val="8A6273DA"/>
@@ -6859,7 +8665,7 @@
       </w:rPr>
     </w:lvl>
   </w:abstractNum>
-  <w:abstractNum w:abstractNumId="9" w15:restartNumberingAfterBreak="0">
+  <w:abstractNum w:abstractNumId="10" w15:restartNumberingAfterBreak="0">
     <w:nsid w:val="1C4D6F6B"/>
     <w:multiLevelType w:val="multilevel"/>
     <w:tmpl w:val="0419001D"/>
@@ -6975,7 +8781,7 @@
       </w:rPr>
     </w:lvl>
   </w:abstractNum>
-  <w:abstractNum w:abstractNumId="10" w15:restartNumberingAfterBreak="0">
+  <w:abstractNum w:abstractNumId="11" w15:restartNumberingAfterBreak="0">
     <w:nsid w:val="228D3DFB"/>
     <w:multiLevelType w:val="hybridMultilevel"/>
     <w:tmpl w:val="ECFC4378"/>
@@ -7063,7 +8869,7 @@
       </w:pPr>
     </w:lvl>
   </w:abstractNum>
-  <w:abstractNum w:abstractNumId="11" w15:restartNumberingAfterBreak="0">
+  <w:abstractNum w:abstractNumId="12" w15:restartNumberingAfterBreak="0">
     <w:nsid w:val="234A0748"/>
     <w:multiLevelType w:val="hybridMultilevel"/>
     <w:tmpl w:val="40C2D860"/>
@@ -7154,7 +8960,7 @@
       </w:pPr>
     </w:lvl>
   </w:abstractNum>
-  <w:abstractNum w:abstractNumId="12" w15:restartNumberingAfterBreak="0">
+  <w:abstractNum w:abstractNumId="13" w15:restartNumberingAfterBreak="0">
     <w:nsid w:val="26750966"/>
     <w:multiLevelType w:val="multilevel"/>
     <w:tmpl w:val="9F5ADA7C"/>
@@ -7286,7 +9092,7 @@
       </w:rPr>
     </w:lvl>
   </w:abstractNum>
-  <w:abstractNum w:abstractNumId="13" w15:restartNumberingAfterBreak="0">
+  <w:abstractNum w:abstractNumId="14" w15:restartNumberingAfterBreak="0">
     <w:nsid w:val="272A29AD"/>
     <w:multiLevelType w:val="hybridMultilevel"/>
     <w:tmpl w:val="E7322A34"/>
@@ -7398,7 +9204,7 @@
       </w:rPr>
     </w:lvl>
   </w:abstractNum>
-  <w:abstractNum w:abstractNumId="14" w15:restartNumberingAfterBreak="0">
+  <w:abstractNum w:abstractNumId="15" w15:restartNumberingAfterBreak="0">
     <w:nsid w:val="274423DD"/>
     <w:multiLevelType w:val="hybridMultilevel"/>
     <w:tmpl w:val="1CFC491A"/>
@@ -7511,7 +9317,7 @@
       </w:rPr>
     </w:lvl>
   </w:abstractNum>
-  <w:abstractNum w:abstractNumId="15" w15:restartNumberingAfterBreak="0">
+  <w:abstractNum w:abstractNumId="16" w15:restartNumberingAfterBreak="0">
     <w:nsid w:val="277C019C"/>
     <w:multiLevelType w:val="multilevel"/>
     <w:tmpl w:val="3050EF66"/>
@@ -7760,7 +9566,7 @@
       </w:rPr>
     </w:lvl>
   </w:abstractNum>
-  <w:abstractNum w:abstractNumId="16" w15:restartNumberingAfterBreak="0">
+  <w:abstractNum w:abstractNumId="17" w15:restartNumberingAfterBreak="0">
     <w:nsid w:val="2E744211"/>
     <w:multiLevelType w:val="multilevel"/>
     <w:tmpl w:val="D47AFD2E"/>
@@ -7970,7 +9776,7 @@
       </w:pPr>
     </w:lvl>
   </w:abstractNum>
-  <w:abstractNum w:abstractNumId="17" w15:restartNumberingAfterBreak="0">
+  <w:abstractNum w:abstractNumId="18" w15:restartNumberingAfterBreak="0">
     <w:nsid w:val="30C070CE"/>
     <w:multiLevelType w:val="multilevel"/>
     <w:tmpl w:val="60AE836C"/>
@@ -8247,7 +10053,7 @@
       </w:rPr>
     </w:lvl>
   </w:abstractNum>
-  <w:abstractNum w:abstractNumId="18" w15:restartNumberingAfterBreak="0">
+  <w:abstractNum w:abstractNumId="19" w15:restartNumberingAfterBreak="0">
     <w:nsid w:val="3363183B"/>
     <w:multiLevelType w:val="hybridMultilevel"/>
     <w:tmpl w:val="77F6A802"/>
@@ -8333,7 +10139,7 @@
       </w:pPr>
     </w:lvl>
   </w:abstractNum>
-  <w:abstractNum w:abstractNumId="19" w15:restartNumberingAfterBreak="0">
+  <w:abstractNum w:abstractNumId="20" w15:restartNumberingAfterBreak="0">
     <w:nsid w:val="349329F9"/>
     <w:multiLevelType w:val="multilevel"/>
     <w:tmpl w:val="5770D028"/>
@@ -8424,7 +10230,7 @@
       </w:pPr>
     </w:lvl>
   </w:abstractNum>
-  <w:abstractNum w:abstractNumId="20" w15:restartNumberingAfterBreak="0">
+  <w:abstractNum w:abstractNumId="21" w15:restartNumberingAfterBreak="0">
     <w:nsid w:val="34DB61DB"/>
     <w:multiLevelType w:val="multilevel"/>
     <w:tmpl w:val="E1A2C20A"/>
@@ -8515,7 +10321,7 @@
       </w:pPr>
     </w:lvl>
   </w:abstractNum>
-  <w:abstractNum w:abstractNumId="21" w15:restartNumberingAfterBreak="0">
+  <w:abstractNum w:abstractNumId="22" w15:restartNumberingAfterBreak="0">
     <w:nsid w:val="37601EE1"/>
     <w:multiLevelType w:val="hybridMultilevel"/>
     <w:tmpl w:val="C7D24832"/>
@@ -8607,7 +10413,7 @@
       </w:pPr>
     </w:lvl>
   </w:abstractNum>
-  <w:abstractNum w:abstractNumId="22" w15:restartNumberingAfterBreak="0">
+  <w:abstractNum w:abstractNumId="23" w15:restartNumberingAfterBreak="0">
     <w:nsid w:val="37782466"/>
     <w:multiLevelType w:val="hybridMultilevel"/>
     <w:tmpl w:val="55A8637A"/>
@@ -8697,7 +10503,7 @@
       </w:pPr>
     </w:lvl>
   </w:abstractNum>
-  <w:abstractNum w:abstractNumId="23" w15:restartNumberingAfterBreak="0">
+  <w:abstractNum w:abstractNumId="24" w15:restartNumberingAfterBreak="0">
     <w:nsid w:val="38654138"/>
     <w:multiLevelType w:val="multilevel"/>
     <w:tmpl w:val="AA96CC38"/>
@@ -8832,7 +10638,7 @@
       </w:rPr>
     </w:lvl>
   </w:abstractNum>
-  <w:abstractNum w:abstractNumId="24" w15:restartNumberingAfterBreak="0">
+  <w:abstractNum w:abstractNumId="25" w15:restartNumberingAfterBreak="0">
     <w:nsid w:val="3A806FE2"/>
     <w:multiLevelType w:val="hybridMultilevel"/>
     <w:tmpl w:val="55A8637A"/>
@@ -8922,7 +10728,7 @@
       </w:pPr>
     </w:lvl>
   </w:abstractNum>
-  <w:abstractNum w:abstractNumId="25" w15:restartNumberingAfterBreak="0">
+  <w:abstractNum w:abstractNumId="26" w15:restartNumberingAfterBreak="0">
     <w:nsid w:val="3F9B6C2E"/>
     <w:multiLevelType w:val="hybridMultilevel"/>
     <w:tmpl w:val="55A8637A"/>
@@ -9012,7 +10818,7 @@
       </w:pPr>
     </w:lvl>
   </w:abstractNum>
-  <w:abstractNum w:abstractNumId="26" w15:restartNumberingAfterBreak="0">
+  <w:abstractNum w:abstractNumId="27" w15:restartNumberingAfterBreak="0">
     <w:nsid w:val="41CF6D96"/>
     <w:multiLevelType w:val="hybridMultilevel"/>
     <w:tmpl w:val="55A8637A"/>
@@ -9102,7 +10908,7 @@
       </w:pPr>
     </w:lvl>
   </w:abstractNum>
-  <w:abstractNum w:abstractNumId="27" w15:restartNumberingAfterBreak="0">
+  <w:abstractNum w:abstractNumId="28" w15:restartNumberingAfterBreak="0">
     <w:nsid w:val="42F73AF4"/>
     <w:multiLevelType w:val="hybridMultilevel"/>
     <w:tmpl w:val="55A8637A"/>
@@ -9192,7 +10998,7 @@
       </w:pPr>
     </w:lvl>
   </w:abstractNum>
-  <w:abstractNum w:abstractNumId="28" w15:restartNumberingAfterBreak="0">
+  <w:abstractNum w:abstractNumId="29" w15:restartNumberingAfterBreak="0">
     <w:nsid w:val="459F2701"/>
     <w:multiLevelType w:val="multilevel"/>
     <w:tmpl w:val="A48036AE"/>
@@ -9335,7 +11141,7 @@
       </w:rPr>
     </w:lvl>
   </w:abstractNum>
-  <w:abstractNum w:abstractNumId="29" w15:restartNumberingAfterBreak="0">
+  <w:abstractNum w:abstractNumId="30" w15:restartNumberingAfterBreak="0">
     <w:nsid w:val="4AE45126"/>
     <w:multiLevelType w:val="multilevel"/>
     <w:tmpl w:val="7E8E8020"/>
@@ -9477,7 +11283,7 @@
       </w:rPr>
     </w:lvl>
   </w:abstractNum>
-  <w:abstractNum w:abstractNumId="30" w15:restartNumberingAfterBreak="0">
+  <w:abstractNum w:abstractNumId="31" w15:restartNumberingAfterBreak="0">
     <w:nsid w:val="4F012B3F"/>
     <w:multiLevelType w:val="hybridMultilevel"/>
     <w:tmpl w:val="55A8637A"/>
@@ -9567,7 +11373,7 @@
       </w:pPr>
     </w:lvl>
   </w:abstractNum>
-  <w:abstractNum w:abstractNumId="31" w15:restartNumberingAfterBreak="0">
+  <w:abstractNum w:abstractNumId="32" w15:restartNumberingAfterBreak="0">
     <w:nsid w:val="53BE5BDD"/>
     <w:multiLevelType w:val="multilevel"/>
     <w:tmpl w:val="763A0C4E"/>
@@ -9700,7 +11506,7 @@
       </w:rPr>
     </w:lvl>
   </w:abstractNum>
-  <w:abstractNum w:abstractNumId="32" w15:restartNumberingAfterBreak="0">
+  <w:abstractNum w:abstractNumId="33" w15:restartNumberingAfterBreak="0">
     <w:nsid w:val="543F35AD"/>
     <w:multiLevelType w:val="multilevel"/>
     <w:tmpl w:val="051ED0C4"/>
@@ -9791,7 +11597,7 @@
       </w:pPr>
     </w:lvl>
   </w:abstractNum>
-  <w:abstractNum w:abstractNumId="33" w15:restartNumberingAfterBreak="0">
+  <w:abstractNum w:abstractNumId="34" w15:restartNumberingAfterBreak="0">
     <w:nsid w:val="65D74793"/>
     <w:multiLevelType w:val="multilevel"/>
     <w:tmpl w:val="E0A0DCC2"/>
@@ -9882,7 +11688,7 @@
       </w:pPr>
     </w:lvl>
   </w:abstractNum>
-  <w:abstractNum w:abstractNumId="34" w15:restartNumberingAfterBreak="0">
+  <w:abstractNum w:abstractNumId="35" w15:restartNumberingAfterBreak="0">
     <w:nsid w:val="67631314"/>
     <w:multiLevelType w:val="hybridMultilevel"/>
     <w:tmpl w:val="55A8637A"/>
@@ -9972,7 +11778,7 @@
       </w:pPr>
     </w:lvl>
   </w:abstractNum>
-  <w:abstractNum w:abstractNumId="35" w15:restartNumberingAfterBreak="0">
+  <w:abstractNum w:abstractNumId="36" w15:restartNumberingAfterBreak="0">
     <w:nsid w:val="69DF5FAE"/>
     <w:multiLevelType w:val="hybridMultilevel"/>
     <w:tmpl w:val="55A8637A"/>
@@ -10062,7 +11868,7 @@
       </w:pPr>
     </w:lvl>
   </w:abstractNum>
-  <w:abstractNum w:abstractNumId="36" w15:restartNumberingAfterBreak="0">
+  <w:abstractNum w:abstractNumId="37" w15:restartNumberingAfterBreak="0">
     <w:nsid w:val="746926BE"/>
     <w:multiLevelType w:val="hybridMultilevel"/>
     <w:tmpl w:val="55A8637A"/>
@@ -10152,7 +11958,7 @@
       </w:pPr>
     </w:lvl>
   </w:abstractNum>
-  <w:abstractNum w:abstractNumId="37" w15:restartNumberingAfterBreak="0">
+  <w:abstractNum w:abstractNumId="38" w15:restartNumberingAfterBreak="0">
     <w:nsid w:val="74DD0F5E"/>
     <w:multiLevelType w:val="hybridMultilevel"/>
     <w:tmpl w:val="81CC108C"/>
@@ -10265,7 +12071,7 @@
       </w:rPr>
     </w:lvl>
   </w:abstractNum>
-  <w:abstractNum w:abstractNumId="38" w15:restartNumberingAfterBreak="0">
+  <w:abstractNum w:abstractNumId="39" w15:restartNumberingAfterBreak="0">
     <w:nsid w:val="796153C0"/>
     <w:multiLevelType w:val="hybridMultilevel"/>
     <w:tmpl w:val="456CB3DC"/>
@@ -10356,7 +12162,7 @@
       </w:pPr>
     </w:lvl>
   </w:abstractNum>
-  <w:abstractNum w:abstractNumId="39" w15:restartNumberingAfterBreak="0">
+  <w:abstractNum w:abstractNumId="40" w15:restartNumberingAfterBreak="0">
     <w:nsid w:val="79E2341E"/>
     <w:multiLevelType w:val="hybridMultilevel"/>
     <w:tmpl w:val="55A8637A"/>
@@ -10447,40 +12253,40 @@
     </w:lvl>
   </w:abstractNum>
   <w:num w:numId="1" w16cid:durableId="898707020">
-    <w:abstractNumId w:val="8"/>
+    <w:abstractNumId w:val="9"/>
   </w:num>
   <w:num w:numId="2" w16cid:durableId="1770389669">
-    <w:abstractNumId w:val="23"/>
+    <w:abstractNumId w:val="24"/>
   </w:num>
   <w:num w:numId="3" w16cid:durableId="440416075">
-    <w:abstractNumId w:val="31"/>
+    <w:abstractNumId w:val="32"/>
   </w:num>
   <w:num w:numId="4" w16cid:durableId="832531979">
-    <w:abstractNumId w:val="12"/>
+    <w:abstractNumId w:val="13"/>
   </w:num>
   <w:num w:numId="5" w16cid:durableId="1616206315">
-    <w:abstractNumId w:val="28"/>
+    <w:abstractNumId w:val="29"/>
   </w:num>
   <w:num w:numId="6" w16cid:durableId="241379521">
-    <w:abstractNumId w:val="17"/>
+    <w:abstractNumId w:val="18"/>
   </w:num>
   <w:num w:numId="7" w16cid:durableId="1009064325">
-    <w:abstractNumId w:val="5"/>
+    <w:abstractNumId w:val="6"/>
   </w:num>
   <w:num w:numId="8" w16cid:durableId="1343166565">
-    <w:abstractNumId w:val="1"/>
+    <w:abstractNumId w:val="2"/>
     <w:lvlOverride w:ilvl="0">
       <w:startOverride w:val="1"/>
     </w:lvlOverride>
   </w:num>
   <w:num w:numId="9" w16cid:durableId="1985620233">
-    <w:abstractNumId w:val="38"/>
+    <w:abstractNumId w:val="39"/>
   </w:num>
   <w:num w:numId="10" w16cid:durableId="1193109343">
-    <w:abstractNumId w:val="9"/>
+    <w:abstractNumId w:val="10"/>
   </w:num>
   <w:num w:numId="11" w16cid:durableId="182060031">
-    <w:abstractNumId w:val="29"/>
+    <w:abstractNumId w:val="30"/>
     <w:lvlOverride w:ilvl="0">
       <w:lvl w:ilvl="0">
         <w:start w:val="1"/>
@@ -10502,7 +12308,7 @@
     </w:lvlOverride>
   </w:num>
   <w:num w:numId="12" w16cid:durableId="1357583848">
-    <w:abstractNumId w:val="15"/>
+    <w:abstractNumId w:val="16"/>
     <w:lvlOverride w:ilvl="0">
       <w:lvl w:ilvl="0">
         <w:start w:val="1"/>
@@ -10765,10 +12571,10 @@
     </w:lvlOverride>
   </w:num>
   <w:num w:numId="13" w16cid:durableId="859322964">
-    <w:abstractNumId w:val="11"/>
+    <w:abstractNumId w:val="12"/>
   </w:num>
   <w:num w:numId="14" w16cid:durableId="715281109">
-    <w:abstractNumId w:val="3"/>
+    <w:abstractNumId w:val="4"/>
     <w:lvlOverride w:ilvl="0">
       <w:startOverride w:val="1"/>
     </w:lvlOverride>
@@ -10798,37 +12604,37 @@
     </w:lvlOverride>
   </w:num>
   <w:num w:numId="15" w16cid:durableId="593130490">
+    <w:abstractNumId w:val="17"/>
+  </w:num>
+  <w:num w:numId="16" w16cid:durableId="2018262411">
+    <w:abstractNumId w:val="1"/>
+  </w:num>
+  <w:num w:numId="17" w16cid:durableId="631207072">
+    <w:abstractNumId w:val="11"/>
+  </w:num>
+  <w:num w:numId="18" w16cid:durableId="1030764800">
+    <w:abstractNumId w:val="5"/>
+  </w:num>
+  <w:num w:numId="19" w16cid:durableId="1720126100">
+    <w:abstractNumId w:val="20"/>
+  </w:num>
+  <w:num w:numId="20" w16cid:durableId="737676300">
+    <w:abstractNumId w:val="21"/>
+  </w:num>
+  <w:num w:numId="21" w16cid:durableId="1799834727">
+    <w:abstractNumId w:val="33"/>
+  </w:num>
+  <w:num w:numId="22" w16cid:durableId="613056206">
+    <w:abstractNumId w:val="34"/>
+  </w:num>
+  <w:num w:numId="23" w16cid:durableId="1713378219">
     <w:abstractNumId w:val="16"/>
   </w:num>
-  <w:num w:numId="16" w16cid:durableId="2018262411">
-    <w:abstractNumId w:val="0"/>
-  </w:num>
-  <w:num w:numId="17" w16cid:durableId="631207072">
-    <w:abstractNumId w:val="10"/>
-  </w:num>
-  <w:num w:numId="18" w16cid:durableId="1030764800">
-    <w:abstractNumId w:val="4"/>
-  </w:num>
-  <w:num w:numId="19" w16cid:durableId="1720126100">
-    <w:abstractNumId w:val="19"/>
-  </w:num>
-  <w:num w:numId="20" w16cid:durableId="737676300">
-    <w:abstractNumId w:val="20"/>
-  </w:num>
-  <w:num w:numId="21" w16cid:durableId="1799834727">
-    <w:abstractNumId w:val="32"/>
-  </w:num>
-  <w:num w:numId="22" w16cid:durableId="613056206">
-    <w:abstractNumId w:val="33"/>
-  </w:num>
-  <w:num w:numId="23" w16cid:durableId="1713378219">
-    <w:abstractNumId w:val="15"/>
-  </w:num>
   <w:num w:numId="24" w16cid:durableId="146166759">
-    <w:abstractNumId w:val="29"/>
+    <w:abstractNumId w:val="30"/>
   </w:num>
   <w:num w:numId="25" w16cid:durableId="902376188">
-    <w:abstractNumId w:val="17"/>
+    <w:abstractNumId w:val="18"/>
     <w:lvlOverride w:ilvl="0">
       <w:startOverride w:val="1"/>
     </w:lvlOverride>
@@ -10858,7 +12664,7 @@
     </w:lvlOverride>
   </w:num>
   <w:num w:numId="26" w16cid:durableId="920215584">
-    <w:abstractNumId w:val="17"/>
+    <w:abstractNumId w:val="18"/>
     <w:lvlOverride w:ilvl="0">
       <w:startOverride w:val="2"/>
     </w:lvlOverride>
@@ -10888,61 +12694,64 @@
     </w:lvlOverride>
   </w:num>
   <w:num w:numId="27" w16cid:durableId="2141142806">
-    <w:abstractNumId w:val="24"/>
+    <w:abstractNumId w:val="25"/>
   </w:num>
   <w:num w:numId="28" w16cid:durableId="124858556">
-    <w:abstractNumId w:val="6"/>
+    <w:abstractNumId w:val="7"/>
   </w:num>
   <w:num w:numId="29" w16cid:durableId="1223638431">
+    <w:abstractNumId w:val="28"/>
+  </w:num>
+  <w:num w:numId="30" w16cid:durableId="824785319">
+    <w:abstractNumId w:val="35"/>
+  </w:num>
+  <w:num w:numId="31" w16cid:durableId="75783541">
+    <w:abstractNumId w:val="23"/>
+  </w:num>
+  <w:num w:numId="32" w16cid:durableId="1494029657">
+    <w:abstractNumId w:val="3"/>
+  </w:num>
+  <w:num w:numId="33" w16cid:durableId="444814678">
+    <w:abstractNumId w:val="8"/>
+  </w:num>
+  <w:num w:numId="34" w16cid:durableId="1543862904">
     <w:abstractNumId w:val="27"/>
   </w:num>
-  <w:num w:numId="30" w16cid:durableId="824785319">
-    <w:abstractNumId w:val="34"/>
+  <w:num w:numId="35" w16cid:durableId="1560436928">
+    <w:abstractNumId w:val="40"/>
   </w:num>
-  <w:num w:numId="31" w16cid:durableId="75783541">
+  <w:num w:numId="36" w16cid:durableId="2082675221">
+    <w:abstractNumId w:val="31"/>
+  </w:num>
+  <w:num w:numId="37" w16cid:durableId="1160149076">
+    <w:abstractNumId w:val="26"/>
+  </w:num>
+  <w:num w:numId="38" w16cid:durableId="240452958">
+    <w:abstractNumId w:val="37"/>
+  </w:num>
+  <w:num w:numId="39" w16cid:durableId="689185366">
+    <w:abstractNumId w:val="36"/>
+  </w:num>
+  <w:num w:numId="40" w16cid:durableId="319189690">
+    <w:abstractNumId w:val="2"/>
+  </w:num>
+  <w:num w:numId="41" w16cid:durableId="1968314173">
     <w:abstractNumId w:val="22"/>
   </w:num>
-  <w:num w:numId="32" w16cid:durableId="1494029657">
-    <w:abstractNumId w:val="2"/>
-  </w:num>
-  <w:num w:numId="33" w16cid:durableId="444814678">
-    <w:abstractNumId w:val="7"/>
-  </w:num>
-  <w:num w:numId="34" w16cid:durableId="1543862904">
-    <w:abstractNumId w:val="26"/>
-  </w:num>
-  <w:num w:numId="35" w16cid:durableId="1560436928">
-    <w:abstractNumId w:val="39"/>
-  </w:num>
-  <w:num w:numId="36" w16cid:durableId="2082675221">
-    <w:abstractNumId w:val="30"/>
-  </w:num>
-  <w:num w:numId="37" w16cid:durableId="1160149076">
-    <w:abstractNumId w:val="25"/>
-  </w:num>
-  <w:num w:numId="38" w16cid:durableId="240452958">
-    <w:abstractNumId w:val="36"/>
-  </w:num>
-  <w:num w:numId="39" w16cid:durableId="689185366">
-    <w:abstractNumId w:val="35"/>
-  </w:num>
-  <w:num w:numId="40" w16cid:durableId="319189690">
-    <w:abstractNumId w:val="1"/>
-  </w:num>
-  <w:num w:numId="41" w16cid:durableId="1968314173">
-    <w:abstractNumId w:val="21"/>
-  </w:num>
   <w:num w:numId="42" w16cid:durableId="2070573373">
-    <w:abstractNumId w:val="18"/>
+    <w:abstractNumId w:val="19"/>
   </w:num>
   <w:num w:numId="43" w16cid:durableId="1041445229">
-    <w:abstractNumId w:val="37"/>
+    <w:abstractNumId w:val="38"/>
   </w:num>
   <w:num w:numId="44" w16cid:durableId="1172139746">
+    <w:abstractNumId w:val="15"/>
+  </w:num>
+  <w:num w:numId="45" w16cid:durableId="2061784379">
     <w:abstractNumId w:val="14"/>
   </w:num>
-  <w:num w:numId="45" w16cid:durableId="2061784379">
-    <w:abstractNumId w:val="13"/>
+  <w:num w:numId="46" w16cid:durableId="2093431927">
+    <w:abstractNumId w:val="0"/>
   </w:num>
   <w:numIdMacAtCleanup w:val="22"/>
 </w:numbering>
@@ -11366,10 +13175,13 @@
     <w:uiPriority w:val="9"/>
     <w:unhideWhenUsed/>
     <w:qFormat/>
-    <w:rsid w:val="00663057"/>
+    <w:rsid w:val="00401E80"/>
     <w:pPr>
       <w:keepNext/>
       <w:keepLines/>
+      <w:tabs>
+        <w:tab w:val="left" w:pos="567"/>
+      </w:tabs>
       <w:spacing w:before="480"/>
       <w:outlineLvl w:val="0"/>
     </w:pPr>
@@ -11390,10 +13202,13 @@
     <w:uiPriority w:val="9"/>
     <w:unhideWhenUsed/>
     <w:qFormat/>
-    <w:rsid w:val="00663057"/>
+    <w:rsid w:val="00401E80"/>
     <w:pPr>
       <w:keepNext/>
       <w:keepLines/>
+      <w:tabs>
+        <w:tab w:val="left" w:pos="567"/>
+      </w:tabs>
       <w:spacing w:before="200"/>
       <w:outlineLvl w:val="1"/>
     </w:pPr>
@@ -11562,7 +13377,6 @@
   <w:style w:type="character" w:default="1" w:styleId="af0">
     <w:name w:val="Default Paragraph Font"/>
     <w:uiPriority w:val="1"/>
-    <w:semiHidden/>
     <w:unhideWhenUsed/>
   </w:style>
   <w:style w:type="table" w:default="1" w:styleId="af1">
@@ -12052,7 +13866,7 @@
     <w:basedOn w:val="af0"/>
     <w:link w:val="14"/>
     <w:uiPriority w:val="9"/>
-    <w:rsid w:val="00663057"/>
+    <w:rsid w:val="00401E80"/>
     <w:rPr>
       <w:rFonts w:ascii="Arial Narrow" w:eastAsiaTheme="majorEastAsia" w:hAnsi="Arial Narrow" w:cstheme="majorBidi"/>
       <w:b/>
@@ -12122,7 +13936,7 @@
     <w:basedOn w:val="af0"/>
     <w:link w:val="22"/>
     <w:uiPriority w:val="9"/>
-    <w:rsid w:val="00663057"/>
+    <w:rsid w:val="00401E80"/>
     <w:rPr>
       <w:rFonts w:ascii="Arial Narrow" w:eastAsiaTheme="majorEastAsia" w:hAnsi="Arial Narrow" w:cstheme="majorBidi"/>
       <w:b/>
@@ -12254,10 +14068,13 @@
     <w:name w:val="ДОК Таблица Текст Центр"/>
     <w:basedOn w:val="affe"/>
     <w:qFormat/>
-    <w:rsid w:val="00901804"/>
+    <w:rsid w:val="00A2177D"/>
     <w:pPr>
       <w:jc w:val="center"/>
     </w:pPr>
+    <w:rPr>
+      <w:sz w:val="20"/>
+    </w:rPr>
   </w:style>
   <w:style w:type="paragraph" w:customStyle="1" w:styleId="afff2">
     <w:name w:val="ДОК Текст"/>
@@ -14825,9 +16642,9 @@
     <w:basedOn w:val="af"/>
     <w:uiPriority w:val="99"/>
     <w:semiHidden/>
-    <w:rsid w:val="002C7EBB"/>
-    <w:pPr>
-      <w:ind w:firstLine="709"/>
+    <w:rsid w:val="00401E80"/>
+    <w:pPr>
+      <w:ind w:firstLine="567"/>
     </w:pPr>
     <w:rPr>
       <w:lang w:val="en-US" w:eastAsia="en-US"/>

</xml_diff>

<commit_message>
upd title page styles
</commit_message>
<xml_diff>
--- a/templates/title_page.docx
+++ b/templates/title_page.docx
@@ -4057,7 +4057,7 @@
     </w:tbl>
     <w:p>
       <w:pPr>
-        <w:pStyle w:val="1f6"/>
+        <w:pStyle w:val="1f5"/>
         <w:rPr>
           <w:lang w:val="ru-RU"/>
         </w:rPr>
@@ -4251,6 +4251,10 @@
     <w:p>
       <w:pPr>
         <w:pStyle w:val="afffff1"/>
+        <w:numPr>
+          <w:ilvl w:val="0"/>
+          <w:numId w:val="0"/>
+        </w:numPr>
         <w:rPr>
           <w:lang w:val="ru-RU"/>
         </w:rPr>
@@ -4490,15 +4494,11 @@
     </w:p>
     <w:p>
       <w:pPr>
-        <w:pStyle w:val="14"/>
+        <w:pStyle w:val="12"/>
       </w:pPr>
       <w:bookmarkStart w:id="0" w:name="X6df0dc407ac9d0d35d77f3b02cf3de2e76409b0"/>
       <w:r>
         <w:lastRenderedPageBreak/>
-        <w:t>1</w:t>
-      </w:r>
-      <w:r>
-        <w:tab/>
         <w:t>Климатические условия проведения испытаний</w:t>
       </w:r>
     </w:p>
@@ -4560,15 +4560,11 @@
     </w:p>
     <w:p>
       <w:pPr>
-        <w:pStyle w:val="14"/>
+        <w:pStyle w:val="12"/>
       </w:pPr>
       <w:bookmarkStart w:id="1" w:name="основные-технические-данные"/>
       <w:bookmarkEnd w:id="0"/>
       <w:r>
-        <w:t>2</w:t>
-      </w:r>
-      <w:r>
-        <w:tab/>
         <w:t>Основные технические данные устройств</w:t>
       </w:r>
     </w:p>
@@ -5302,17 +5298,13 @@
     </w:tbl>
     <w:p>
       <w:pPr>
-        <w:pStyle w:val="14"/>
+        <w:pStyle w:val="12"/>
       </w:pPr>
       <w:bookmarkStart w:id="7" w:name="дополнительные-сведения"/>
       <w:bookmarkEnd w:id="4"/>
       <w:bookmarkEnd w:id="5"/>
       <w:bookmarkEnd w:id="6"/>
       <w:r>
-        <w:t>3</w:t>
-      </w:r>
-      <w:r>
-        <w:tab/>
         <w:t>Дополнительные сведения</w:t>
       </w:r>
     </w:p>
@@ -5351,15 +5343,11 @@
     </w:p>
     <w:p>
       <w:pPr>
-        <w:pStyle w:val="14"/>
+        <w:pStyle w:val="12"/>
       </w:pPr>
       <w:bookmarkStart w:id="8" w:name="уставки-и-конфигурация"/>
       <w:bookmarkEnd w:id="7"/>
       <w:r>
-        <w:t>4</w:t>
-      </w:r>
-      <w:r>
-        <w:tab/>
         <w:t>Уставки и конфигурация</w:t>
       </w:r>
     </w:p>
@@ -5457,15 +5445,11 @@
     </w:p>
     <w:p>
       <w:pPr>
-        <w:pStyle w:val="14"/>
+        <w:pStyle w:val="12"/>
       </w:pPr>
       <w:bookmarkStart w:id="9" w:name="внешний-осмотр"/>
       <w:bookmarkEnd w:id="8"/>
       <w:r>
-        <w:t>5</w:t>
-      </w:r>
-      <w:r>
-        <w:tab/>
         <w:t>Внешний осмотр</w:t>
       </w:r>
     </w:p>
@@ -5738,15 +5722,11 @@
     </w:p>
     <w:p>
       <w:pPr>
-        <w:pStyle w:val="14"/>
+        <w:pStyle w:val="12"/>
       </w:pPr>
       <w:bookmarkStart w:id="10" w:name="X0e50c966c55b2f6f4209c430f930650427220e2"/>
       <w:bookmarkEnd w:id="9"/>
       <w:r>
-        <w:t>6</w:t>
-      </w:r>
-      <w:r>
-        <w:tab/>
         <w:t xml:space="preserve">Проверка конфигурирования и </w:t>
       </w:r>
       <w:proofErr w:type="spellStart"/>
@@ -5845,13 +5825,9 @@
     </w:p>
     <w:p>
       <w:pPr>
-        <w:pStyle w:val="14"/>
-      </w:pPr>
-      <w:r>
-        <w:t>7</w:t>
-      </w:r>
-      <w:r>
-        <w:tab/>
+        <w:pStyle w:val="12"/>
+      </w:pPr>
+      <w:r>
         <w:t>Проверка состояния изоляции</w:t>
       </w:r>
     </w:p>
@@ -5861,10 +5837,6 @@
       </w:pPr>
       <w:bookmarkStart w:id="12" w:name="X9687952bc1d30db593d75bc5681b56e0d46ca55"/>
       <w:r>
-        <w:t>7.1</w:t>
-      </w:r>
-      <w:r>
-        <w:tab/>
         <w:t xml:space="preserve">Измерение сопротивления изоляции </w:t>
       </w:r>
       <w:r>
@@ -6200,10 +6172,6 @@
         <w:pStyle w:val="22"/>
       </w:pPr>
       <w:r>
-        <w:t>7.2</w:t>
-      </w:r>
-      <w:r>
-        <w:tab/>
         <w:t>Измерение сопротивления изоляции шкафа с подключенными внешними цепями</w:t>
       </w:r>
     </w:p>
@@ -6514,17 +6482,13 @@
     </w:tbl>
     <w:p>
       <w:pPr>
-        <w:pStyle w:val="14"/>
+        <w:pStyle w:val="12"/>
       </w:pPr>
       <w:bookmarkStart w:id="16" w:name="X242d87850b64568d08d7180295cac2ddaededb8"/>
       <w:bookmarkEnd w:id="13"/>
       <w:bookmarkEnd w:id="14"/>
       <w:bookmarkEnd w:id="15"/>
       <w:r>
-        <w:t>8</w:t>
-      </w:r>
-      <w:r>
-        <w:tab/>
         <w:t>Проверка на соответствие проектным решениям</w:t>
       </w:r>
     </w:p>
@@ -6574,13 +6538,9 @@
     </w:p>
     <w:p>
       <w:pPr>
-        <w:pStyle w:val="14"/>
-      </w:pPr>
-      <w:r>
-        <w:t>9</w:t>
-      </w:r>
-      <w:r>
-        <w:tab/>
+        <w:pStyle w:val="12"/>
+      </w:pPr>
+      <w:r>
         <w:t>Задание требуемой конфигурации, уставок и режимов работы (</w:t>
       </w:r>
       <w:proofErr w:type="spellStart"/>
@@ -6689,7 +6649,6 @@
       </w:r>
       <w:bookmarkEnd w:id="17"/>
     </w:p>
-    <w:p/>
     <w:sectPr>
       <w:pgSz w:w="11907" w:h="16839" w:code="9"/>
       <w:pgMar w:top="567" w:right="567" w:bottom="567" w:left="1418" w:header="227" w:footer="227" w:gutter="0"/>
@@ -8198,6 +8157,95 @@
     </w:lvl>
   </w:abstractNum>
   <w:abstractNum w:abstractNumId="5" w15:restartNumberingAfterBreak="0">
+    <w:nsid w:val="06EB1B77"/>
+    <w:multiLevelType w:val="hybridMultilevel"/>
+    <w:tmpl w:val="347E0C6A"/>
+    <w:lvl w:ilvl="0" w:tplc="680C28DA">
+      <w:start w:val="1"/>
+      <w:numFmt w:val="decimal"/>
+      <w:lvlText w:val="%1"/>
+      <w:lvlJc w:val="left"/>
+      <w:pPr>
+        <w:ind w:left="720" w:hanging="360"/>
+      </w:pPr>
+      <w:rPr>
+        <w:rFonts w:hint="default"/>
+      </w:rPr>
+    </w:lvl>
+    <w:lvl w:ilvl="1" w:tplc="04190019" w:tentative="1">
+      <w:start w:val="1"/>
+      <w:numFmt w:val="lowerLetter"/>
+      <w:lvlText w:val="%2."/>
+      <w:lvlJc w:val="left"/>
+      <w:pPr>
+        <w:ind w:left="1440" w:hanging="360"/>
+      </w:pPr>
+    </w:lvl>
+    <w:lvl w:ilvl="2" w:tplc="0419001B" w:tentative="1">
+      <w:start w:val="1"/>
+      <w:numFmt w:val="lowerRoman"/>
+      <w:lvlText w:val="%3."/>
+      <w:lvlJc w:val="right"/>
+      <w:pPr>
+        <w:ind w:left="2160" w:hanging="180"/>
+      </w:pPr>
+    </w:lvl>
+    <w:lvl w:ilvl="3" w:tplc="0419000F" w:tentative="1">
+      <w:start w:val="1"/>
+      <w:numFmt w:val="decimal"/>
+      <w:lvlText w:val="%4."/>
+      <w:lvlJc w:val="left"/>
+      <w:pPr>
+        <w:ind w:left="2880" w:hanging="360"/>
+      </w:pPr>
+    </w:lvl>
+    <w:lvl w:ilvl="4" w:tplc="04190019" w:tentative="1">
+      <w:start w:val="1"/>
+      <w:numFmt w:val="lowerLetter"/>
+      <w:lvlText w:val="%5."/>
+      <w:lvlJc w:val="left"/>
+      <w:pPr>
+        <w:ind w:left="3600" w:hanging="360"/>
+      </w:pPr>
+    </w:lvl>
+    <w:lvl w:ilvl="5" w:tplc="0419001B" w:tentative="1">
+      <w:start w:val="1"/>
+      <w:numFmt w:val="lowerRoman"/>
+      <w:lvlText w:val="%6."/>
+      <w:lvlJc w:val="right"/>
+      <w:pPr>
+        <w:ind w:left="4320" w:hanging="180"/>
+      </w:pPr>
+    </w:lvl>
+    <w:lvl w:ilvl="6" w:tplc="0419000F" w:tentative="1">
+      <w:start w:val="1"/>
+      <w:numFmt w:val="decimal"/>
+      <w:lvlText w:val="%7."/>
+      <w:lvlJc w:val="left"/>
+      <w:pPr>
+        <w:ind w:left="5040" w:hanging="360"/>
+      </w:pPr>
+    </w:lvl>
+    <w:lvl w:ilvl="7" w:tplc="04190019" w:tentative="1">
+      <w:start w:val="1"/>
+      <w:numFmt w:val="lowerLetter"/>
+      <w:lvlText w:val="%8."/>
+      <w:lvlJc w:val="left"/>
+      <w:pPr>
+        <w:ind w:left="5760" w:hanging="360"/>
+      </w:pPr>
+    </w:lvl>
+    <w:lvl w:ilvl="8" w:tplc="0419001B" w:tentative="1">
+      <w:start w:val="1"/>
+      <w:numFmt w:val="lowerRoman"/>
+      <w:lvlText w:val="%9."/>
+      <w:lvlJc w:val="right"/>
+      <w:pPr>
+        <w:ind w:left="6480" w:hanging="180"/>
+      </w:pPr>
+    </w:lvl>
+  </w:abstractNum>
+  <w:abstractNum w:abstractNumId="6" w15:restartNumberingAfterBreak="0">
     <w:nsid w:val="0B5B4EDF"/>
     <w:multiLevelType w:val="hybridMultilevel"/>
     <w:tmpl w:val="9C90D258"/>
@@ -8285,7 +8333,7 @@
       </w:pPr>
     </w:lvl>
   </w:abstractNum>
-  <w:abstractNum w:abstractNumId="6" w15:restartNumberingAfterBreak="0">
+  <w:abstractNum w:abstractNumId="7" w15:restartNumberingAfterBreak="0">
     <w:nsid w:val="0B6C6D48"/>
     <w:multiLevelType w:val="hybridMultilevel"/>
     <w:tmpl w:val="78DCF446"/>
@@ -8400,7 +8448,7 @@
       </w:rPr>
     </w:lvl>
   </w:abstractNum>
-  <w:abstractNum w:abstractNumId="7" w15:restartNumberingAfterBreak="0">
+  <w:abstractNum w:abstractNumId="8" w15:restartNumberingAfterBreak="0">
     <w:nsid w:val="0EEF1815"/>
     <w:multiLevelType w:val="hybridMultilevel"/>
     <w:tmpl w:val="55A8637A"/>
@@ -8490,7 +8538,7 @@
       </w:pPr>
     </w:lvl>
   </w:abstractNum>
-  <w:abstractNum w:abstractNumId="8" w15:restartNumberingAfterBreak="0">
+  <w:abstractNum w:abstractNumId="9" w15:restartNumberingAfterBreak="0">
     <w:nsid w:val="19352F2E"/>
     <w:multiLevelType w:val="hybridMultilevel"/>
     <w:tmpl w:val="55A8637A"/>
@@ -8580,7 +8628,7 @@
       </w:pPr>
     </w:lvl>
   </w:abstractNum>
-  <w:abstractNum w:abstractNumId="9" w15:restartNumberingAfterBreak="0">
+  <w:abstractNum w:abstractNumId="10" w15:restartNumberingAfterBreak="0">
     <w:nsid w:val="1B6E0CFC"/>
     <w:multiLevelType w:val="multilevel"/>
     <w:tmpl w:val="8A6273DA"/>
@@ -8705,7 +8753,7 @@
       </w:rPr>
     </w:lvl>
   </w:abstractNum>
-  <w:abstractNum w:abstractNumId="10" w15:restartNumberingAfterBreak="0">
+  <w:abstractNum w:abstractNumId="11" w15:restartNumberingAfterBreak="0">
     <w:nsid w:val="1C4D6F6B"/>
     <w:multiLevelType w:val="multilevel"/>
     <w:tmpl w:val="0419001D"/>
@@ -8821,7 +8869,7 @@
       </w:rPr>
     </w:lvl>
   </w:abstractNum>
-  <w:abstractNum w:abstractNumId="11" w15:restartNumberingAfterBreak="0">
+  <w:abstractNum w:abstractNumId="12" w15:restartNumberingAfterBreak="0">
     <w:nsid w:val="228D3DFB"/>
     <w:multiLevelType w:val="hybridMultilevel"/>
     <w:tmpl w:val="ECFC4378"/>
@@ -8909,7 +8957,7 @@
       </w:pPr>
     </w:lvl>
   </w:abstractNum>
-  <w:abstractNum w:abstractNumId="12" w15:restartNumberingAfterBreak="0">
+  <w:abstractNum w:abstractNumId="13" w15:restartNumberingAfterBreak="0">
     <w:nsid w:val="234A0748"/>
     <w:multiLevelType w:val="hybridMultilevel"/>
     <w:tmpl w:val="40C2D860"/>
@@ -9000,7 +9048,7 @@
       </w:pPr>
     </w:lvl>
   </w:abstractNum>
-  <w:abstractNum w:abstractNumId="13" w15:restartNumberingAfterBreak="0">
+  <w:abstractNum w:abstractNumId="14" w15:restartNumberingAfterBreak="0">
     <w:nsid w:val="26750966"/>
     <w:multiLevelType w:val="multilevel"/>
     <w:tmpl w:val="9F5ADA7C"/>
@@ -9132,7 +9180,7 @@
       </w:rPr>
     </w:lvl>
   </w:abstractNum>
-  <w:abstractNum w:abstractNumId="14" w15:restartNumberingAfterBreak="0">
+  <w:abstractNum w:abstractNumId="15" w15:restartNumberingAfterBreak="0">
     <w:nsid w:val="272A29AD"/>
     <w:multiLevelType w:val="hybridMultilevel"/>
     <w:tmpl w:val="E7322A34"/>
@@ -9244,7 +9292,7 @@
       </w:rPr>
     </w:lvl>
   </w:abstractNum>
-  <w:abstractNum w:abstractNumId="15" w15:restartNumberingAfterBreak="0">
+  <w:abstractNum w:abstractNumId="16" w15:restartNumberingAfterBreak="0">
     <w:nsid w:val="274423DD"/>
     <w:multiLevelType w:val="hybridMultilevel"/>
     <w:tmpl w:val="1CFC491A"/>
@@ -9357,7 +9405,7 @@
       </w:rPr>
     </w:lvl>
   </w:abstractNum>
-  <w:abstractNum w:abstractNumId="16" w15:restartNumberingAfterBreak="0">
+  <w:abstractNum w:abstractNumId="17" w15:restartNumberingAfterBreak="0">
     <w:nsid w:val="277C019C"/>
     <w:multiLevelType w:val="multilevel"/>
     <w:tmpl w:val="3050EF66"/>
@@ -9606,7 +9654,93 @@
       </w:rPr>
     </w:lvl>
   </w:abstractNum>
-  <w:abstractNum w:abstractNumId="17" w15:restartNumberingAfterBreak="0">
+  <w:abstractNum w:abstractNumId="18" w15:restartNumberingAfterBreak="0">
+    <w:nsid w:val="2C6302E2"/>
+    <w:multiLevelType w:val="multilevel"/>
+    <w:tmpl w:val="0419001D"/>
+    <w:lvl w:ilvl="0">
+      <w:start w:val="1"/>
+      <w:numFmt w:val="decimal"/>
+      <w:lvlText w:val="%1)"/>
+      <w:lvlJc w:val="left"/>
+      <w:pPr>
+        <w:ind w:left="360" w:hanging="360"/>
+      </w:pPr>
+    </w:lvl>
+    <w:lvl w:ilvl="1">
+      <w:start w:val="1"/>
+      <w:numFmt w:val="lowerLetter"/>
+      <w:lvlText w:val="%2)"/>
+      <w:lvlJc w:val="left"/>
+      <w:pPr>
+        <w:ind w:left="720" w:hanging="360"/>
+      </w:pPr>
+    </w:lvl>
+    <w:lvl w:ilvl="2">
+      <w:start w:val="1"/>
+      <w:numFmt w:val="lowerRoman"/>
+      <w:lvlText w:val="%3)"/>
+      <w:lvlJc w:val="left"/>
+      <w:pPr>
+        <w:ind w:left="1080" w:hanging="360"/>
+      </w:pPr>
+    </w:lvl>
+    <w:lvl w:ilvl="3">
+      <w:start w:val="1"/>
+      <w:numFmt w:val="decimal"/>
+      <w:lvlText w:val="(%4)"/>
+      <w:lvlJc w:val="left"/>
+      <w:pPr>
+        <w:ind w:left="1440" w:hanging="360"/>
+      </w:pPr>
+    </w:lvl>
+    <w:lvl w:ilvl="4">
+      <w:start w:val="1"/>
+      <w:numFmt w:val="lowerLetter"/>
+      <w:lvlText w:val="(%5)"/>
+      <w:lvlJc w:val="left"/>
+      <w:pPr>
+        <w:ind w:left="1800" w:hanging="360"/>
+      </w:pPr>
+    </w:lvl>
+    <w:lvl w:ilvl="5">
+      <w:start w:val="1"/>
+      <w:numFmt w:val="lowerRoman"/>
+      <w:lvlText w:val="(%6)"/>
+      <w:lvlJc w:val="left"/>
+      <w:pPr>
+        <w:ind w:left="2160" w:hanging="360"/>
+      </w:pPr>
+    </w:lvl>
+    <w:lvl w:ilvl="6">
+      <w:start w:val="1"/>
+      <w:numFmt w:val="decimal"/>
+      <w:lvlText w:val="%7."/>
+      <w:lvlJc w:val="left"/>
+      <w:pPr>
+        <w:ind w:left="2520" w:hanging="360"/>
+      </w:pPr>
+    </w:lvl>
+    <w:lvl w:ilvl="7">
+      <w:start w:val="1"/>
+      <w:numFmt w:val="lowerLetter"/>
+      <w:lvlText w:val="%8."/>
+      <w:lvlJc w:val="left"/>
+      <w:pPr>
+        <w:ind w:left="2880" w:hanging="360"/>
+      </w:pPr>
+    </w:lvl>
+    <w:lvl w:ilvl="8">
+      <w:start w:val="1"/>
+      <w:numFmt w:val="lowerRoman"/>
+      <w:lvlText w:val="%9."/>
+      <w:lvlJc w:val="left"/>
+      <w:pPr>
+        <w:ind w:left="3240" w:hanging="360"/>
+      </w:pPr>
+    </w:lvl>
+  </w:abstractNum>
+  <w:abstractNum w:abstractNumId="19" w15:restartNumberingAfterBreak="0">
     <w:nsid w:val="2E744211"/>
     <w:multiLevelType w:val="multilevel"/>
     <w:tmpl w:val="D47AFD2E"/>
@@ -9816,7 +9950,7 @@
       </w:pPr>
     </w:lvl>
   </w:abstractNum>
-  <w:abstractNum w:abstractNumId="18" w15:restartNumberingAfterBreak="0">
+  <w:abstractNum w:abstractNumId="20" w15:restartNumberingAfterBreak="0">
     <w:nsid w:val="30C070CE"/>
     <w:multiLevelType w:val="multilevel"/>
     <w:tmpl w:val="60AE836C"/>
@@ -10093,7 +10227,7 @@
       </w:rPr>
     </w:lvl>
   </w:abstractNum>
-  <w:abstractNum w:abstractNumId="19" w15:restartNumberingAfterBreak="0">
+  <w:abstractNum w:abstractNumId="21" w15:restartNumberingAfterBreak="0">
     <w:nsid w:val="3363183B"/>
     <w:multiLevelType w:val="hybridMultilevel"/>
     <w:tmpl w:val="77F6A802"/>
@@ -10179,7 +10313,105 @@
       </w:pPr>
     </w:lvl>
   </w:abstractNum>
-  <w:abstractNum w:abstractNumId="20" w15:restartNumberingAfterBreak="0">
+  <w:abstractNum w:abstractNumId="22" w15:restartNumberingAfterBreak="0">
+    <w:nsid w:val="33CE1A7C"/>
+    <w:multiLevelType w:val="multilevel"/>
+    <w:tmpl w:val="04190025"/>
+    <w:lvl w:ilvl="0">
+      <w:start w:val="1"/>
+      <w:numFmt w:val="decimal"/>
+      <w:pStyle w:val="12"/>
+      <w:lvlText w:val="%1"/>
+      <w:lvlJc w:val="left"/>
+      <w:pPr>
+        <w:ind w:left="432" w:hanging="432"/>
+      </w:pPr>
+      <w:rPr>
+        <w:rFonts w:hint="default"/>
+      </w:rPr>
+    </w:lvl>
+    <w:lvl w:ilvl="1">
+      <w:start w:val="1"/>
+      <w:numFmt w:val="decimal"/>
+      <w:pStyle w:val="22"/>
+      <w:lvlText w:val="%1.%2"/>
+      <w:lvlJc w:val="left"/>
+      <w:pPr>
+        <w:ind w:left="576" w:hanging="576"/>
+      </w:pPr>
+    </w:lvl>
+    <w:lvl w:ilvl="2">
+      <w:start w:val="1"/>
+      <w:numFmt w:val="decimal"/>
+      <w:pStyle w:val="31"/>
+      <w:lvlText w:val="%1.%2.%3"/>
+      <w:lvlJc w:val="left"/>
+      <w:pPr>
+        <w:ind w:left="720" w:hanging="720"/>
+      </w:pPr>
+    </w:lvl>
+    <w:lvl w:ilvl="3">
+      <w:start w:val="1"/>
+      <w:numFmt w:val="decimal"/>
+      <w:pStyle w:val="40"/>
+      <w:lvlText w:val="%1.%2.%3.%4"/>
+      <w:lvlJc w:val="left"/>
+      <w:pPr>
+        <w:ind w:left="864" w:hanging="864"/>
+      </w:pPr>
+    </w:lvl>
+    <w:lvl w:ilvl="4">
+      <w:start w:val="1"/>
+      <w:numFmt w:val="decimal"/>
+      <w:pStyle w:val="50"/>
+      <w:lvlText w:val="%1.%2.%3.%4.%5"/>
+      <w:lvlJc w:val="left"/>
+      <w:pPr>
+        <w:ind w:left="1008" w:hanging="1008"/>
+      </w:pPr>
+    </w:lvl>
+    <w:lvl w:ilvl="5">
+      <w:start w:val="1"/>
+      <w:numFmt w:val="decimal"/>
+      <w:pStyle w:val="6"/>
+      <w:lvlText w:val="%1.%2.%3.%4.%5.%6"/>
+      <w:lvlJc w:val="left"/>
+      <w:pPr>
+        <w:ind w:left="1152" w:hanging="1152"/>
+      </w:pPr>
+    </w:lvl>
+    <w:lvl w:ilvl="6">
+      <w:start w:val="1"/>
+      <w:numFmt w:val="decimal"/>
+      <w:pStyle w:val="7"/>
+      <w:lvlText w:val="%1.%2.%3.%4.%5.%6.%7"/>
+      <w:lvlJc w:val="left"/>
+      <w:pPr>
+        <w:ind w:left="1296" w:hanging="1296"/>
+      </w:pPr>
+    </w:lvl>
+    <w:lvl w:ilvl="7">
+      <w:start w:val="1"/>
+      <w:numFmt w:val="decimal"/>
+      <w:pStyle w:val="8"/>
+      <w:lvlText w:val="%1.%2.%3.%4.%5.%6.%7.%8"/>
+      <w:lvlJc w:val="left"/>
+      <w:pPr>
+        <w:ind w:left="1440" w:hanging="1440"/>
+      </w:pPr>
+    </w:lvl>
+    <w:lvl w:ilvl="8">
+      <w:start w:val="1"/>
+      <w:numFmt w:val="decimal"/>
+      <w:pStyle w:val="9"/>
+      <w:lvlText w:val="%1.%2.%3.%4.%5.%6.%7.%8.%9"/>
+      <w:lvlJc w:val="left"/>
+      <w:pPr>
+        <w:ind w:left="1584" w:hanging="1584"/>
+      </w:pPr>
+    </w:lvl>
+  </w:abstractNum>
+  <w:abstractNum w:abstractNumId="23" w15:restartNumberingAfterBreak="0">
     <w:nsid w:val="349329F9"/>
     <w:multiLevelType w:val="multilevel"/>
     <w:tmpl w:val="5770D028"/>
@@ -10270,7 +10502,7 @@
       </w:pPr>
     </w:lvl>
   </w:abstractNum>
-  <w:abstractNum w:abstractNumId="21" w15:restartNumberingAfterBreak="0">
+  <w:abstractNum w:abstractNumId="24" w15:restartNumberingAfterBreak="0">
     <w:nsid w:val="34DB61DB"/>
     <w:multiLevelType w:val="multilevel"/>
     <w:tmpl w:val="E1A2C20A"/>
@@ -10361,7 +10593,7 @@
       </w:pPr>
     </w:lvl>
   </w:abstractNum>
-  <w:abstractNum w:abstractNumId="22" w15:restartNumberingAfterBreak="0">
+  <w:abstractNum w:abstractNumId="25" w15:restartNumberingAfterBreak="0">
     <w:nsid w:val="37601EE1"/>
     <w:multiLevelType w:val="hybridMultilevel"/>
     <w:tmpl w:val="C7D24832"/>
@@ -10453,7 +10685,7 @@
       </w:pPr>
     </w:lvl>
   </w:abstractNum>
-  <w:abstractNum w:abstractNumId="23" w15:restartNumberingAfterBreak="0">
+  <w:abstractNum w:abstractNumId="26" w15:restartNumberingAfterBreak="0">
     <w:nsid w:val="37782466"/>
     <w:multiLevelType w:val="hybridMultilevel"/>
     <w:tmpl w:val="55A8637A"/>
@@ -10543,11 +10775,11 @@
       </w:pPr>
     </w:lvl>
   </w:abstractNum>
-  <w:abstractNum w:abstractNumId="24" w15:restartNumberingAfterBreak="0">
+  <w:abstractNum w:abstractNumId="27" w15:restartNumberingAfterBreak="0">
     <w:nsid w:val="38654138"/>
     <w:multiLevelType w:val="multilevel"/>
     <w:tmpl w:val="AA96CC38"/>
-    <w:styleLink w:val="6"/>
+    <w:styleLink w:val="60"/>
     <w:lvl w:ilvl="0">
       <w:start w:val="1"/>
       <w:numFmt w:val="decimal"/>
@@ -10678,7 +10910,7 @@
       </w:rPr>
     </w:lvl>
   </w:abstractNum>
-  <w:abstractNum w:abstractNumId="25" w15:restartNumberingAfterBreak="0">
+  <w:abstractNum w:abstractNumId="28" w15:restartNumberingAfterBreak="0">
     <w:nsid w:val="3A806FE2"/>
     <w:multiLevelType w:val="hybridMultilevel"/>
     <w:tmpl w:val="55A8637A"/>
@@ -10768,7 +11000,7 @@
       </w:pPr>
     </w:lvl>
   </w:abstractNum>
-  <w:abstractNum w:abstractNumId="26" w15:restartNumberingAfterBreak="0">
+  <w:abstractNum w:abstractNumId="29" w15:restartNumberingAfterBreak="0">
     <w:nsid w:val="3F9B6C2E"/>
     <w:multiLevelType w:val="hybridMultilevel"/>
     <w:tmpl w:val="55A8637A"/>
@@ -10858,7 +11090,7 @@
       </w:pPr>
     </w:lvl>
   </w:abstractNum>
-  <w:abstractNum w:abstractNumId="27" w15:restartNumberingAfterBreak="0">
+  <w:abstractNum w:abstractNumId="30" w15:restartNumberingAfterBreak="0">
     <w:nsid w:val="41CF6D96"/>
     <w:multiLevelType w:val="hybridMultilevel"/>
     <w:tmpl w:val="55A8637A"/>
@@ -10948,7 +11180,7 @@
       </w:pPr>
     </w:lvl>
   </w:abstractNum>
-  <w:abstractNum w:abstractNumId="28" w15:restartNumberingAfterBreak="0">
+  <w:abstractNum w:abstractNumId="31" w15:restartNumberingAfterBreak="0">
     <w:nsid w:val="42F73AF4"/>
     <w:multiLevelType w:val="hybridMultilevel"/>
     <w:tmpl w:val="55A8637A"/>
@@ -11038,7 +11270,7 @@
       </w:pPr>
     </w:lvl>
   </w:abstractNum>
-  <w:abstractNum w:abstractNumId="29" w15:restartNumberingAfterBreak="0">
+  <w:abstractNum w:abstractNumId="32" w15:restartNumberingAfterBreak="0">
     <w:nsid w:val="459F2701"/>
     <w:multiLevelType w:val="multilevel"/>
     <w:tmpl w:val="A48036AE"/>
@@ -11181,7 +11413,7 @@
       </w:rPr>
     </w:lvl>
   </w:abstractNum>
-  <w:abstractNum w:abstractNumId="30" w15:restartNumberingAfterBreak="0">
+  <w:abstractNum w:abstractNumId="33" w15:restartNumberingAfterBreak="0">
     <w:nsid w:val="4AE45126"/>
     <w:multiLevelType w:val="multilevel"/>
     <w:tmpl w:val="7E8E8020"/>
@@ -11323,7 +11555,7 @@
       </w:rPr>
     </w:lvl>
   </w:abstractNum>
-  <w:abstractNum w:abstractNumId="31" w15:restartNumberingAfterBreak="0">
+  <w:abstractNum w:abstractNumId="34" w15:restartNumberingAfterBreak="0">
     <w:nsid w:val="4F012B3F"/>
     <w:multiLevelType w:val="hybridMultilevel"/>
     <w:tmpl w:val="55A8637A"/>
@@ -11413,11 +11645,11 @@
       </w:pPr>
     </w:lvl>
   </w:abstractNum>
-  <w:abstractNum w:abstractNumId="32" w15:restartNumberingAfterBreak="0">
+  <w:abstractNum w:abstractNumId="35" w15:restartNumberingAfterBreak="0">
     <w:nsid w:val="53BE5BDD"/>
     <w:multiLevelType w:val="multilevel"/>
     <w:tmpl w:val="763A0C4E"/>
-    <w:styleLink w:val="40"/>
+    <w:styleLink w:val="41"/>
     <w:lvl w:ilvl="0">
       <w:start w:val="1"/>
       <w:numFmt w:val="bullet"/>
@@ -11546,7 +11778,7 @@
       </w:rPr>
     </w:lvl>
   </w:abstractNum>
-  <w:abstractNum w:abstractNumId="33" w15:restartNumberingAfterBreak="0">
+  <w:abstractNum w:abstractNumId="36" w15:restartNumberingAfterBreak="0">
     <w:nsid w:val="543F35AD"/>
     <w:multiLevelType w:val="multilevel"/>
     <w:tmpl w:val="051ED0C4"/>
@@ -11637,11 +11869,100 @@
       </w:pPr>
     </w:lvl>
   </w:abstractNum>
-  <w:abstractNum w:abstractNumId="34" w15:restartNumberingAfterBreak="0">
+  <w:abstractNum w:abstractNumId="37" w15:restartNumberingAfterBreak="0">
+    <w:nsid w:val="5ACA3F80"/>
+    <w:multiLevelType w:val="multilevel"/>
+    <w:tmpl w:val="04190025"/>
+    <w:lvl w:ilvl="0">
+      <w:start w:val="1"/>
+      <w:numFmt w:val="decimal"/>
+      <w:lvlText w:val="%1"/>
+      <w:lvlJc w:val="left"/>
+      <w:pPr>
+        <w:ind w:left="432" w:hanging="432"/>
+      </w:pPr>
+      <w:rPr>
+        <w:rFonts w:hint="default"/>
+      </w:rPr>
+    </w:lvl>
+    <w:lvl w:ilvl="1">
+      <w:start w:val="1"/>
+      <w:numFmt w:val="decimal"/>
+      <w:lvlText w:val="%1.%2"/>
+      <w:lvlJc w:val="left"/>
+      <w:pPr>
+        <w:ind w:left="576" w:hanging="576"/>
+      </w:pPr>
+    </w:lvl>
+    <w:lvl w:ilvl="2">
+      <w:start w:val="1"/>
+      <w:numFmt w:val="decimal"/>
+      <w:lvlText w:val="%1.%2.%3"/>
+      <w:lvlJc w:val="left"/>
+      <w:pPr>
+        <w:ind w:left="720" w:hanging="720"/>
+      </w:pPr>
+    </w:lvl>
+    <w:lvl w:ilvl="3">
+      <w:start w:val="1"/>
+      <w:numFmt w:val="decimal"/>
+      <w:lvlText w:val="%1.%2.%3.%4"/>
+      <w:lvlJc w:val="left"/>
+      <w:pPr>
+        <w:ind w:left="864" w:hanging="864"/>
+      </w:pPr>
+    </w:lvl>
+    <w:lvl w:ilvl="4">
+      <w:start w:val="1"/>
+      <w:numFmt w:val="decimal"/>
+      <w:lvlText w:val="%1.%2.%3.%4.%5"/>
+      <w:lvlJc w:val="left"/>
+      <w:pPr>
+        <w:ind w:left="1008" w:hanging="1008"/>
+      </w:pPr>
+    </w:lvl>
+    <w:lvl w:ilvl="5">
+      <w:start w:val="1"/>
+      <w:numFmt w:val="decimal"/>
+      <w:lvlText w:val="%1.%2.%3.%4.%5.%6"/>
+      <w:lvlJc w:val="left"/>
+      <w:pPr>
+        <w:ind w:left="1152" w:hanging="1152"/>
+      </w:pPr>
+    </w:lvl>
+    <w:lvl w:ilvl="6">
+      <w:start w:val="1"/>
+      <w:numFmt w:val="decimal"/>
+      <w:lvlText w:val="%1.%2.%3.%4.%5.%6.%7"/>
+      <w:lvlJc w:val="left"/>
+      <w:pPr>
+        <w:ind w:left="1296" w:hanging="1296"/>
+      </w:pPr>
+    </w:lvl>
+    <w:lvl w:ilvl="7">
+      <w:start w:val="1"/>
+      <w:numFmt w:val="decimal"/>
+      <w:lvlText w:val="%1.%2.%3.%4.%5.%6.%7.%8"/>
+      <w:lvlJc w:val="left"/>
+      <w:pPr>
+        <w:ind w:left="1440" w:hanging="1440"/>
+      </w:pPr>
+    </w:lvl>
+    <w:lvl w:ilvl="8">
+      <w:start w:val="1"/>
+      <w:numFmt w:val="decimal"/>
+      <w:lvlText w:val="%1.%2.%3.%4.%5.%6.%7.%8.%9"/>
+      <w:lvlJc w:val="left"/>
+      <w:pPr>
+        <w:ind w:left="1584" w:hanging="1584"/>
+      </w:pPr>
+    </w:lvl>
+  </w:abstractNum>
+  <w:abstractNum w:abstractNumId="38" w15:restartNumberingAfterBreak="0">
     <w:nsid w:val="65D74793"/>
     <w:multiLevelType w:val="multilevel"/>
     <w:tmpl w:val="E0A0DCC2"/>
-    <w:styleLink w:val="12"/>
+    <w:styleLink w:val="120"/>
     <w:lvl w:ilvl="0">
       <w:start w:val="1"/>
       <w:numFmt w:val="decimal"/>
@@ -11728,7 +12049,7 @@
       </w:pPr>
     </w:lvl>
   </w:abstractNum>
-  <w:abstractNum w:abstractNumId="35" w15:restartNumberingAfterBreak="0">
+  <w:abstractNum w:abstractNumId="39" w15:restartNumberingAfterBreak="0">
     <w:nsid w:val="67631314"/>
     <w:multiLevelType w:val="hybridMultilevel"/>
     <w:tmpl w:val="55A8637A"/>
@@ -11818,7 +12139,7 @@
       </w:pPr>
     </w:lvl>
   </w:abstractNum>
-  <w:abstractNum w:abstractNumId="36" w15:restartNumberingAfterBreak="0">
+  <w:abstractNum w:abstractNumId="40" w15:restartNumberingAfterBreak="0">
     <w:nsid w:val="689562AF"/>
     <w:multiLevelType w:val="multilevel"/>
     <w:tmpl w:val="4F5E5844"/>
@@ -11923,7 +12244,7 @@
       </w:rPr>
     </w:lvl>
   </w:abstractNum>
-  <w:abstractNum w:abstractNumId="37" w15:restartNumberingAfterBreak="0">
+  <w:abstractNum w:abstractNumId="41" w15:restartNumberingAfterBreak="0">
     <w:nsid w:val="69DF5FAE"/>
     <w:multiLevelType w:val="hybridMultilevel"/>
     <w:tmpl w:val="55A8637A"/>
@@ -12013,7 +12334,7 @@
       </w:pPr>
     </w:lvl>
   </w:abstractNum>
-  <w:abstractNum w:abstractNumId="38" w15:restartNumberingAfterBreak="0">
+  <w:abstractNum w:abstractNumId="42" w15:restartNumberingAfterBreak="0">
     <w:nsid w:val="746926BE"/>
     <w:multiLevelType w:val="hybridMultilevel"/>
     <w:tmpl w:val="55A8637A"/>
@@ -12103,7 +12424,7 @@
       </w:pPr>
     </w:lvl>
   </w:abstractNum>
-  <w:abstractNum w:abstractNumId="39" w15:restartNumberingAfterBreak="0">
+  <w:abstractNum w:abstractNumId="43" w15:restartNumberingAfterBreak="0">
     <w:nsid w:val="74DD0F5E"/>
     <w:multiLevelType w:val="hybridMultilevel"/>
     <w:tmpl w:val="81CC108C"/>
@@ -12216,7 +12537,7 @@
       </w:rPr>
     </w:lvl>
   </w:abstractNum>
-  <w:abstractNum w:abstractNumId="40" w15:restartNumberingAfterBreak="0">
+  <w:abstractNum w:abstractNumId="44" w15:restartNumberingAfterBreak="0">
     <w:nsid w:val="796153C0"/>
     <w:multiLevelType w:val="hybridMultilevel"/>
     <w:tmpl w:val="456CB3DC"/>
@@ -12307,7 +12628,7 @@
       </w:pPr>
     </w:lvl>
   </w:abstractNum>
-  <w:abstractNum w:abstractNumId="41" w15:restartNumberingAfterBreak="0">
+  <w:abstractNum w:abstractNumId="45" w15:restartNumberingAfterBreak="0">
     <w:nsid w:val="79E2341E"/>
     <w:multiLevelType w:val="hybridMultilevel"/>
     <w:tmpl w:val="55A8637A"/>
@@ -12398,25 +12719,25 @@
     </w:lvl>
   </w:abstractNum>
   <w:num w:numId="1" w16cid:durableId="898707020">
-    <w:abstractNumId w:val="9"/>
+    <w:abstractNumId w:val="10"/>
   </w:num>
   <w:num w:numId="2" w16cid:durableId="1770389669">
-    <w:abstractNumId w:val="24"/>
+    <w:abstractNumId w:val="27"/>
   </w:num>
   <w:num w:numId="3" w16cid:durableId="440416075">
+    <w:abstractNumId w:val="35"/>
+  </w:num>
+  <w:num w:numId="4" w16cid:durableId="832531979">
+    <w:abstractNumId w:val="14"/>
+  </w:num>
+  <w:num w:numId="5" w16cid:durableId="1616206315">
     <w:abstractNumId w:val="32"/>
   </w:num>
-  <w:num w:numId="4" w16cid:durableId="832531979">
-    <w:abstractNumId w:val="13"/>
-  </w:num>
-  <w:num w:numId="5" w16cid:durableId="1616206315">
-    <w:abstractNumId w:val="29"/>
-  </w:num>
   <w:num w:numId="6" w16cid:durableId="241379521">
-    <w:abstractNumId w:val="18"/>
+    <w:abstractNumId w:val="20"/>
   </w:num>
   <w:num w:numId="7" w16cid:durableId="1009064325">
-    <w:abstractNumId w:val="6"/>
+    <w:abstractNumId w:val="7"/>
   </w:num>
   <w:num w:numId="8" w16cid:durableId="1343166565">
     <w:abstractNumId w:val="2"/>
@@ -12425,13 +12746,13 @@
     </w:lvlOverride>
   </w:num>
   <w:num w:numId="9" w16cid:durableId="1985620233">
-    <w:abstractNumId w:val="40"/>
+    <w:abstractNumId w:val="44"/>
   </w:num>
   <w:num w:numId="10" w16cid:durableId="1193109343">
-    <w:abstractNumId w:val="10"/>
+    <w:abstractNumId w:val="11"/>
   </w:num>
   <w:num w:numId="11" w16cid:durableId="182060031">
-    <w:abstractNumId w:val="30"/>
+    <w:abstractNumId w:val="33"/>
     <w:lvlOverride w:ilvl="0">
       <w:lvl w:ilvl="0">
         <w:start w:val="1"/>
@@ -12453,7 +12774,7 @@
     </w:lvlOverride>
   </w:num>
   <w:num w:numId="12" w16cid:durableId="1357583848">
-    <w:abstractNumId w:val="16"/>
+    <w:abstractNumId w:val="17"/>
     <w:lvlOverride w:ilvl="0">
       <w:lvl w:ilvl="0">
         <w:start w:val="1"/>
@@ -12716,7 +13037,7 @@
     </w:lvlOverride>
   </w:num>
   <w:num w:numId="13" w16cid:durableId="859322964">
-    <w:abstractNumId w:val="12"/>
+    <w:abstractNumId w:val="13"/>
   </w:num>
   <w:num w:numId="14" w16cid:durableId="715281109">
     <w:abstractNumId w:val="4"/>
@@ -12749,37 +13070,37 @@
     </w:lvlOverride>
   </w:num>
   <w:num w:numId="15" w16cid:durableId="593130490">
-    <w:abstractNumId w:val="17"/>
+    <w:abstractNumId w:val="19"/>
   </w:num>
   <w:num w:numId="16" w16cid:durableId="2018262411">
     <w:abstractNumId w:val="1"/>
   </w:num>
   <w:num w:numId="17" w16cid:durableId="631207072">
-    <w:abstractNumId w:val="11"/>
+    <w:abstractNumId w:val="12"/>
   </w:num>
   <w:num w:numId="18" w16cid:durableId="1030764800">
-    <w:abstractNumId w:val="5"/>
+    <w:abstractNumId w:val="6"/>
   </w:num>
   <w:num w:numId="19" w16cid:durableId="1720126100">
-    <w:abstractNumId w:val="20"/>
+    <w:abstractNumId w:val="23"/>
   </w:num>
   <w:num w:numId="20" w16cid:durableId="737676300">
-    <w:abstractNumId w:val="21"/>
+    <w:abstractNumId w:val="24"/>
   </w:num>
   <w:num w:numId="21" w16cid:durableId="1799834727">
+    <w:abstractNumId w:val="36"/>
+  </w:num>
+  <w:num w:numId="22" w16cid:durableId="613056206">
+    <w:abstractNumId w:val="38"/>
+  </w:num>
+  <w:num w:numId="23" w16cid:durableId="1713378219">
+    <w:abstractNumId w:val="17"/>
+  </w:num>
+  <w:num w:numId="24" w16cid:durableId="146166759">
     <w:abstractNumId w:val="33"/>
   </w:num>
-  <w:num w:numId="22" w16cid:durableId="613056206">
-    <w:abstractNumId w:val="34"/>
-  </w:num>
-  <w:num w:numId="23" w16cid:durableId="1713378219">
-    <w:abstractNumId w:val="16"/>
-  </w:num>
-  <w:num w:numId="24" w16cid:durableId="146166759">
-    <w:abstractNumId w:val="30"/>
-  </w:num>
   <w:num w:numId="25" w16cid:durableId="902376188">
-    <w:abstractNumId w:val="18"/>
+    <w:abstractNumId w:val="20"/>
     <w:lvlOverride w:ilvl="0">
       <w:startOverride w:val="1"/>
     </w:lvlOverride>
@@ -12809,7 +13130,7 @@
     </w:lvlOverride>
   </w:num>
   <w:num w:numId="26" w16cid:durableId="920215584">
-    <w:abstractNumId w:val="18"/>
+    <w:abstractNumId w:val="20"/>
     <w:lvlOverride w:ilvl="0">
       <w:startOverride w:val="2"/>
     </w:lvlOverride>
@@ -12839,67 +13160,109 @@
     </w:lvlOverride>
   </w:num>
   <w:num w:numId="27" w16cid:durableId="2141142806">
-    <w:abstractNumId w:val="25"/>
+    <w:abstractNumId w:val="28"/>
   </w:num>
   <w:num w:numId="28" w16cid:durableId="124858556">
-    <w:abstractNumId w:val="7"/>
+    <w:abstractNumId w:val="8"/>
   </w:num>
   <w:num w:numId="29" w16cid:durableId="1223638431">
-    <w:abstractNumId w:val="28"/>
+    <w:abstractNumId w:val="31"/>
   </w:num>
   <w:num w:numId="30" w16cid:durableId="824785319">
-    <w:abstractNumId w:val="35"/>
+    <w:abstractNumId w:val="39"/>
   </w:num>
   <w:num w:numId="31" w16cid:durableId="75783541">
-    <w:abstractNumId w:val="23"/>
+    <w:abstractNumId w:val="26"/>
   </w:num>
   <w:num w:numId="32" w16cid:durableId="1494029657">
     <w:abstractNumId w:val="3"/>
   </w:num>
   <w:num w:numId="33" w16cid:durableId="444814678">
-    <w:abstractNumId w:val="8"/>
+    <w:abstractNumId w:val="9"/>
   </w:num>
   <w:num w:numId="34" w16cid:durableId="1543862904">
-    <w:abstractNumId w:val="27"/>
+    <w:abstractNumId w:val="30"/>
   </w:num>
   <w:num w:numId="35" w16cid:durableId="1560436928">
-    <w:abstractNumId w:val="41"/>
+    <w:abstractNumId w:val="45"/>
   </w:num>
   <w:num w:numId="36" w16cid:durableId="2082675221">
-    <w:abstractNumId w:val="31"/>
+    <w:abstractNumId w:val="34"/>
   </w:num>
   <w:num w:numId="37" w16cid:durableId="1160149076">
-    <w:abstractNumId w:val="26"/>
+    <w:abstractNumId w:val="29"/>
   </w:num>
   <w:num w:numId="38" w16cid:durableId="240452958">
-    <w:abstractNumId w:val="38"/>
+    <w:abstractNumId w:val="42"/>
   </w:num>
   <w:num w:numId="39" w16cid:durableId="689185366">
-    <w:abstractNumId w:val="37"/>
+    <w:abstractNumId w:val="41"/>
   </w:num>
   <w:num w:numId="40" w16cid:durableId="319189690">
     <w:abstractNumId w:val="2"/>
   </w:num>
   <w:num w:numId="41" w16cid:durableId="1968314173">
-    <w:abstractNumId w:val="22"/>
+    <w:abstractNumId w:val="25"/>
   </w:num>
   <w:num w:numId="42" w16cid:durableId="2070573373">
-    <w:abstractNumId w:val="19"/>
+    <w:abstractNumId w:val="21"/>
   </w:num>
   <w:num w:numId="43" w16cid:durableId="1041445229">
-    <w:abstractNumId w:val="39"/>
+    <w:abstractNumId w:val="43"/>
   </w:num>
   <w:num w:numId="44" w16cid:durableId="1172139746">
-    <w:abstractNumId w:val="15"/>
+    <w:abstractNumId w:val="16"/>
   </w:num>
   <w:num w:numId="45" w16cid:durableId="2061784379">
-    <w:abstractNumId w:val="14"/>
+    <w:abstractNumId w:val="15"/>
   </w:num>
   <w:num w:numId="46" w16cid:durableId="2093431927">
     <w:abstractNumId w:val="0"/>
   </w:num>
   <w:num w:numId="47" w16cid:durableId="575482443">
-    <w:abstractNumId w:val="36"/>
+    <w:abstractNumId w:val="40"/>
+  </w:num>
+  <w:num w:numId="48" w16cid:durableId="1406608562">
+    <w:abstractNumId w:val="5"/>
+  </w:num>
+  <w:num w:numId="49" w16cid:durableId="553809325">
+    <w:abstractNumId w:val="22"/>
+  </w:num>
+  <w:num w:numId="50" w16cid:durableId="838547143">
+    <w:abstractNumId w:val="18"/>
+  </w:num>
+  <w:num w:numId="51" w16cid:durableId="203490227">
+    <w:abstractNumId w:val="22"/>
+    <w:lvlOverride w:ilvl="0">
+      <w:startOverride w:val="1"/>
+    </w:lvlOverride>
+    <w:lvlOverride w:ilvl="1">
+      <w:startOverride w:val="1"/>
+    </w:lvlOverride>
+    <w:lvlOverride w:ilvl="2">
+      <w:startOverride w:val="1"/>
+    </w:lvlOverride>
+    <w:lvlOverride w:ilvl="3">
+      <w:startOverride w:val="1"/>
+    </w:lvlOverride>
+    <w:lvlOverride w:ilvl="4">
+      <w:startOverride w:val="1"/>
+    </w:lvlOverride>
+    <w:lvlOverride w:ilvl="5">
+      <w:startOverride w:val="1"/>
+    </w:lvlOverride>
+    <w:lvlOverride w:ilvl="6">
+      <w:startOverride w:val="1"/>
+    </w:lvlOverride>
+    <w:lvlOverride w:ilvl="7">
+      <w:startOverride w:val="1"/>
+    </w:lvlOverride>
+    <w:lvlOverride w:ilvl="8">
+      <w:startOverride w:val="1"/>
+    </w:lvlOverride>
+  </w:num>
+  <w:num w:numId="52" w16cid:durableId="609900721">
+    <w:abstractNumId w:val="37"/>
   </w:num>
   <w:numIdMacAtCleanup w:val="22"/>
 </w:numbering>
@@ -13315,22 +13678,26 @@
       <w:lang w:eastAsia="ru-RU"/>
     </w:rPr>
   </w:style>
-  <w:style w:type="paragraph" w:styleId="14">
+  <w:style w:type="paragraph" w:styleId="12">
     <w:name w:val="heading 1"/>
     <w:basedOn w:val="af"/>
     <w:next w:val="af"/>
-    <w:link w:val="15"/>
+    <w:link w:val="14"/>
     <w:uiPriority w:val="9"/>
     <w:unhideWhenUsed/>
     <w:qFormat/>
-    <w:rsid w:val="00401E80"/>
+    <w:rsid w:val="00876500"/>
     <w:pPr>
       <w:keepNext/>
       <w:keepLines/>
+      <w:numPr>
+        <w:numId w:val="49"/>
+      </w:numPr>
       <w:tabs>
         <w:tab w:val="left" w:pos="567"/>
       </w:tabs>
       <w:spacing w:before="480"/>
+      <w:ind w:left="0" w:firstLine="0"/>
       <w:outlineLvl w:val="0"/>
     </w:pPr>
     <w:rPr>
@@ -13350,14 +13717,19 @@
     <w:uiPriority w:val="9"/>
     <w:unhideWhenUsed/>
     <w:qFormat/>
-    <w:rsid w:val="00401E80"/>
+    <w:rsid w:val="00934734"/>
     <w:pPr>
       <w:keepNext/>
       <w:keepLines/>
+      <w:numPr>
+        <w:ilvl w:val="1"/>
+        <w:numId w:val="49"/>
+      </w:numPr>
       <w:tabs>
         <w:tab w:val="left" w:pos="567"/>
       </w:tabs>
       <w:spacing w:before="200"/>
+      <w:ind w:left="0" w:firstLine="0"/>
       <w:outlineLvl w:val="1"/>
     </w:pPr>
     <w:rPr>
@@ -13377,11 +13749,16 @@
     <w:uiPriority w:val="9"/>
     <w:unhideWhenUsed/>
     <w:qFormat/>
-    <w:rsid w:val="00663057"/>
+    <w:rsid w:val="00934734"/>
     <w:pPr>
       <w:keepNext/>
       <w:keepLines/>
+      <w:numPr>
+        <w:ilvl w:val="2"/>
+        <w:numId w:val="49"/>
+      </w:numPr>
       <w:spacing w:before="200"/>
+      <w:ind w:left="0" w:firstLine="0"/>
       <w:outlineLvl w:val="2"/>
     </w:pPr>
     <w:rPr>
@@ -13391,7 +13768,7 @@
       <w:color w:val="365F91" w:themeColor="accent1" w:themeShade="BF"/>
     </w:rPr>
   </w:style>
-  <w:style w:type="paragraph" w:styleId="41">
+  <w:style w:type="paragraph" w:styleId="40">
     <w:name w:val="heading 4"/>
     <w:basedOn w:val="af"/>
     <w:next w:val="af"/>
@@ -13403,6 +13780,10 @@
     <w:pPr>
       <w:keepNext/>
       <w:keepLines/>
+      <w:numPr>
+        <w:ilvl w:val="3"/>
+        <w:numId w:val="49"/>
+      </w:numPr>
       <w:spacing w:before="200"/>
       <w:outlineLvl w:val="3"/>
     </w:pPr>
@@ -13427,6 +13808,10 @@
     <w:pPr>
       <w:keepNext/>
       <w:keepLines/>
+      <w:numPr>
+        <w:ilvl w:val="4"/>
+        <w:numId w:val="49"/>
+      </w:numPr>
       <w:spacing w:before="200"/>
       <w:outlineLvl w:val="4"/>
     </w:pPr>
@@ -13435,7 +13820,7 @@
       <w:color w:val="243F60" w:themeColor="accent1" w:themeShade="7F"/>
     </w:rPr>
   </w:style>
-  <w:style w:type="paragraph" w:styleId="60">
+  <w:style w:type="paragraph" w:styleId="6">
     <w:name w:val="heading 6"/>
     <w:basedOn w:val="af"/>
     <w:next w:val="af"/>
@@ -13447,6 +13832,10 @@
     <w:pPr>
       <w:keepNext/>
       <w:keepLines/>
+      <w:numPr>
+        <w:ilvl w:val="5"/>
+        <w:numId w:val="49"/>
+      </w:numPr>
       <w:spacing w:before="200"/>
       <w:outlineLvl w:val="5"/>
     </w:pPr>
@@ -13469,6 +13858,10 @@
     <w:pPr>
       <w:keepNext/>
       <w:keepLines/>
+      <w:numPr>
+        <w:ilvl w:val="6"/>
+        <w:numId w:val="49"/>
+      </w:numPr>
       <w:spacing w:before="200"/>
       <w:outlineLvl w:val="6"/>
     </w:pPr>
@@ -13490,6 +13883,10 @@
     <w:qFormat/>
     <w:rsid w:val="00667F78"/>
     <w:pPr>
+      <w:numPr>
+        <w:ilvl w:val="7"/>
+        <w:numId w:val="49"/>
+      </w:numPr>
       <w:spacing w:before="240" w:after="60" w:line="240" w:lineRule="auto"/>
       <w:outlineLvl w:val="7"/>
     </w:pPr>
@@ -13512,6 +13909,10 @@
     <w:qFormat/>
     <w:rsid w:val="00667F78"/>
     <w:pPr>
+      <w:numPr>
+        <w:ilvl w:val="8"/>
+        <w:numId w:val="49"/>
+      </w:numPr>
       <w:spacing w:before="240" w:after="60" w:line="240" w:lineRule="auto"/>
       <w:outlineLvl w:val="8"/>
     </w:pPr>
@@ -13566,7 +13967,7 @@
   <w:style w:type="character" w:customStyle="1" w:styleId="61">
     <w:name w:val="Заголовок 6 Знак"/>
     <w:basedOn w:val="af0"/>
-    <w:link w:val="60"/>
+    <w:link w:val="6"/>
     <w:uiPriority w:val="9"/>
     <w:rsid w:val="00295CFA"/>
     <w:rPr>
@@ -13632,9 +14033,9 @@
   <w:style w:type="paragraph" w:customStyle="1" w:styleId="11">
     <w:name w:val="ДОК Заголовок 1"/>
     <w:basedOn w:val="af"/>
-    <w:link w:val="16"/>
+    <w:link w:val="15"/>
     <w:qFormat/>
-    <w:rsid w:val="00A92DC4"/>
+    <w:rsid w:val="00410A2A"/>
     <w:pPr>
       <w:pageBreakBefore/>
       <w:numPr>
@@ -13649,22 +14050,23 @@
       <w:bCs/>
       <w:noProof/>
       <w:color w:val="365F91" w:themeColor="accent1" w:themeShade="BF"/>
+      <w:sz w:val="28"/>
       <w:szCs w:val="22"/>
       <w:lang w:val="en-US"/>
     </w:rPr>
   </w:style>
-  <w:style w:type="character" w:customStyle="1" w:styleId="16">
+  <w:style w:type="character" w:customStyle="1" w:styleId="15">
     <w:name w:val="ДОК Заголовок 1 Знак"/>
     <w:basedOn w:val="af0"/>
     <w:link w:val="11"/>
-    <w:rsid w:val="00A92DC4"/>
+    <w:rsid w:val="00410A2A"/>
     <w:rPr>
       <w:rFonts w:ascii="Arial Narrow" w:eastAsia="Times New Roman" w:hAnsi="Arial Narrow" w:cs="Times New Roman"/>
       <w:b/>
       <w:bCs/>
       <w:noProof/>
       <w:color w:val="365F91" w:themeColor="accent1" w:themeShade="BF"/>
-      <w:sz w:val="24"/>
+      <w:sz w:val="28"/>
       <w:lang w:val="en-US" w:eastAsia="ru-RU"/>
     </w:rPr>
   </w:style>
@@ -14010,12 +14412,12 @@
       </w:tblBorders>
     </w:tblPr>
   </w:style>
-  <w:style w:type="character" w:customStyle="1" w:styleId="15">
+  <w:style w:type="character" w:customStyle="1" w:styleId="14">
     <w:name w:val="Заголовок 1 Знак"/>
     <w:basedOn w:val="af0"/>
-    <w:link w:val="14"/>
+    <w:link w:val="12"/>
     <w:uiPriority w:val="9"/>
-    <w:rsid w:val="00401E80"/>
+    <w:rsid w:val="00876500"/>
     <w:rPr>
       <w:rFonts w:ascii="Arial Narrow" w:eastAsiaTheme="majorEastAsia" w:hAnsi="Arial Narrow" w:cstheme="majorBidi"/>
       <w:b/>
@@ -14059,7 +14461,7 @@
     <w:basedOn w:val="af0"/>
     <w:link w:val="31"/>
     <w:uiPriority w:val="9"/>
-    <w:rsid w:val="00663057"/>
+    <w:rsid w:val="00934734"/>
     <w:rPr>
       <w:rFonts w:ascii="Arial Narrow" w:eastAsiaTheme="majorEastAsia" w:hAnsi="Arial Narrow" w:cstheme="majorBidi"/>
       <w:b/>
@@ -14085,7 +14487,7 @@
     <w:basedOn w:val="af0"/>
     <w:link w:val="22"/>
     <w:uiPriority w:val="9"/>
-    <w:rsid w:val="00401E80"/>
+    <w:rsid w:val="00934734"/>
     <w:rPr>
       <w:rFonts w:ascii="Arial Narrow" w:eastAsiaTheme="majorEastAsia" w:hAnsi="Arial Narrow" w:cstheme="majorBidi"/>
       <w:b/>
@@ -14099,7 +14501,7 @@
   <w:style w:type="character" w:customStyle="1" w:styleId="42">
     <w:name w:val="Заголовок 4 Знак"/>
     <w:basedOn w:val="af0"/>
-    <w:link w:val="41"/>
+    <w:link w:val="40"/>
     <w:uiPriority w:val="9"/>
     <w:rsid w:val="00951190"/>
     <w:rPr>
@@ -14236,7 +14638,7 @@
       <w:jc w:val="both"/>
     </w:pPr>
   </w:style>
-  <w:style w:type="paragraph" w:styleId="17">
+  <w:style w:type="paragraph" w:styleId="16">
     <w:name w:val="toc 1"/>
     <w:basedOn w:val="11"/>
     <w:next w:val="af"/>
@@ -14624,7 +15026,7 @@
     <w:semiHidden/>
     <w:rsid w:val="002E399C"/>
   </w:style>
-  <w:style w:type="character" w:customStyle="1" w:styleId="18">
+  <w:style w:type="character" w:customStyle="1" w:styleId="17">
     <w:name w:val="Неразрешенное упоминание1"/>
     <w:basedOn w:val="af0"/>
     <w:uiPriority w:val="99"/>
@@ -14972,7 +15374,7 @@
   </w:style>
   <w:style w:type="paragraph" w:styleId="afffff1">
     <w:name w:val="TOC Heading"/>
-    <w:basedOn w:val="14"/>
+    <w:basedOn w:val="12"/>
     <w:next w:val="af"/>
     <w:uiPriority w:val="39"/>
     <w:unhideWhenUsed/>
@@ -15213,7 +15615,7 @@
     <w:unhideWhenUsed/>
     <w:rsid w:val="00D76C1B"/>
   </w:style>
-  <w:style w:type="table" w:customStyle="1" w:styleId="19">
+  <w:style w:type="table" w:customStyle="1" w:styleId="18">
     <w:name w:val="Сетка таблицы1"/>
     <w:basedOn w:val="af1"/>
     <w:uiPriority w:val="59"/>
@@ -15506,7 +15908,7 @@
       <w:szCs w:val="20"/>
     </w:rPr>
   </w:style>
-  <w:style w:type="paragraph" w:customStyle="1" w:styleId="120">
+  <w:style w:type="paragraph" w:customStyle="1" w:styleId="121">
     <w:name w:val="ДОК Текст 12"/>
     <w:basedOn w:val="afff2"/>
     <w:uiPriority w:val="99"/>
@@ -15520,9 +15922,9 @@
       <w:szCs w:val="28"/>
     </w:rPr>
   </w:style>
-  <w:style w:type="paragraph" w:customStyle="1" w:styleId="121">
+  <w:style w:type="paragraph" w:customStyle="1" w:styleId="122">
     <w:name w:val="ДОК Текст 12 Центр"/>
-    <w:basedOn w:val="120"/>
+    <w:basedOn w:val="121"/>
     <w:uiPriority w:val="99"/>
     <w:rsid w:val="00D76C1B"/>
     <w:pPr>
@@ -15939,7 +16341,7 @@
       </w:tblBorders>
     </w:tblPr>
   </w:style>
-  <w:style w:type="table" w:customStyle="1" w:styleId="122">
+  <w:style w:type="table" w:customStyle="1" w:styleId="123">
     <w:name w:val="Сетка таблицы12"/>
     <w:basedOn w:val="af1"/>
     <w:uiPriority w:val="59"/>
@@ -16392,11 +16794,11 @@
       <w:szCs w:val="28"/>
     </w:rPr>
   </w:style>
-  <w:style w:type="paragraph" w:customStyle="1" w:styleId="1a">
+  <w:style w:type="paragraph" w:customStyle="1" w:styleId="19">
     <w:name w:val="ДОК Текст ур1 раздел"/>
     <w:basedOn w:val="af"/>
     <w:next w:val="2a"/>
-    <w:link w:val="1b"/>
+    <w:link w:val="1a"/>
     <w:qFormat/>
     <w:rsid w:val="00D76C1B"/>
     <w:pPr>
@@ -16654,10 +17056,10 @@
       <w:lang w:eastAsia="ru-RU"/>
     </w:rPr>
   </w:style>
-  <w:style w:type="character" w:customStyle="1" w:styleId="1b">
+  <w:style w:type="character" w:customStyle="1" w:styleId="1a">
     <w:name w:val="ДОК Текст ур1 раздел Знак"/>
     <w:basedOn w:val="af0"/>
-    <w:link w:val="1a"/>
+    <w:link w:val="19"/>
     <w:locked/>
     <w:rsid w:val="00D76C1B"/>
     <w:rPr>
@@ -17090,7 +17492,7 @@
   </w:style>
   <w:style w:type="paragraph" w:customStyle="1" w:styleId="1614">
     <w:name w:val="Стиль ДОК Текст ур1 раздел + После:  6 пт кернинг от 14 пт"/>
-    <w:basedOn w:val="1a"/>
+    <w:basedOn w:val="19"/>
     <w:rsid w:val="00D76C1B"/>
     <w:pPr>
       <w:keepNext w:val="0"/>
@@ -17101,10 +17503,10 @@
       <w:szCs w:val="20"/>
     </w:rPr>
   </w:style>
-  <w:style w:type="character" w:customStyle="1" w:styleId="123">
+  <w:style w:type="character" w:customStyle="1" w:styleId="124">
     <w:name w:val="ДОК Таблица Текст 12 Знак"/>
     <w:basedOn w:val="affa"/>
-    <w:link w:val="124"/>
+    <w:link w:val="125"/>
     <w:locked/>
     <w:rsid w:val="00D76C1B"/>
     <w:rPr>
@@ -17115,10 +17517,10 @@
       <w:lang w:eastAsia="ru-RU"/>
     </w:rPr>
   </w:style>
-  <w:style w:type="paragraph" w:customStyle="1" w:styleId="124">
+  <w:style w:type="paragraph" w:customStyle="1" w:styleId="125">
     <w:name w:val="ДОК Таблица Текст 12"/>
     <w:basedOn w:val="af7"/>
-    <w:link w:val="123"/>
+    <w:link w:val="124"/>
     <w:qFormat/>
     <w:rsid w:val="00D76C1B"/>
     <w:pPr>
@@ -17131,18 +17533,18 @@
       <w:szCs w:val="20"/>
     </w:rPr>
   </w:style>
-  <w:style w:type="paragraph" w:customStyle="1" w:styleId="125">
+  <w:style w:type="paragraph" w:customStyle="1" w:styleId="126">
     <w:name w:val="ДОК Таблица Текст Центр 12"/>
-    <w:basedOn w:val="124"/>
+    <w:basedOn w:val="125"/>
     <w:qFormat/>
     <w:rsid w:val="00D76C1B"/>
     <w:pPr>
       <w:jc w:val="center"/>
     </w:pPr>
   </w:style>
-  <w:style w:type="paragraph" w:customStyle="1" w:styleId="126">
+  <w:style w:type="paragraph" w:customStyle="1" w:styleId="127">
     <w:name w:val="ДОК Таблица Заголовок 12"/>
-    <w:basedOn w:val="124"/>
+    <w:basedOn w:val="125"/>
     <w:qFormat/>
     <w:rsid w:val="00D76C1B"/>
     <w:pPr>
@@ -17166,7 +17568,7 @@
       <w:vertAlign w:val="superscript"/>
     </w:rPr>
   </w:style>
-  <w:style w:type="character" w:customStyle="1" w:styleId="1c">
+  <w:style w:type="character" w:customStyle="1" w:styleId="1b">
     <w:name w:val="Знак Знак1"/>
     <w:uiPriority w:val="99"/>
     <w:semiHidden/>
@@ -17607,7 +18009,7 @@
       </w:numPr>
     </w:pPr>
   </w:style>
-  <w:style w:type="numbering" w:customStyle="1" w:styleId="12">
+  <w:style w:type="numbering" w:customStyle="1" w:styleId="120">
     <w:name w:val="Стиль нумерованный 12 пт"/>
     <w:rsid w:val="00D76C1B"/>
     <w:pPr>
@@ -17621,7 +18023,7 @@
     <w:uiPriority w:val="99"/>
     <w:rsid w:val="00D76C1B"/>
   </w:style>
-  <w:style w:type="numbering" w:customStyle="1" w:styleId="1d">
+  <w:style w:type="numbering" w:customStyle="1" w:styleId="1c">
     <w:name w:val="Приложенине1"/>
     <w:next w:val="afffffff3"/>
     <w:uiPriority w:val="99"/>
@@ -17637,7 +18039,7 @@
     <w:uiPriority w:val="99"/>
     <w:rsid w:val="00D76C1B"/>
   </w:style>
-  <w:style w:type="numbering" w:customStyle="1" w:styleId="1e">
+  <w:style w:type="numbering" w:customStyle="1" w:styleId="1d">
     <w:name w:val="ДОК Список Заголовков1"/>
     <w:uiPriority w:val="99"/>
     <w:rsid w:val="00D76C1B"/>
@@ -17652,18 +18054,18 @@
     <w:uiPriority w:val="99"/>
     <w:rsid w:val="00D76C1B"/>
   </w:style>
-  <w:style w:type="numbering" w:customStyle="1" w:styleId="1f">
+  <w:style w:type="numbering" w:customStyle="1" w:styleId="1e">
     <w:name w:val="ДОК Список Текст Нумерованный1"/>
     <w:basedOn w:val="af2"/>
     <w:uiPriority w:val="99"/>
     <w:rsid w:val="00D76C1B"/>
   </w:style>
-  <w:style w:type="numbering" w:customStyle="1" w:styleId="1f0">
+  <w:style w:type="numbering" w:customStyle="1" w:styleId="1f">
     <w:name w:val="ДОК Список Текст Маркированный1"/>
     <w:basedOn w:val="afd"/>
     <w:rsid w:val="00D76C1B"/>
   </w:style>
-  <w:style w:type="numbering" w:customStyle="1" w:styleId="1f1">
+  <w:style w:type="numbering" w:customStyle="1" w:styleId="1f0">
     <w:name w:val="Нет списка1"/>
     <w:next w:val="af2"/>
     <w:uiPriority w:val="99"/>
@@ -17676,7 +18078,7 @@
     <w:uiPriority w:val="99"/>
     <w:rsid w:val="00D76C1B"/>
   </w:style>
-  <w:style w:type="numbering" w:customStyle="1" w:styleId="1f2">
+  <w:style w:type="numbering" w:customStyle="1" w:styleId="1f1">
     <w:name w:val="ДОК Список Нумерованный1"/>
     <w:basedOn w:val="af2"/>
     <w:uiPriority w:val="99"/>
@@ -17742,7 +18144,7 @@
     <w:uiPriority w:val="99"/>
     <w:rsid w:val="00D76C1B"/>
   </w:style>
-  <w:style w:type="numbering" w:customStyle="1" w:styleId="127">
+  <w:style w:type="numbering" w:customStyle="1" w:styleId="128">
     <w:name w:val="Стиль12"/>
     <w:rsid w:val="00D76C1B"/>
   </w:style>
@@ -17781,7 +18183,7 @@
     <w:uiPriority w:val="99"/>
     <w:rsid w:val="00D76C1B"/>
   </w:style>
-  <w:style w:type="numbering" w:customStyle="1" w:styleId="40">
+  <w:style w:type="numbering" w:customStyle="1" w:styleId="41">
     <w:name w:val="ДОК Список Текст Маркированный4"/>
     <w:basedOn w:val="afd"/>
     <w:uiPriority w:val="99"/>
@@ -17806,7 +18208,7 @@
     <w:uiPriority w:val="99"/>
     <w:rsid w:val="00D76C1B"/>
   </w:style>
-  <w:style w:type="numbering" w:customStyle="1" w:styleId="128">
+  <w:style w:type="numbering" w:customStyle="1" w:styleId="129">
     <w:name w:val="Приложенине12"/>
     <w:next w:val="afffffff3"/>
     <w:uiPriority w:val="99"/>
@@ -18109,7 +18511,7 @@
     <w:uiPriority w:val="99"/>
     <w:rsid w:val="00D76C1B"/>
   </w:style>
-  <w:style w:type="numbering" w:customStyle="1" w:styleId="6">
+  <w:style w:type="numbering" w:customStyle="1" w:styleId="60">
     <w:name w:val="ДОК Список Текст Маркированный6"/>
     <w:basedOn w:val="afd"/>
     <w:uiPriority w:val="99"/>
@@ -18120,12 +18522,12 @@
       </w:numPr>
     </w:pPr>
   </w:style>
-  <w:style w:type="numbering" w:customStyle="1" w:styleId="1f3">
+  <w:style w:type="numbering" w:customStyle="1" w:styleId="1f2">
     <w:name w:val="ПРИЛОЖЕНИЕ1"/>
     <w:uiPriority w:val="99"/>
     <w:rsid w:val="00D76C1B"/>
   </w:style>
-  <w:style w:type="numbering" w:customStyle="1" w:styleId="1f4">
+  <w:style w:type="numbering" w:customStyle="1" w:styleId="1f3">
     <w:name w:val="Приложение1"/>
     <w:uiPriority w:val="99"/>
     <w:rsid w:val="00D76C1B"/>
@@ -18359,7 +18761,7 @@
   <w:style w:type="paragraph" w:customStyle="1" w:styleId="13">
     <w:name w:val="Обычный1"/>
     <w:basedOn w:val="af"/>
-    <w:link w:val="1f5"/>
+    <w:link w:val="1f4"/>
     <w:qFormat/>
     <w:rsid w:val="00537D18"/>
     <w:pPr>
@@ -18370,7 +18772,7 @@
       <w:snapToGrid w:val="0"/>
     </w:rPr>
   </w:style>
-  <w:style w:type="character" w:customStyle="1" w:styleId="1f5">
+  <w:style w:type="character" w:customStyle="1" w:styleId="1f4">
     <w:name w:val="Обычный1 Знак"/>
     <w:basedOn w:val="af0"/>
     <w:link w:val="13"/>
@@ -18464,7 +18866,7 @@
     </w:rPr>
     <w:tblPr/>
   </w:style>
-  <w:style w:type="paragraph" w:customStyle="1" w:styleId="1f6">
+  <w:style w:type="paragraph" w:customStyle="1" w:styleId="1f5">
     <w:name w:val="ЮИ_Заголовок_1"/>
     <w:basedOn w:val="af"/>
     <w:next w:val="af"/>

</xml_diff>

<commit_message>
fix title_page, added preambule.md
</commit_message>
<xml_diff>
--- a/templates/title_page.docx
+++ b/templates/title_page.docx
@@ -4057,7 +4057,7 @@
     </w:tbl>
     <w:p>
       <w:pPr>
-        <w:pStyle w:val="1f5"/>
+        <w:pStyle w:val="1f6"/>
         <w:rPr>
           <w:lang w:val="ru-RU"/>
         </w:rPr>
@@ -4251,10 +4251,6 @@
     <w:p>
       <w:pPr>
         <w:pStyle w:val="afffff1"/>
-        <w:numPr>
-          <w:ilvl w:val="0"/>
-          <w:numId w:val="0"/>
-        </w:numPr>
         <w:rPr>
           <w:lang w:val="ru-RU"/>
         </w:rPr>
@@ -4494,11 +4490,15 @@
     </w:p>
     <w:p>
       <w:pPr>
-        <w:pStyle w:val="12"/>
+        <w:pStyle w:val="14"/>
       </w:pPr>
       <w:bookmarkStart w:id="0" w:name="X6df0dc407ac9d0d35d77f3b02cf3de2e76409b0"/>
       <w:r>
         <w:lastRenderedPageBreak/>
+        <w:t>1</w:t>
+      </w:r>
+      <w:r>
+        <w:tab/>
         <w:t>Климатические условия проведения испытаний</w:t>
       </w:r>
     </w:p>
@@ -4560,11 +4560,15 @@
     </w:p>
     <w:p>
       <w:pPr>
-        <w:pStyle w:val="12"/>
+        <w:pStyle w:val="14"/>
       </w:pPr>
       <w:bookmarkStart w:id="1" w:name="основные-технические-данные"/>
       <w:bookmarkEnd w:id="0"/>
       <w:r>
+        <w:t>2</w:t>
+      </w:r>
+      <w:r>
+        <w:tab/>
         <w:t>Основные технические данные устройств</w:t>
       </w:r>
     </w:p>
@@ -5298,13 +5302,17 @@
     </w:tbl>
     <w:p>
       <w:pPr>
-        <w:pStyle w:val="12"/>
+        <w:pStyle w:val="14"/>
       </w:pPr>
       <w:bookmarkStart w:id="7" w:name="дополнительные-сведения"/>
       <w:bookmarkEnd w:id="4"/>
       <w:bookmarkEnd w:id="5"/>
       <w:bookmarkEnd w:id="6"/>
       <w:r>
+        <w:t>3</w:t>
+      </w:r>
+      <w:r>
+        <w:tab/>
         <w:t>Дополнительные сведения</w:t>
       </w:r>
     </w:p>
@@ -5343,11 +5351,15 @@
     </w:p>
     <w:p>
       <w:pPr>
-        <w:pStyle w:val="12"/>
+        <w:pStyle w:val="14"/>
       </w:pPr>
       <w:bookmarkStart w:id="8" w:name="уставки-и-конфигурация"/>
       <w:bookmarkEnd w:id="7"/>
       <w:r>
+        <w:t>4</w:t>
+      </w:r>
+      <w:r>
+        <w:tab/>
         <w:t>Уставки и конфигурация</w:t>
       </w:r>
     </w:p>
@@ -5445,11 +5457,15 @@
     </w:p>
     <w:p>
       <w:pPr>
-        <w:pStyle w:val="12"/>
+        <w:pStyle w:val="14"/>
       </w:pPr>
       <w:bookmarkStart w:id="9" w:name="внешний-осмотр"/>
       <w:bookmarkEnd w:id="8"/>
       <w:r>
+        <w:t>5</w:t>
+      </w:r>
+      <w:r>
+        <w:tab/>
         <w:t>Внешний осмотр</w:t>
       </w:r>
     </w:p>
@@ -5722,11 +5738,15 @@
     </w:p>
     <w:p>
       <w:pPr>
-        <w:pStyle w:val="12"/>
+        <w:pStyle w:val="14"/>
       </w:pPr>
       <w:bookmarkStart w:id="10" w:name="X0e50c966c55b2f6f4209c430f930650427220e2"/>
       <w:bookmarkEnd w:id="9"/>
       <w:r>
+        <w:t>6</w:t>
+      </w:r>
+      <w:r>
+        <w:tab/>
         <w:t xml:space="preserve">Проверка конфигурирования и </w:t>
       </w:r>
       <w:proofErr w:type="spellStart"/>
@@ -5825,9 +5845,13 @@
     </w:p>
     <w:p>
       <w:pPr>
-        <w:pStyle w:val="12"/>
-      </w:pPr>
-      <w:r>
+        <w:pStyle w:val="14"/>
+      </w:pPr>
+      <w:r>
+        <w:t>7</w:t>
+      </w:r>
+      <w:r>
+        <w:tab/>
         <w:t>Проверка состояния изоляции</w:t>
       </w:r>
     </w:p>
@@ -5837,6 +5861,10 @@
       </w:pPr>
       <w:bookmarkStart w:id="12" w:name="X9687952bc1d30db593d75bc5681b56e0d46ca55"/>
       <w:r>
+        <w:t>7.1</w:t>
+      </w:r>
+      <w:r>
+        <w:tab/>
         <w:t xml:space="preserve">Измерение сопротивления изоляции </w:t>
       </w:r>
       <w:r>
@@ -6172,6 +6200,10 @@
         <w:pStyle w:val="22"/>
       </w:pPr>
       <w:r>
+        <w:t>7.2</w:t>
+      </w:r>
+      <w:r>
+        <w:tab/>
         <w:t>Измерение сопротивления изоляции шкафа с подключенными внешними цепями</w:t>
       </w:r>
     </w:p>
@@ -6482,13 +6514,17 @@
     </w:tbl>
     <w:p>
       <w:pPr>
-        <w:pStyle w:val="12"/>
+        <w:pStyle w:val="14"/>
       </w:pPr>
       <w:bookmarkStart w:id="16" w:name="X242d87850b64568d08d7180295cac2ddaededb8"/>
       <w:bookmarkEnd w:id="13"/>
       <w:bookmarkEnd w:id="14"/>
       <w:bookmarkEnd w:id="15"/>
       <w:r>
+        <w:t>8</w:t>
+      </w:r>
+      <w:r>
+        <w:tab/>
         <w:t>Проверка на соответствие проектным решениям</w:t>
       </w:r>
     </w:p>
@@ -6538,9 +6574,13 @@
     </w:p>
     <w:p>
       <w:pPr>
-        <w:pStyle w:val="12"/>
-      </w:pPr>
-      <w:r>
+        <w:pStyle w:val="14"/>
+      </w:pPr>
+      <w:r>
+        <w:t>9</w:t>
+      </w:r>
+      <w:r>
+        <w:tab/>
         <w:t>Задание требуемой конфигурации, уставок и режимов работы (</w:t>
       </w:r>
       <w:proofErr w:type="spellStart"/>
@@ -6649,6 +6689,7 @@
       </w:r>
       <w:bookmarkEnd w:id="17"/>
     </w:p>
+    <w:p/>
     <w:sectPr>
       <w:pgSz w:w="11907" w:h="16839" w:code="9"/>
       <w:pgMar w:top="567" w:right="567" w:bottom="567" w:left="1418" w:header="227" w:footer="227" w:gutter="0"/>
@@ -8157,95 +8198,6 @@
     </w:lvl>
   </w:abstractNum>
   <w:abstractNum w:abstractNumId="5" w15:restartNumberingAfterBreak="0">
-    <w:nsid w:val="06EB1B77"/>
-    <w:multiLevelType w:val="hybridMultilevel"/>
-    <w:tmpl w:val="347E0C6A"/>
-    <w:lvl w:ilvl="0" w:tplc="680C28DA">
-      <w:start w:val="1"/>
-      <w:numFmt w:val="decimal"/>
-      <w:lvlText w:val="%1"/>
-      <w:lvlJc w:val="left"/>
-      <w:pPr>
-        <w:ind w:left="720" w:hanging="360"/>
-      </w:pPr>
-      <w:rPr>
-        <w:rFonts w:hint="default"/>
-      </w:rPr>
-    </w:lvl>
-    <w:lvl w:ilvl="1" w:tplc="04190019" w:tentative="1">
-      <w:start w:val="1"/>
-      <w:numFmt w:val="lowerLetter"/>
-      <w:lvlText w:val="%2."/>
-      <w:lvlJc w:val="left"/>
-      <w:pPr>
-        <w:ind w:left="1440" w:hanging="360"/>
-      </w:pPr>
-    </w:lvl>
-    <w:lvl w:ilvl="2" w:tplc="0419001B" w:tentative="1">
-      <w:start w:val="1"/>
-      <w:numFmt w:val="lowerRoman"/>
-      <w:lvlText w:val="%3."/>
-      <w:lvlJc w:val="right"/>
-      <w:pPr>
-        <w:ind w:left="2160" w:hanging="180"/>
-      </w:pPr>
-    </w:lvl>
-    <w:lvl w:ilvl="3" w:tplc="0419000F" w:tentative="1">
-      <w:start w:val="1"/>
-      <w:numFmt w:val="decimal"/>
-      <w:lvlText w:val="%4."/>
-      <w:lvlJc w:val="left"/>
-      <w:pPr>
-        <w:ind w:left="2880" w:hanging="360"/>
-      </w:pPr>
-    </w:lvl>
-    <w:lvl w:ilvl="4" w:tplc="04190019" w:tentative="1">
-      <w:start w:val="1"/>
-      <w:numFmt w:val="lowerLetter"/>
-      <w:lvlText w:val="%5."/>
-      <w:lvlJc w:val="left"/>
-      <w:pPr>
-        <w:ind w:left="3600" w:hanging="360"/>
-      </w:pPr>
-    </w:lvl>
-    <w:lvl w:ilvl="5" w:tplc="0419001B" w:tentative="1">
-      <w:start w:val="1"/>
-      <w:numFmt w:val="lowerRoman"/>
-      <w:lvlText w:val="%6."/>
-      <w:lvlJc w:val="right"/>
-      <w:pPr>
-        <w:ind w:left="4320" w:hanging="180"/>
-      </w:pPr>
-    </w:lvl>
-    <w:lvl w:ilvl="6" w:tplc="0419000F" w:tentative="1">
-      <w:start w:val="1"/>
-      <w:numFmt w:val="decimal"/>
-      <w:lvlText w:val="%7."/>
-      <w:lvlJc w:val="left"/>
-      <w:pPr>
-        <w:ind w:left="5040" w:hanging="360"/>
-      </w:pPr>
-    </w:lvl>
-    <w:lvl w:ilvl="7" w:tplc="04190019" w:tentative="1">
-      <w:start w:val="1"/>
-      <w:numFmt w:val="lowerLetter"/>
-      <w:lvlText w:val="%8."/>
-      <w:lvlJc w:val="left"/>
-      <w:pPr>
-        <w:ind w:left="5760" w:hanging="360"/>
-      </w:pPr>
-    </w:lvl>
-    <w:lvl w:ilvl="8" w:tplc="0419001B" w:tentative="1">
-      <w:start w:val="1"/>
-      <w:numFmt w:val="lowerRoman"/>
-      <w:lvlText w:val="%9."/>
-      <w:lvlJc w:val="right"/>
-      <w:pPr>
-        <w:ind w:left="6480" w:hanging="180"/>
-      </w:pPr>
-    </w:lvl>
-  </w:abstractNum>
-  <w:abstractNum w:abstractNumId="6" w15:restartNumberingAfterBreak="0">
     <w:nsid w:val="0B5B4EDF"/>
     <w:multiLevelType w:val="hybridMultilevel"/>
     <w:tmpl w:val="9C90D258"/>
@@ -8333,7 +8285,7 @@
       </w:pPr>
     </w:lvl>
   </w:abstractNum>
-  <w:abstractNum w:abstractNumId="7" w15:restartNumberingAfterBreak="0">
+  <w:abstractNum w:abstractNumId="6" w15:restartNumberingAfterBreak="0">
     <w:nsid w:val="0B6C6D48"/>
     <w:multiLevelType w:val="hybridMultilevel"/>
     <w:tmpl w:val="78DCF446"/>
@@ -8448,7 +8400,7 @@
       </w:rPr>
     </w:lvl>
   </w:abstractNum>
-  <w:abstractNum w:abstractNumId="8" w15:restartNumberingAfterBreak="0">
+  <w:abstractNum w:abstractNumId="7" w15:restartNumberingAfterBreak="0">
     <w:nsid w:val="0EEF1815"/>
     <w:multiLevelType w:val="hybridMultilevel"/>
     <w:tmpl w:val="55A8637A"/>
@@ -8538,7 +8490,7 @@
       </w:pPr>
     </w:lvl>
   </w:abstractNum>
-  <w:abstractNum w:abstractNumId="9" w15:restartNumberingAfterBreak="0">
+  <w:abstractNum w:abstractNumId="8" w15:restartNumberingAfterBreak="0">
     <w:nsid w:val="19352F2E"/>
     <w:multiLevelType w:val="hybridMultilevel"/>
     <w:tmpl w:val="55A8637A"/>
@@ -8628,7 +8580,7 @@
       </w:pPr>
     </w:lvl>
   </w:abstractNum>
-  <w:abstractNum w:abstractNumId="10" w15:restartNumberingAfterBreak="0">
+  <w:abstractNum w:abstractNumId="9" w15:restartNumberingAfterBreak="0">
     <w:nsid w:val="1B6E0CFC"/>
     <w:multiLevelType w:val="multilevel"/>
     <w:tmpl w:val="8A6273DA"/>
@@ -8753,7 +8705,7 @@
       </w:rPr>
     </w:lvl>
   </w:abstractNum>
-  <w:abstractNum w:abstractNumId="11" w15:restartNumberingAfterBreak="0">
+  <w:abstractNum w:abstractNumId="10" w15:restartNumberingAfterBreak="0">
     <w:nsid w:val="1C4D6F6B"/>
     <w:multiLevelType w:val="multilevel"/>
     <w:tmpl w:val="0419001D"/>
@@ -8869,7 +8821,7 @@
       </w:rPr>
     </w:lvl>
   </w:abstractNum>
-  <w:abstractNum w:abstractNumId="12" w15:restartNumberingAfterBreak="0">
+  <w:abstractNum w:abstractNumId="11" w15:restartNumberingAfterBreak="0">
     <w:nsid w:val="228D3DFB"/>
     <w:multiLevelType w:val="hybridMultilevel"/>
     <w:tmpl w:val="ECFC4378"/>
@@ -8957,7 +8909,7 @@
       </w:pPr>
     </w:lvl>
   </w:abstractNum>
-  <w:abstractNum w:abstractNumId="13" w15:restartNumberingAfterBreak="0">
+  <w:abstractNum w:abstractNumId="12" w15:restartNumberingAfterBreak="0">
     <w:nsid w:val="234A0748"/>
     <w:multiLevelType w:val="hybridMultilevel"/>
     <w:tmpl w:val="40C2D860"/>
@@ -9048,7 +9000,7 @@
       </w:pPr>
     </w:lvl>
   </w:abstractNum>
-  <w:abstractNum w:abstractNumId="14" w15:restartNumberingAfterBreak="0">
+  <w:abstractNum w:abstractNumId="13" w15:restartNumberingAfterBreak="0">
     <w:nsid w:val="26750966"/>
     <w:multiLevelType w:val="multilevel"/>
     <w:tmpl w:val="9F5ADA7C"/>
@@ -9180,7 +9132,7 @@
       </w:rPr>
     </w:lvl>
   </w:abstractNum>
-  <w:abstractNum w:abstractNumId="15" w15:restartNumberingAfterBreak="0">
+  <w:abstractNum w:abstractNumId="14" w15:restartNumberingAfterBreak="0">
     <w:nsid w:val="272A29AD"/>
     <w:multiLevelType w:val="hybridMultilevel"/>
     <w:tmpl w:val="E7322A34"/>
@@ -9292,7 +9244,7 @@
       </w:rPr>
     </w:lvl>
   </w:abstractNum>
-  <w:abstractNum w:abstractNumId="16" w15:restartNumberingAfterBreak="0">
+  <w:abstractNum w:abstractNumId="15" w15:restartNumberingAfterBreak="0">
     <w:nsid w:val="274423DD"/>
     <w:multiLevelType w:val="hybridMultilevel"/>
     <w:tmpl w:val="1CFC491A"/>
@@ -9405,7 +9357,7 @@
       </w:rPr>
     </w:lvl>
   </w:abstractNum>
-  <w:abstractNum w:abstractNumId="17" w15:restartNumberingAfterBreak="0">
+  <w:abstractNum w:abstractNumId="16" w15:restartNumberingAfterBreak="0">
     <w:nsid w:val="277C019C"/>
     <w:multiLevelType w:val="multilevel"/>
     <w:tmpl w:val="3050EF66"/>
@@ -9654,93 +9606,7 @@
       </w:rPr>
     </w:lvl>
   </w:abstractNum>
-  <w:abstractNum w:abstractNumId="18" w15:restartNumberingAfterBreak="0">
-    <w:nsid w:val="2C6302E2"/>
-    <w:multiLevelType w:val="multilevel"/>
-    <w:tmpl w:val="0419001D"/>
-    <w:lvl w:ilvl="0">
-      <w:start w:val="1"/>
-      <w:numFmt w:val="decimal"/>
-      <w:lvlText w:val="%1)"/>
-      <w:lvlJc w:val="left"/>
-      <w:pPr>
-        <w:ind w:left="360" w:hanging="360"/>
-      </w:pPr>
-    </w:lvl>
-    <w:lvl w:ilvl="1">
-      <w:start w:val="1"/>
-      <w:numFmt w:val="lowerLetter"/>
-      <w:lvlText w:val="%2)"/>
-      <w:lvlJc w:val="left"/>
-      <w:pPr>
-        <w:ind w:left="720" w:hanging="360"/>
-      </w:pPr>
-    </w:lvl>
-    <w:lvl w:ilvl="2">
-      <w:start w:val="1"/>
-      <w:numFmt w:val="lowerRoman"/>
-      <w:lvlText w:val="%3)"/>
-      <w:lvlJc w:val="left"/>
-      <w:pPr>
-        <w:ind w:left="1080" w:hanging="360"/>
-      </w:pPr>
-    </w:lvl>
-    <w:lvl w:ilvl="3">
-      <w:start w:val="1"/>
-      <w:numFmt w:val="decimal"/>
-      <w:lvlText w:val="(%4)"/>
-      <w:lvlJc w:val="left"/>
-      <w:pPr>
-        <w:ind w:left="1440" w:hanging="360"/>
-      </w:pPr>
-    </w:lvl>
-    <w:lvl w:ilvl="4">
-      <w:start w:val="1"/>
-      <w:numFmt w:val="lowerLetter"/>
-      <w:lvlText w:val="(%5)"/>
-      <w:lvlJc w:val="left"/>
-      <w:pPr>
-        <w:ind w:left="1800" w:hanging="360"/>
-      </w:pPr>
-    </w:lvl>
-    <w:lvl w:ilvl="5">
-      <w:start w:val="1"/>
-      <w:numFmt w:val="lowerRoman"/>
-      <w:lvlText w:val="(%6)"/>
-      <w:lvlJc w:val="left"/>
-      <w:pPr>
-        <w:ind w:left="2160" w:hanging="360"/>
-      </w:pPr>
-    </w:lvl>
-    <w:lvl w:ilvl="6">
-      <w:start w:val="1"/>
-      <w:numFmt w:val="decimal"/>
-      <w:lvlText w:val="%7."/>
-      <w:lvlJc w:val="left"/>
-      <w:pPr>
-        <w:ind w:left="2520" w:hanging="360"/>
-      </w:pPr>
-    </w:lvl>
-    <w:lvl w:ilvl="7">
-      <w:start w:val="1"/>
-      <w:numFmt w:val="lowerLetter"/>
-      <w:lvlText w:val="%8."/>
-      <w:lvlJc w:val="left"/>
-      <w:pPr>
-        <w:ind w:left="2880" w:hanging="360"/>
-      </w:pPr>
-    </w:lvl>
-    <w:lvl w:ilvl="8">
-      <w:start w:val="1"/>
-      <w:numFmt w:val="lowerRoman"/>
-      <w:lvlText w:val="%9."/>
-      <w:lvlJc w:val="left"/>
-      <w:pPr>
-        <w:ind w:left="3240" w:hanging="360"/>
-      </w:pPr>
-    </w:lvl>
-  </w:abstractNum>
-  <w:abstractNum w:abstractNumId="19" w15:restartNumberingAfterBreak="0">
+  <w:abstractNum w:abstractNumId="17" w15:restartNumberingAfterBreak="0">
     <w:nsid w:val="2E744211"/>
     <w:multiLevelType w:val="multilevel"/>
     <w:tmpl w:val="D47AFD2E"/>
@@ -9950,7 +9816,7 @@
       </w:pPr>
     </w:lvl>
   </w:abstractNum>
-  <w:abstractNum w:abstractNumId="20" w15:restartNumberingAfterBreak="0">
+  <w:abstractNum w:abstractNumId="18" w15:restartNumberingAfterBreak="0">
     <w:nsid w:val="30C070CE"/>
     <w:multiLevelType w:val="multilevel"/>
     <w:tmpl w:val="60AE836C"/>
@@ -10227,7 +10093,7 @@
       </w:rPr>
     </w:lvl>
   </w:abstractNum>
-  <w:abstractNum w:abstractNumId="21" w15:restartNumberingAfterBreak="0">
+  <w:abstractNum w:abstractNumId="19" w15:restartNumberingAfterBreak="0">
     <w:nsid w:val="3363183B"/>
     <w:multiLevelType w:val="hybridMultilevel"/>
     <w:tmpl w:val="77F6A802"/>
@@ -10313,105 +10179,7 @@
       </w:pPr>
     </w:lvl>
   </w:abstractNum>
-  <w:abstractNum w:abstractNumId="22" w15:restartNumberingAfterBreak="0">
-    <w:nsid w:val="33CE1A7C"/>
-    <w:multiLevelType w:val="multilevel"/>
-    <w:tmpl w:val="04190025"/>
-    <w:lvl w:ilvl="0">
-      <w:start w:val="1"/>
-      <w:numFmt w:val="decimal"/>
-      <w:pStyle w:val="12"/>
-      <w:lvlText w:val="%1"/>
-      <w:lvlJc w:val="left"/>
-      <w:pPr>
-        <w:ind w:left="432" w:hanging="432"/>
-      </w:pPr>
-      <w:rPr>
-        <w:rFonts w:hint="default"/>
-      </w:rPr>
-    </w:lvl>
-    <w:lvl w:ilvl="1">
-      <w:start w:val="1"/>
-      <w:numFmt w:val="decimal"/>
-      <w:pStyle w:val="22"/>
-      <w:lvlText w:val="%1.%2"/>
-      <w:lvlJc w:val="left"/>
-      <w:pPr>
-        <w:ind w:left="576" w:hanging="576"/>
-      </w:pPr>
-    </w:lvl>
-    <w:lvl w:ilvl="2">
-      <w:start w:val="1"/>
-      <w:numFmt w:val="decimal"/>
-      <w:pStyle w:val="31"/>
-      <w:lvlText w:val="%1.%2.%3"/>
-      <w:lvlJc w:val="left"/>
-      <w:pPr>
-        <w:ind w:left="720" w:hanging="720"/>
-      </w:pPr>
-    </w:lvl>
-    <w:lvl w:ilvl="3">
-      <w:start w:val="1"/>
-      <w:numFmt w:val="decimal"/>
-      <w:pStyle w:val="40"/>
-      <w:lvlText w:val="%1.%2.%3.%4"/>
-      <w:lvlJc w:val="left"/>
-      <w:pPr>
-        <w:ind w:left="864" w:hanging="864"/>
-      </w:pPr>
-    </w:lvl>
-    <w:lvl w:ilvl="4">
-      <w:start w:val="1"/>
-      <w:numFmt w:val="decimal"/>
-      <w:pStyle w:val="50"/>
-      <w:lvlText w:val="%1.%2.%3.%4.%5"/>
-      <w:lvlJc w:val="left"/>
-      <w:pPr>
-        <w:ind w:left="1008" w:hanging="1008"/>
-      </w:pPr>
-    </w:lvl>
-    <w:lvl w:ilvl="5">
-      <w:start w:val="1"/>
-      <w:numFmt w:val="decimal"/>
-      <w:pStyle w:val="6"/>
-      <w:lvlText w:val="%1.%2.%3.%4.%5.%6"/>
-      <w:lvlJc w:val="left"/>
-      <w:pPr>
-        <w:ind w:left="1152" w:hanging="1152"/>
-      </w:pPr>
-    </w:lvl>
-    <w:lvl w:ilvl="6">
-      <w:start w:val="1"/>
-      <w:numFmt w:val="decimal"/>
-      <w:pStyle w:val="7"/>
-      <w:lvlText w:val="%1.%2.%3.%4.%5.%6.%7"/>
-      <w:lvlJc w:val="left"/>
-      <w:pPr>
-        <w:ind w:left="1296" w:hanging="1296"/>
-      </w:pPr>
-    </w:lvl>
-    <w:lvl w:ilvl="7">
-      <w:start w:val="1"/>
-      <w:numFmt w:val="decimal"/>
-      <w:pStyle w:val="8"/>
-      <w:lvlText w:val="%1.%2.%3.%4.%5.%6.%7.%8"/>
-      <w:lvlJc w:val="left"/>
-      <w:pPr>
-        <w:ind w:left="1440" w:hanging="1440"/>
-      </w:pPr>
-    </w:lvl>
-    <w:lvl w:ilvl="8">
-      <w:start w:val="1"/>
-      <w:numFmt w:val="decimal"/>
-      <w:pStyle w:val="9"/>
-      <w:lvlText w:val="%1.%2.%3.%4.%5.%6.%7.%8.%9"/>
-      <w:lvlJc w:val="left"/>
-      <w:pPr>
-        <w:ind w:left="1584" w:hanging="1584"/>
-      </w:pPr>
-    </w:lvl>
-  </w:abstractNum>
-  <w:abstractNum w:abstractNumId="23" w15:restartNumberingAfterBreak="0">
+  <w:abstractNum w:abstractNumId="20" w15:restartNumberingAfterBreak="0">
     <w:nsid w:val="349329F9"/>
     <w:multiLevelType w:val="multilevel"/>
     <w:tmpl w:val="5770D028"/>
@@ -10502,7 +10270,7 @@
       </w:pPr>
     </w:lvl>
   </w:abstractNum>
-  <w:abstractNum w:abstractNumId="24" w15:restartNumberingAfterBreak="0">
+  <w:abstractNum w:abstractNumId="21" w15:restartNumberingAfterBreak="0">
     <w:nsid w:val="34DB61DB"/>
     <w:multiLevelType w:val="multilevel"/>
     <w:tmpl w:val="E1A2C20A"/>
@@ -10593,7 +10361,7 @@
       </w:pPr>
     </w:lvl>
   </w:abstractNum>
-  <w:abstractNum w:abstractNumId="25" w15:restartNumberingAfterBreak="0">
+  <w:abstractNum w:abstractNumId="22" w15:restartNumberingAfterBreak="0">
     <w:nsid w:val="37601EE1"/>
     <w:multiLevelType w:val="hybridMultilevel"/>
     <w:tmpl w:val="C7D24832"/>
@@ -10685,7 +10453,7 @@
       </w:pPr>
     </w:lvl>
   </w:abstractNum>
-  <w:abstractNum w:abstractNumId="26" w15:restartNumberingAfterBreak="0">
+  <w:abstractNum w:abstractNumId="23" w15:restartNumberingAfterBreak="0">
     <w:nsid w:val="37782466"/>
     <w:multiLevelType w:val="hybridMultilevel"/>
     <w:tmpl w:val="55A8637A"/>
@@ -10775,11 +10543,11 @@
       </w:pPr>
     </w:lvl>
   </w:abstractNum>
-  <w:abstractNum w:abstractNumId="27" w15:restartNumberingAfterBreak="0">
+  <w:abstractNum w:abstractNumId="24" w15:restartNumberingAfterBreak="0">
     <w:nsid w:val="38654138"/>
     <w:multiLevelType w:val="multilevel"/>
     <w:tmpl w:val="AA96CC38"/>
-    <w:styleLink w:val="60"/>
+    <w:styleLink w:val="6"/>
     <w:lvl w:ilvl="0">
       <w:start w:val="1"/>
       <w:numFmt w:val="decimal"/>
@@ -10910,7 +10678,7 @@
       </w:rPr>
     </w:lvl>
   </w:abstractNum>
-  <w:abstractNum w:abstractNumId="28" w15:restartNumberingAfterBreak="0">
+  <w:abstractNum w:abstractNumId="25" w15:restartNumberingAfterBreak="0">
     <w:nsid w:val="3A806FE2"/>
     <w:multiLevelType w:val="hybridMultilevel"/>
     <w:tmpl w:val="55A8637A"/>
@@ -11000,7 +10768,7 @@
       </w:pPr>
     </w:lvl>
   </w:abstractNum>
-  <w:abstractNum w:abstractNumId="29" w15:restartNumberingAfterBreak="0">
+  <w:abstractNum w:abstractNumId="26" w15:restartNumberingAfterBreak="0">
     <w:nsid w:val="3F9B6C2E"/>
     <w:multiLevelType w:val="hybridMultilevel"/>
     <w:tmpl w:val="55A8637A"/>
@@ -11090,7 +10858,7 @@
       </w:pPr>
     </w:lvl>
   </w:abstractNum>
-  <w:abstractNum w:abstractNumId="30" w15:restartNumberingAfterBreak="0">
+  <w:abstractNum w:abstractNumId="27" w15:restartNumberingAfterBreak="0">
     <w:nsid w:val="41CF6D96"/>
     <w:multiLevelType w:val="hybridMultilevel"/>
     <w:tmpl w:val="55A8637A"/>
@@ -11180,7 +10948,7 @@
       </w:pPr>
     </w:lvl>
   </w:abstractNum>
-  <w:abstractNum w:abstractNumId="31" w15:restartNumberingAfterBreak="0">
+  <w:abstractNum w:abstractNumId="28" w15:restartNumberingAfterBreak="0">
     <w:nsid w:val="42F73AF4"/>
     <w:multiLevelType w:val="hybridMultilevel"/>
     <w:tmpl w:val="55A8637A"/>
@@ -11270,7 +11038,7 @@
       </w:pPr>
     </w:lvl>
   </w:abstractNum>
-  <w:abstractNum w:abstractNumId="32" w15:restartNumberingAfterBreak="0">
+  <w:abstractNum w:abstractNumId="29" w15:restartNumberingAfterBreak="0">
     <w:nsid w:val="459F2701"/>
     <w:multiLevelType w:val="multilevel"/>
     <w:tmpl w:val="A48036AE"/>
@@ -11413,7 +11181,7 @@
       </w:rPr>
     </w:lvl>
   </w:abstractNum>
-  <w:abstractNum w:abstractNumId="33" w15:restartNumberingAfterBreak="0">
+  <w:abstractNum w:abstractNumId="30" w15:restartNumberingAfterBreak="0">
     <w:nsid w:val="4AE45126"/>
     <w:multiLevelType w:val="multilevel"/>
     <w:tmpl w:val="7E8E8020"/>
@@ -11555,7 +11323,7 @@
       </w:rPr>
     </w:lvl>
   </w:abstractNum>
-  <w:abstractNum w:abstractNumId="34" w15:restartNumberingAfterBreak="0">
+  <w:abstractNum w:abstractNumId="31" w15:restartNumberingAfterBreak="0">
     <w:nsid w:val="4F012B3F"/>
     <w:multiLevelType w:val="hybridMultilevel"/>
     <w:tmpl w:val="55A8637A"/>
@@ -11645,11 +11413,11 @@
       </w:pPr>
     </w:lvl>
   </w:abstractNum>
-  <w:abstractNum w:abstractNumId="35" w15:restartNumberingAfterBreak="0">
+  <w:abstractNum w:abstractNumId="32" w15:restartNumberingAfterBreak="0">
     <w:nsid w:val="53BE5BDD"/>
     <w:multiLevelType w:val="multilevel"/>
     <w:tmpl w:val="763A0C4E"/>
-    <w:styleLink w:val="41"/>
+    <w:styleLink w:val="40"/>
     <w:lvl w:ilvl="0">
       <w:start w:val="1"/>
       <w:numFmt w:val="bullet"/>
@@ -11778,7 +11546,7 @@
       </w:rPr>
     </w:lvl>
   </w:abstractNum>
-  <w:abstractNum w:abstractNumId="36" w15:restartNumberingAfterBreak="0">
+  <w:abstractNum w:abstractNumId="33" w15:restartNumberingAfterBreak="0">
     <w:nsid w:val="543F35AD"/>
     <w:multiLevelType w:val="multilevel"/>
     <w:tmpl w:val="051ED0C4"/>
@@ -11869,100 +11637,11 @@
       </w:pPr>
     </w:lvl>
   </w:abstractNum>
-  <w:abstractNum w:abstractNumId="37" w15:restartNumberingAfterBreak="0">
-    <w:nsid w:val="5ACA3F80"/>
-    <w:multiLevelType w:val="multilevel"/>
-    <w:tmpl w:val="04190025"/>
-    <w:lvl w:ilvl="0">
-      <w:start w:val="1"/>
-      <w:numFmt w:val="decimal"/>
-      <w:lvlText w:val="%1"/>
-      <w:lvlJc w:val="left"/>
-      <w:pPr>
-        <w:ind w:left="432" w:hanging="432"/>
-      </w:pPr>
-      <w:rPr>
-        <w:rFonts w:hint="default"/>
-      </w:rPr>
-    </w:lvl>
-    <w:lvl w:ilvl="1">
-      <w:start w:val="1"/>
-      <w:numFmt w:val="decimal"/>
-      <w:lvlText w:val="%1.%2"/>
-      <w:lvlJc w:val="left"/>
-      <w:pPr>
-        <w:ind w:left="576" w:hanging="576"/>
-      </w:pPr>
-    </w:lvl>
-    <w:lvl w:ilvl="2">
-      <w:start w:val="1"/>
-      <w:numFmt w:val="decimal"/>
-      <w:lvlText w:val="%1.%2.%3"/>
-      <w:lvlJc w:val="left"/>
-      <w:pPr>
-        <w:ind w:left="720" w:hanging="720"/>
-      </w:pPr>
-    </w:lvl>
-    <w:lvl w:ilvl="3">
-      <w:start w:val="1"/>
-      <w:numFmt w:val="decimal"/>
-      <w:lvlText w:val="%1.%2.%3.%4"/>
-      <w:lvlJc w:val="left"/>
-      <w:pPr>
-        <w:ind w:left="864" w:hanging="864"/>
-      </w:pPr>
-    </w:lvl>
-    <w:lvl w:ilvl="4">
-      <w:start w:val="1"/>
-      <w:numFmt w:val="decimal"/>
-      <w:lvlText w:val="%1.%2.%3.%4.%5"/>
-      <w:lvlJc w:val="left"/>
-      <w:pPr>
-        <w:ind w:left="1008" w:hanging="1008"/>
-      </w:pPr>
-    </w:lvl>
-    <w:lvl w:ilvl="5">
-      <w:start w:val="1"/>
-      <w:numFmt w:val="decimal"/>
-      <w:lvlText w:val="%1.%2.%3.%4.%5.%6"/>
-      <w:lvlJc w:val="left"/>
-      <w:pPr>
-        <w:ind w:left="1152" w:hanging="1152"/>
-      </w:pPr>
-    </w:lvl>
-    <w:lvl w:ilvl="6">
-      <w:start w:val="1"/>
-      <w:numFmt w:val="decimal"/>
-      <w:lvlText w:val="%1.%2.%3.%4.%5.%6.%7"/>
-      <w:lvlJc w:val="left"/>
-      <w:pPr>
-        <w:ind w:left="1296" w:hanging="1296"/>
-      </w:pPr>
-    </w:lvl>
-    <w:lvl w:ilvl="7">
-      <w:start w:val="1"/>
-      <w:numFmt w:val="decimal"/>
-      <w:lvlText w:val="%1.%2.%3.%4.%5.%6.%7.%8"/>
-      <w:lvlJc w:val="left"/>
-      <w:pPr>
-        <w:ind w:left="1440" w:hanging="1440"/>
-      </w:pPr>
-    </w:lvl>
-    <w:lvl w:ilvl="8">
-      <w:start w:val="1"/>
-      <w:numFmt w:val="decimal"/>
-      <w:lvlText w:val="%1.%2.%3.%4.%5.%6.%7.%8.%9"/>
-      <w:lvlJc w:val="left"/>
-      <w:pPr>
-        <w:ind w:left="1584" w:hanging="1584"/>
-      </w:pPr>
-    </w:lvl>
-  </w:abstractNum>
-  <w:abstractNum w:abstractNumId="38" w15:restartNumberingAfterBreak="0">
+  <w:abstractNum w:abstractNumId="34" w15:restartNumberingAfterBreak="0">
     <w:nsid w:val="65D74793"/>
     <w:multiLevelType w:val="multilevel"/>
     <w:tmpl w:val="E0A0DCC2"/>
-    <w:styleLink w:val="120"/>
+    <w:styleLink w:val="12"/>
     <w:lvl w:ilvl="0">
       <w:start w:val="1"/>
       <w:numFmt w:val="decimal"/>
@@ -12049,7 +11728,7 @@
       </w:pPr>
     </w:lvl>
   </w:abstractNum>
-  <w:abstractNum w:abstractNumId="39" w15:restartNumberingAfterBreak="0">
+  <w:abstractNum w:abstractNumId="35" w15:restartNumberingAfterBreak="0">
     <w:nsid w:val="67631314"/>
     <w:multiLevelType w:val="hybridMultilevel"/>
     <w:tmpl w:val="55A8637A"/>
@@ -12139,7 +11818,7 @@
       </w:pPr>
     </w:lvl>
   </w:abstractNum>
-  <w:abstractNum w:abstractNumId="40" w15:restartNumberingAfterBreak="0">
+  <w:abstractNum w:abstractNumId="36" w15:restartNumberingAfterBreak="0">
     <w:nsid w:val="689562AF"/>
     <w:multiLevelType w:val="multilevel"/>
     <w:tmpl w:val="4F5E5844"/>
@@ -12244,7 +11923,7 @@
       </w:rPr>
     </w:lvl>
   </w:abstractNum>
-  <w:abstractNum w:abstractNumId="41" w15:restartNumberingAfterBreak="0">
+  <w:abstractNum w:abstractNumId="37" w15:restartNumberingAfterBreak="0">
     <w:nsid w:val="69DF5FAE"/>
     <w:multiLevelType w:val="hybridMultilevel"/>
     <w:tmpl w:val="55A8637A"/>
@@ -12334,7 +12013,7 @@
       </w:pPr>
     </w:lvl>
   </w:abstractNum>
-  <w:abstractNum w:abstractNumId="42" w15:restartNumberingAfterBreak="0">
+  <w:abstractNum w:abstractNumId="38" w15:restartNumberingAfterBreak="0">
     <w:nsid w:val="746926BE"/>
     <w:multiLevelType w:val="hybridMultilevel"/>
     <w:tmpl w:val="55A8637A"/>
@@ -12424,7 +12103,7 @@
       </w:pPr>
     </w:lvl>
   </w:abstractNum>
-  <w:abstractNum w:abstractNumId="43" w15:restartNumberingAfterBreak="0">
+  <w:abstractNum w:abstractNumId="39" w15:restartNumberingAfterBreak="0">
     <w:nsid w:val="74DD0F5E"/>
     <w:multiLevelType w:val="hybridMultilevel"/>
     <w:tmpl w:val="81CC108C"/>
@@ -12537,7 +12216,7 @@
       </w:rPr>
     </w:lvl>
   </w:abstractNum>
-  <w:abstractNum w:abstractNumId="44" w15:restartNumberingAfterBreak="0">
+  <w:abstractNum w:abstractNumId="40" w15:restartNumberingAfterBreak="0">
     <w:nsid w:val="796153C0"/>
     <w:multiLevelType w:val="hybridMultilevel"/>
     <w:tmpl w:val="456CB3DC"/>
@@ -12628,7 +12307,7 @@
       </w:pPr>
     </w:lvl>
   </w:abstractNum>
-  <w:abstractNum w:abstractNumId="45" w15:restartNumberingAfterBreak="0">
+  <w:abstractNum w:abstractNumId="41" w15:restartNumberingAfterBreak="0">
     <w:nsid w:val="79E2341E"/>
     <w:multiLevelType w:val="hybridMultilevel"/>
     <w:tmpl w:val="55A8637A"/>
@@ -12719,25 +12398,25 @@
     </w:lvl>
   </w:abstractNum>
   <w:num w:numId="1" w16cid:durableId="898707020">
-    <w:abstractNumId w:val="10"/>
+    <w:abstractNumId w:val="9"/>
   </w:num>
   <w:num w:numId="2" w16cid:durableId="1770389669">
-    <w:abstractNumId w:val="27"/>
+    <w:abstractNumId w:val="24"/>
   </w:num>
   <w:num w:numId="3" w16cid:durableId="440416075">
-    <w:abstractNumId w:val="35"/>
+    <w:abstractNumId w:val="32"/>
   </w:num>
   <w:num w:numId="4" w16cid:durableId="832531979">
-    <w:abstractNumId w:val="14"/>
+    <w:abstractNumId w:val="13"/>
   </w:num>
   <w:num w:numId="5" w16cid:durableId="1616206315">
-    <w:abstractNumId w:val="32"/>
+    <w:abstractNumId w:val="29"/>
   </w:num>
   <w:num w:numId="6" w16cid:durableId="241379521">
-    <w:abstractNumId w:val="20"/>
+    <w:abstractNumId w:val="18"/>
   </w:num>
   <w:num w:numId="7" w16cid:durableId="1009064325">
-    <w:abstractNumId w:val="7"/>
+    <w:abstractNumId w:val="6"/>
   </w:num>
   <w:num w:numId="8" w16cid:durableId="1343166565">
     <w:abstractNumId w:val="2"/>
@@ -12746,13 +12425,13 @@
     </w:lvlOverride>
   </w:num>
   <w:num w:numId="9" w16cid:durableId="1985620233">
-    <w:abstractNumId w:val="44"/>
+    <w:abstractNumId w:val="40"/>
   </w:num>
   <w:num w:numId="10" w16cid:durableId="1193109343">
-    <w:abstractNumId w:val="11"/>
+    <w:abstractNumId w:val="10"/>
   </w:num>
   <w:num w:numId="11" w16cid:durableId="182060031">
-    <w:abstractNumId w:val="33"/>
+    <w:abstractNumId w:val="30"/>
     <w:lvlOverride w:ilvl="0">
       <w:lvl w:ilvl="0">
         <w:start w:val="1"/>
@@ -12774,7 +12453,7 @@
     </w:lvlOverride>
   </w:num>
   <w:num w:numId="12" w16cid:durableId="1357583848">
-    <w:abstractNumId w:val="17"/>
+    <w:abstractNumId w:val="16"/>
     <w:lvlOverride w:ilvl="0">
       <w:lvl w:ilvl="0">
         <w:start w:val="1"/>
@@ -13037,7 +12716,7 @@
     </w:lvlOverride>
   </w:num>
   <w:num w:numId="13" w16cid:durableId="859322964">
-    <w:abstractNumId w:val="13"/>
+    <w:abstractNumId w:val="12"/>
   </w:num>
   <w:num w:numId="14" w16cid:durableId="715281109">
     <w:abstractNumId w:val="4"/>
@@ -13070,37 +12749,37 @@
     </w:lvlOverride>
   </w:num>
   <w:num w:numId="15" w16cid:durableId="593130490">
-    <w:abstractNumId w:val="19"/>
+    <w:abstractNumId w:val="17"/>
   </w:num>
   <w:num w:numId="16" w16cid:durableId="2018262411">
     <w:abstractNumId w:val="1"/>
   </w:num>
   <w:num w:numId="17" w16cid:durableId="631207072">
-    <w:abstractNumId w:val="12"/>
+    <w:abstractNumId w:val="11"/>
   </w:num>
   <w:num w:numId="18" w16cid:durableId="1030764800">
-    <w:abstractNumId w:val="6"/>
+    <w:abstractNumId w:val="5"/>
   </w:num>
   <w:num w:numId="19" w16cid:durableId="1720126100">
-    <w:abstractNumId w:val="23"/>
+    <w:abstractNumId w:val="20"/>
   </w:num>
   <w:num w:numId="20" w16cid:durableId="737676300">
-    <w:abstractNumId w:val="24"/>
+    <w:abstractNumId w:val="21"/>
   </w:num>
   <w:num w:numId="21" w16cid:durableId="1799834727">
-    <w:abstractNumId w:val="36"/>
+    <w:abstractNumId w:val="33"/>
   </w:num>
   <w:num w:numId="22" w16cid:durableId="613056206">
-    <w:abstractNumId w:val="38"/>
+    <w:abstractNumId w:val="34"/>
   </w:num>
   <w:num w:numId="23" w16cid:durableId="1713378219">
-    <w:abstractNumId w:val="17"/>
+    <w:abstractNumId w:val="16"/>
   </w:num>
   <w:num w:numId="24" w16cid:durableId="146166759">
-    <w:abstractNumId w:val="33"/>
+    <w:abstractNumId w:val="30"/>
   </w:num>
   <w:num w:numId="25" w16cid:durableId="902376188">
-    <w:abstractNumId w:val="20"/>
+    <w:abstractNumId w:val="18"/>
     <w:lvlOverride w:ilvl="0">
       <w:startOverride w:val="1"/>
     </w:lvlOverride>
@@ -13130,7 +12809,7 @@
     </w:lvlOverride>
   </w:num>
   <w:num w:numId="26" w16cid:durableId="920215584">
-    <w:abstractNumId w:val="20"/>
+    <w:abstractNumId w:val="18"/>
     <w:lvlOverride w:ilvl="0">
       <w:startOverride w:val="2"/>
     </w:lvlOverride>
@@ -13160,109 +12839,67 @@
     </w:lvlOverride>
   </w:num>
   <w:num w:numId="27" w16cid:durableId="2141142806">
+    <w:abstractNumId w:val="25"/>
+  </w:num>
+  <w:num w:numId="28" w16cid:durableId="124858556">
+    <w:abstractNumId w:val="7"/>
+  </w:num>
+  <w:num w:numId="29" w16cid:durableId="1223638431">
     <w:abstractNumId w:val="28"/>
   </w:num>
-  <w:num w:numId="28" w16cid:durableId="124858556">
-    <w:abstractNumId w:val="8"/>
-  </w:num>
-  <w:num w:numId="29" w16cid:durableId="1223638431">
-    <w:abstractNumId w:val="31"/>
-  </w:num>
   <w:num w:numId="30" w16cid:durableId="824785319">
-    <w:abstractNumId w:val="39"/>
+    <w:abstractNumId w:val="35"/>
   </w:num>
   <w:num w:numId="31" w16cid:durableId="75783541">
-    <w:abstractNumId w:val="26"/>
+    <w:abstractNumId w:val="23"/>
   </w:num>
   <w:num w:numId="32" w16cid:durableId="1494029657">
     <w:abstractNumId w:val="3"/>
   </w:num>
   <w:num w:numId="33" w16cid:durableId="444814678">
-    <w:abstractNumId w:val="9"/>
+    <w:abstractNumId w:val="8"/>
   </w:num>
   <w:num w:numId="34" w16cid:durableId="1543862904">
-    <w:abstractNumId w:val="30"/>
+    <w:abstractNumId w:val="27"/>
   </w:num>
   <w:num w:numId="35" w16cid:durableId="1560436928">
-    <w:abstractNumId w:val="45"/>
+    <w:abstractNumId w:val="41"/>
   </w:num>
   <w:num w:numId="36" w16cid:durableId="2082675221">
-    <w:abstractNumId w:val="34"/>
+    <w:abstractNumId w:val="31"/>
   </w:num>
   <w:num w:numId="37" w16cid:durableId="1160149076">
-    <w:abstractNumId w:val="29"/>
+    <w:abstractNumId w:val="26"/>
   </w:num>
   <w:num w:numId="38" w16cid:durableId="240452958">
-    <w:abstractNumId w:val="42"/>
+    <w:abstractNumId w:val="38"/>
   </w:num>
   <w:num w:numId="39" w16cid:durableId="689185366">
-    <w:abstractNumId w:val="41"/>
+    <w:abstractNumId w:val="37"/>
   </w:num>
   <w:num w:numId="40" w16cid:durableId="319189690">
     <w:abstractNumId w:val="2"/>
   </w:num>
   <w:num w:numId="41" w16cid:durableId="1968314173">
-    <w:abstractNumId w:val="25"/>
+    <w:abstractNumId w:val="22"/>
   </w:num>
   <w:num w:numId="42" w16cid:durableId="2070573373">
-    <w:abstractNumId w:val="21"/>
+    <w:abstractNumId w:val="19"/>
   </w:num>
   <w:num w:numId="43" w16cid:durableId="1041445229">
-    <w:abstractNumId w:val="43"/>
+    <w:abstractNumId w:val="39"/>
   </w:num>
   <w:num w:numId="44" w16cid:durableId="1172139746">
-    <w:abstractNumId w:val="16"/>
+    <w:abstractNumId w:val="15"/>
   </w:num>
   <w:num w:numId="45" w16cid:durableId="2061784379">
-    <w:abstractNumId w:val="15"/>
+    <w:abstractNumId w:val="14"/>
   </w:num>
   <w:num w:numId="46" w16cid:durableId="2093431927">
     <w:abstractNumId w:val="0"/>
   </w:num>
   <w:num w:numId="47" w16cid:durableId="575482443">
-    <w:abstractNumId w:val="40"/>
-  </w:num>
-  <w:num w:numId="48" w16cid:durableId="1406608562">
-    <w:abstractNumId w:val="5"/>
-  </w:num>
-  <w:num w:numId="49" w16cid:durableId="553809325">
-    <w:abstractNumId w:val="22"/>
-  </w:num>
-  <w:num w:numId="50" w16cid:durableId="838547143">
-    <w:abstractNumId w:val="18"/>
-  </w:num>
-  <w:num w:numId="51" w16cid:durableId="203490227">
-    <w:abstractNumId w:val="22"/>
-    <w:lvlOverride w:ilvl="0">
-      <w:startOverride w:val="1"/>
-    </w:lvlOverride>
-    <w:lvlOverride w:ilvl="1">
-      <w:startOverride w:val="1"/>
-    </w:lvlOverride>
-    <w:lvlOverride w:ilvl="2">
-      <w:startOverride w:val="1"/>
-    </w:lvlOverride>
-    <w:lvlOverride w:ilvl="3">
-      <w:startOverride w:val="1"/>
-    </w:lvlOverride>
-    <w:lvlOverride w:ilvl="4">
-      <w:startOverride w:val="1"/>
-    </w:lvlOverride>
-    <w:lvlOverride w:ilvl="5">
-      <w:startOverride w:val="1"/>
-    </w:lvlOverride>
-    <w:lvlOverride w:ilvl="6">
-      <w:startOverride w:val="1"/>
-    </w:lvlOverride>
-    <w:lvlOverride w:ilvl="7">
-      <w:startOverride w:val="1"/>
-    </w:lvlOverride>
-    <w:lvlOverride w:ilvl="8">
-      <w:startOverride w:val="1"/>
-    </w:lvlOverride>
-  </w:num>
-  <w:num w:numId="52" w16cid:durableId="609900721">
-    <w:abstractNumId w:val="37"/>
+    <w:abstractNumId w:val="36"/>
   </w:num>
   <w:numIdMacAtCleanup w:val="22"/>
 </w:numbering>
@@ -13678,26 +13315,22 @@
       <w:lang w:eastAsia="ru-RU"/>
     </w:rPr>
   </w:style>
-  <w:style w:type="paragraph" w:styleId="12">
+  <w:style w:type="paragraph" w:styleId="14">
     <w:name w:val="heading 1"/>
     <w:basedOn w:val="af"/>
     <w:next w:val="af"/>
-    <w:link w:val="14"/>
+    <w:link w:val="15"/>
     <w:uiPriority w:val="9"/>
     <w:unhideWhenUsed/>
     <w:qFormat/>
-    <w:rsid w:val="00876500"/>
+    <w:rsid w:val="00401E80"/>
     <w:pPr>
       <w:keepNext/>
       <w:keepLines/>
-      <w:numPr>
-        <w:numId w:val="49"/>
-      </w:numPr>
       <w:tabs>
         <w:tab w:val="left" w:pos="567"/>
       </w:tabs>
       <w:spacing w:before="480"/>
-      <w:ind w:left="0" w:firstLine="0"/>
       <w:outlineLvl w:val="0"/>
     </w:pPr>
     <w:rPr>
@@ -13717,19 +13350,14 @@
     <w:uiPriority w:val="9"/>
     <w:unhideWhenUsed/>
     <w:qFormat/>
-    <w:rsid w:val="00934734"/>
+    <w:rsid w:val="00401E80"/>
     <w:pPr>
       <w:keepNext/>
       <w:keepLines/>
-      <w:numPr>
-        <w:ilvl w:val="1"/>
-        <w:numId w:val="49"/>
-      </w:numPr>
       <w:tabs>
         <w:tab w:val="left" w:pos="567"/>
       </w:tabs>
       <w:spacing w:before="200"/>
-      <w:ind w:left="0" w:firstLine="0"/>
       <w:outlineLvl w:val="1"/>
     </w:pPr>
     <w:rPr>
@@ -13749,16 +13377,11 @@
     <w:uiPriority w:val="9"/>
     <w:unhideWhenUsed/>
     <w:qFormat/>
-    <w:rsid w:val="00934734"/>
+    <w:rsid w:val="00663057"/>
     <w:pPr>
       <w:keepNext/>
       <w:keepLines/>
-      <w:numPr>
-        <w:ilvl w:val="2"/>
-        <w:numId w:val="49"/>
-      </w:numPr>
       <w:spacing w:before="200"/>
-      <w:ind w:left="0" w:firstLine="0"/>
       <w:outlineLvl w:val="2"/>
     </w:pPr>
     <w:rPr>
@@ -13768,7 +13391,7 @@
       <w:color w:val="365F91" w:themeColor="accent1" w:themeShade="BF"/>
     </w:rPr>
   </w:style>
-  <w:style w:type="paragraph" w:styleId="40">
+  <w:style w:type="paragraph" w:styleId="41">
     <w:name w:val="heading 4"/>
     <w:basedOn w:val="af"/>
     <w:next w:val="af"/>
@@ -13780,10 +13403,6 @@
     <w:pPr>
       <w:keepNext/>
       <w:keepLines/>
-      <w:numPr>
-        <w:ilvl w:val="3"/>
-        <w:numId w:val="49"/>
-      </w:numPr>
       <w:spacing w:before="200"/>
       <w:outlineLvl w:val="3"/>
     </w:pPr>
@@ -13808,10 +13427,6 @@
     <w:pPr>
       <w:keepNext/>
       <w:keepLines/>
-      <w:numPr>
-        <w:ilvl w:val="4"/>
-        <w:numId w:val="49"/>
-      </w:numPr>
       <w:spacing w:before="200"/>
       <w:outlineLvl w:val="4"/>
     </w:pPr>
@@ -13820,7 +13435,7 @@
       <w:color w:val="243F60" w:themeColor="accent1" w:themeShade="7F"/>
     </w:rPr>
   </w:style>
-  <w:style w:type="paragraph" w:styleId="6">
+  <w:style w:type="paragraph" w:styleId="60">
     <w:name w:val="heading 6"/>
     <w:basedOn w:val="af"/>
     <w:next w:val="af"/>
@@ -13832,10 +13447,6 @@
     <w:pPr>
       <w:keepNext/>
       <w:keepLines/>
-      <w:numPr>
-        <w:ilvl w:val="5"/>
-        <w:numId w:val="49"/>
-      </w:numPr>
       <w:spacing w:before="200"/>
       <w:outlineLvl w:val="5"/>
     </w:pPr>
@@ -13858,10 +13469,6 @@
     <w:pPr>
       <w:keepNext/>
       <w:keepLines/>
-      <w:numPr>
-        <w:ilvl w:val="6"/>
-        <w:numId w:val="49"/>
-      </w:numPr>
       <w:spacing w:before="200"/>
       <w:outlineLvl w:val="6"/>
     </w:pPr>
@@ -13883,10 +13490,6 @@
     <w:qFormat/>
     <w:rsid w:val="00667F78"/>
     <w:pPr>
-      <w:numPr>
-        <w:ilvl w:val="7"/>
-        <w:numId w:val="49"/>
-      </w:numPr>
       <w:spacing w:before="240" w:after="60" w:line="240" w:lineRule="auto"/>
       <w:outlineLvl w:val="7"/>
     </w:pPr>
@@ -13909,10 +13512,6 @@
     <w:qFormat/>
     <w:rsid w:val="00667F78"/>
     <w:pPr>
-      <w:numPr>
-        <w:ilvl w:val="8"/>
-        <w:numId w:val="49"/>
-      </w:numPr>
       <w:spacing w:before="240" w:after="60" w:line="240" w:lineRule="auto"/>
       <w:outlineLvl w:val="8"/>
     </w:pPr>
@@ -13967,7 +13566,7 @@
   <w:style w:type="character" w:customStyle="1" w:styleId="61">
     <w:name w:val="Заголовок 6 Знак"/>
     <w:basedOn w:val="af0"/>
-    <w:link w:val="6"/>
+    <w:link w:val="60"/>
     <w:uiPriority w:val="9"/>
     <w:rsid w:val="00295CFA"/>
     <w:rPr>
@@ -14033,9 +13632,9 @@
   <w:style w:type="paragraph" w:customStyle="1" w:styleId="11">
     <w:name w:val="ДОК Заголовок 1"/>
     <w:basedOn w:val="af"/>
-    <w:link w:val="15"/>
+    <w:link w:val="16"/>
     <w:qFormat/>
-    <w:rsid w:val="00410A2A"/>
+    <w:rsid w:val="00A92DC4"/>
     <w:pPr>
       <w:pageBreakBefore/>
       <w:numPr>
@@ -14050,23 +13649,22 @@
       <w:bCs/>
       <w:noProof/>
       <w:color w:val="365F91" w:themeColor="accent1" w:themeShade="BF"/>
-      <w:sz w:val="28"/>
       <w:szCs w:val="22"/>
       <w:lang w:val="en-US"/>
     </w:rPr>
   </w:style>
-  <w:style w:type="character" w:customStyle="1" w:styleId="15">
+  <w:style w:type="character" w:customStyle="1" w:styleId="16">
     <w:name w:val="ДОК Заголовок 1 Знак"/>
     <w:basedOn w:val="af0"/>
     <w:link w:val="11"/>
-    <w:rsid w:val="00410A2A"/>
+    <w:rsid w:val="00A92DC4"/>
     <w:rPr>
       <w:rFonts w:ascii="Arial Narrow" w:eastAsia="Times New Roman" w:hAnsi="Arial Narrow" w:cs="Times New Roman"/>
       <w:b/>
       <w:bCs/>
       <w:noProof/>
       <w:color w:val="365F91" w:themeColor="accent1" w:themeShade="BF"/>
-      <w:sz w:val="28"/>
+      <w:sz w:val="24"/>
       <w:lang w:val="en-US" w:eastAsia="ru-RU"/>
     </w:rPr>
   </w:style>
@@ -14412,12 +14010,12 @@
       </w:tblBorders>
     </w:tblPr>
   </w:style>
-  <w:style w:type="character" w:customStyle="1" w:styleId="14">
+  <w:style w:type="character" w:customStyle="1" w:styleId="15">
     <w:name w:val="Заголовок 1 Знак"/>
     <w:basedOn w:val="af0"/>
-    <w:link w:val="12"/>
+    <w:link w:val="14"/>
     <w:uiPriority w:val="9"/>
-    <w:rsid w:val="00876500"/>
+    <w:rsid w:val="00401E80"/>
     <w:rPr>
       <w:rFonts w:ascii="Arial Narrow" w:eastAsiaTheme="majorEastAsia" w:hAnsi="Arial Narrow" w:cstheme="majorBidi"/>
       <w:b/>
@@ -14461,7 +14059,7 @@
     <w:basedOn w:val="af0"/>
     <w:link w:val="31"/>
     <w:uiPriority w:val="9"/>
-    <w:rsid w:val="00934734"/>
+    <w:rsid w:val="00663057"/>
     <w:rPr>
       <w:rFonts w:ascii="Arial Narrow" w:eastAsiaTheme="majorEastAsia" w:hAnsi="Arial Narrow" w:cstheme="majorBidi"/>
       <w:b/>
@@ -14487,7 +14085,7 @@
     <w:basedOn w:val="af0"/>
     <w:link w:val="22"/>
     <w:uiPriority w:val="9"/>
-    <w:rsid w:val="00934734"/>
+    <w:rsid w:val="00401E80"/>
     <w:rPr>
       <w:rFonts w:ascii="Arial Narrow" w:eastAsiaTheme="majorEastAsia" w:hAnsi="Arial Narrow" w:cstheme="majorBidi"/>
       <w:b/>
@@ -14501,7 +14099,7 @@
   <w:style w:type="character" w:customStyle="1" w:styleId="42">
     <w:name w:val="Заголовок 4 Знак"/>
     <w:basedOn w:val="af0"/>
-    <w:link w:val="40"/>
+    <w:link w:val="41"/>
     <w:uiPriority w:val="9"/>
     <w:rsid w:val="00951190"/>
     <w:rPr>
@@ -14638,7 +14236,7 @@
       <w:jc w:val="both"/>
     </w:pPr>
   </w:style>
-  <w:style w:type="paragraph" w:styleId="16">
+  <w:style w:type="paragraph" w:styleId="17">
     <w:name w:val="toc 1"/>
     <w:basedOn w:val="11"/>
     <w:next w:val="af"/>
@@ -15026,7 +14624,7 @@
     <w:semiHidden/>
     <w:rsid w:val="002E399C"/>
   </w:style>
-  <w:style w:type="character" w:customStyle="1" w:styleId="17">
+  <w:style w:type="character" w:customStyle="1" w:styleId="18">
     <w:name w:val="Неразрешенное упоминание1"/>
     <w:basedOn w:val="af0"/>
     <w:uiPriority w:val="99"/>
@@ -15374,7 +14972,7 @@
   </w:style>
   <w:style w:type="paragraph" w:styleId="afffff1">
     <w:name w:val="TOC Heading"/>
-    <w:basedOn w:val="12"/>
+    <w:basedOn w:val="14"/>
     <w:next w:val="af"/>
     <w:uiPriority w:val="39"/>
     <w:unhideWhenUsed/>
@@ -15615,7 +15213,7 @@
     <w:unhideWhenUsed/>
     <w:rsid w:val="00D76C1B"/>
   </w:style>
-  <w:style w:type="table" w:customStyle="1" w:styleId="18">
+  <w:style w:type="table" w:customStyle="1" w:styleId="19">
     <w:name w:val="Сетка таблицы1"/>
     <w:basedOn w:val="af1"/>
     <w:uiPriority w:val="59"/>
@@ -15908,7 +15506,7 @@
       <w:szCs w:val="20"/>
     </w:rPr>
   </w:style>
-  <w:style w:type="paragraph" w:customStyle="1" w:styleId="121">
+  <w:style w:type="paragraph" w:customStyle="1" w:styleId="120">
     <w:name w:val="ДОК Текст 12"/>
     <w:basedOn w:val="afff2"/>
     <w:uiPriority w:val="99"/>
@@ -15922,9 +15520,9 @@
       <w:szCs w:val="28"/>
     </w:rPr>
   </w:style>
-  <w:style w:type="paragraph" w:customStyle="1" w:styleId="122">
+  <w:style w:type="paragraph" w:customStyle="1" w:styleId="121">
     <w:name w:val="ДОК Текст 12 Центр"/>
-    <w:basedOn w:val="121"/>
+    <w:basedOn w:val="120"/>
     <w:uiPriority w:val="99"/>
     <w:rsid w:val="00D76C1B"/>
     <w:pPr>
@@ -16341,7 +15939,7 @@
       </w:tblBorders>
     </w:tblPr>
   </w:style>
-  <w:style w:type="table" w:customStyle="1" w:styleId="123">
+  <w:style w:type="table" w:customStyle="1" w:styleId="122">
     <w:name w:val="Сетка таблицы12"/>
     <w:basedOn w:val="af1"/>
     <w:uiPriority w:val="59"/>
@@ -16794,11 +16392,11 @@
       <w:szCs w:val="28"/>
     </w:rPr>
   </w:style>
-  <w:style w:type="paragraph" w:customStyle="1" w:styleId="19">
+  <w:style w:type="paragraph" w:customStyle="1" w:styleId="1a">
     <w:name w:val="ДОК Текст ур1 раздел"/>
     <w:basedOn w:val="af"/>
     <w:next w:val="2a"/>
-    <w:link w:val="1a"/>
+    <w:link w:val="1b"/>
     <w:qFormat/>
     <w:rsid w:val="00D76C1B"/>
     <w:pPr>
@@ -17056,10 +16654,10 @@
       <w:lang w:eastAsia="ru-RU"/>
     </w:rPr>
   </w:style>
-  <w:style w:type="character" w:customStyle="1" w:styleId="1a">
+  <w:style w:type="character" w:customStyle="1" w:styleId="1b">
     <w:name w:val="ДОК Текст ур1 раздел Знак"/>
     <w:basedOn w:val="af0"/>
-    <w:link w:val="19"/>
+    <w:link w:val="1a"/>
     <w:locked/>
     <w:rsid w:val="00D76C1B"/>
     <w:rPr>
@@ -17492,7 +17090,7 @@
   </w:style>
   <w:style w:type="paragraph" w:customStyle="1" w:styleId="1614">
     <w:name w:val="Стиль ДОК Текст ур1 раздел + После:  6 пт кернинг от 14 пт"/>
-    <w:basedOn w:val="19"/>
+    <w:basedOn w:val="1a"/>
     <w:rsid w:val="00D76C1B"/>
     <w:pPr>
       <w:keepNext w:val="0"/>
@@ -17503,10 +17101,10 @@
       <w:szCs w:val="20"/>
     </w:rPr>
   </w:style>
-  <w:style w:type="character" w:customStyle="1" w:styleId="124">
+  <w:style w:type="character" w:customStyle="1" w:styleId="123">
     <w:name w:val="ДОК Таблица Текст 12 Знак"/>
     <w:basedOn w:val="affa"/>
-    <w:link w:val="125"/>
+    <w:link w:val="124"/>
     <w:locked/>
     <w:rsid w:val="00D76C1B"/>
     <w:rPr>
@@ -17517,10 +17115,10 @@
       <w:lang w:eastAsia="ru-RU"/>
     </w:rPr>
   </w:style>
-  <w:style w:type="paragraph" w:customStyle="1" w:styleId="125">
+  <w:style w:type="paragraph" w:customStyle="1" w:styleId="124">
     <w:name w:val="ДОК Таблица Текст 12"/>
     <w:basedOn w:val="af7"/>
-    <w:link w:val="124"/>
+    <w:link w:val="123"/>
     <w:qFormat/>
     <w:rsid w:val="00D76C1B"/>
     <w:pPr>
@@ -17533,18 +17131,18 @@
       <w:szCs w:val="20"/>
     </w:rPr>
   </w:style>
-  <w:style w:type="paragraph" w:customStyle="1" w:styleId="126">
+  <w:style w:type="paragraph" w:customStyle="1" w:styleId="125">
     <w:name w:val="ДОК Таблица Текст Центр 12"/>
-    <w:basedOn w:val="125"/>
+    <w:basedOn w:val="124"/>
     <w:qFormat/>
     <w:rsid w:val="00D76C1B"/>
     <w:pPr>
       <w:jc w:val="center"/>
     </w:pPr>
   </w:style>
-  <w:style w:type="paragraph" w:customStyle="1" w:styleId="127">
+  <w:style w:type="paragraph" w:customStyle="1" w:styleId="126">
     <w:name w:val="ДОК Таблица Заголовок 12"/>
-    <w:basedOn w:val="125"/>
+    <w:basedOn w:val="124"/>
     <w:qFormat/>
     <w:rsid w:val="00D76C1B"/>
     <w:pPr>
@@ -17568,7 +17166,7 @@
       <w:vertAlign w:val="superscript"/>
     </w:rPr>
   </w:style>
-  <w:style w:type="character" w:customStyle="1" w:styleId="1b">
+  <w:style w:type="character" w:customStyle="1" w:styleId="1c">
     <w:name w:val="Знак Знак1"/>
     <w:uiPriority w:val="99"/>
     <w:semiHidden/>
@@ -18009,7 +17607,7 @@
       </w:numPr>
     </w:pPr>
   </w:style>
-  <w:style w:type="numbering" w:customStyle="1" w:styleId="120">
+  <w:style w:type="numbering" w:customStyle="1" w:styleId="12">
     <w:name w:val="Стиль нумерованный 12 пт"/>
     <w:rsid w:val="00D76C1B"/>
     <w:pPr>
@@ -18023,7 +17621,7 @@
     <w:uiPriority w:val="99"/>
     <w:rsid w:val="00D76C1B"/>
   </w:style>
-  <w:style w:type="numbering" w:customStyle="1" w:styleId="1c">
+  <w:style w:type="numbering" w:customStyle="1" w:styleId="1d">
     <w:name w:val="Приложенине1"/>
     <w:next w:val="afffffff3"/>
     <w:uiPriority w:val="99"/>
@@ -18039,7 +17637,7 @@
     <w:uiPriority w:val="99"/>
     <w:rsid w:val="00D76C1B"/>
   </w:style>
-  <w:style w:type="numbering" w:customStyle="1" w:styleId="1d">
+  <w:style w:type="numbering" w:customStyle="1" w:styleId="1e">
     <w:name w:val="ДОК Список Заголовков1"/>
     <w:uiPriority w:val="99"/>
     <w:rsid w:val="00D76C1B"/>
@@ -18054,18 +17652,18 @@
     <w:uiPriority w:val="99"/>
     <w:rsid w:val="00D76C1B"/>
   </w:style>
-  <w:style w:type="numbering" w:customStyle="1" w:styleId="1e">
+  <w:style w:type="numbering" w:customStyle="1" w:styleId="1f">
     <w:name w:val="ДОК Список Текст Нумерованный1"/>
     <w:basedOn w:val="af2"/>
     <w:uiPriority w:val="99"/>
     <w:rsid w:val="00D76C1B"/>
   </w:style>
-  <w:style w:type="numbering" w:customStyle="1" w:styleId="1f">
+  <w:style w:type="numbering" w:customStyle="1" w:styleId="1f0">
     <w:name w:val="ДОК Список Текст Маркированный1"/>
     <w:basedOn w:val="afd"/>
     <w:rsid w:val="00D76C1B"/>
   </w:style>
-  <w:style w:type="numbering" w:customStyle="1" w:styleId="1f0">
+  <w:style w:type="numbering" w:customStyle="1" w:styleId="1f1">
     <w:name w:val="Нет списка1"/>
     <w:next w:val="af2"/>
     <w:uiPriority w:val="99"/>
@@ -18078,7 +17676,7 @@
     <w:uiPriority w:val="99"/>
     <w:rsid w:val="00D76C1B"/>
   </w:style>
-  <w:style w:type="numbering" w:customStyle="1" w:styleId="1f1">
+  <w:style w:type="numbering" w:customStyle="1" w:styleId="1f2">
     <w:name w:val="ДОК Список Нумерованный1"/>
     <w:basedOn w:val="af2"/>
     <w:uiPriority w:val="99"/>
@@ -18144,7 +17742,7 @@
     <w:uiPriority w:val="99"/>
     <w:rsid w:val="00D76C1B"/>
   </w:style>
-  <w:style w:type="numbering" w:customStyle="1" w:styleId="128">
+  <w:style w:type="numbering" w:customStyle="1" w:styleId="127">
     <w:name w:val="Стиль12"/>
     <w:rsid w:val="00D76C1B"/>
   </w:style>
@@ -18183,7 +17781,7 @@
     <w:uiPriority w:val="99"/>
     <w:rsid w:val="00D76C1B"/>
   </w:style>
-  <w:style w:type="numbering" w:customStyle="1" w:styleId="41">
+  <w:style w:type="numbering" w:customStyle="1" w:styleId="40">
     <w:name w:val="ДОК Список Текст Маркированный4"/>
     <w:basedOn w:val="afd"/>
     <w:uiPriority w:val="99"/>
@@ -18208,7 +17806,7 @@
     <w:uiPriority w:val="99"/>
     <w:rsid w:val="00D76C1B"/>
   </w:style>
-  <w:style w:type="numbering" w:customStyle="1" w:styleId="129">
+  <w:style w:type="numbering" w:customStyle="1" w:styleId="128">
     <w:name w:val="Приложенине12"/>
     <w:next w:val="afffffff3"/>
     <w:uiPriority w:val="99"/>
@@ -18511,7 +18109,7 @@
     <w:uiPriority w:val="99"/>
     <w:rsid w:val="00D76C1B"/>
   </w:style>
-  <w:style w:type="numbering" w:customStyle="1" w:styleId="60">
+  <w:style w:type="numbering" w:customStyle="1" w:styleId="6">
     <w:name w:val="ДОК Список Текст Маркированный6"/>
     <w:basedOn w:val="afd"/>
     <w:uiPriority w:val="99"/>
@@ -18522,12 +18120,12 @@
       </w:numPr>
     </w:pPr>
   </w:style>
-  <w:style w:type="numbering" w:customStyle="1" w:styleId="1f2">
+  <w:style w:type="numbering" w:customStyle="1" w:styleId="1f3">
     <w:name w:val="ПРИЛОЖЕНИЕ1"/>
     <w:uiPriority w:val="99"/>
     <w:rsid w:val="00D76C1B"/>
   </w:style>
-  <w:style w:type="numbering" w:customStyle="1" w:styleId="1f3">
+  <w:style w:type="numbering" w:customStyle="1" w:styleId="1f4">
     <w:name w:val="Приложение1"/>
     <w:uiPriority w:val="99"/>
     <w:rsid w:val="00D76C1B"/>
@@ -18761,7 +18359,7 @@
   <w:style w:type="paragraph" w:customStyle="1" w:styleId="13">
     <w:name w:val="Обычный1"/>
     <w:basedOn w:val="af"/>
-    <w:link w:val="1f4"/>
+    <w:link w:val="1f5"/>
     <w:qFormat/>
     <w:rsid w:val="00537D18"/>
     <w:pPr>
@@ -18772,7 +18370,7 @@
       <w:snapToGrid w:val="0"/>
     </w:rPr>
   </w:style>
-  <w:style w:type="character" w:customStyle="1" w:styleId="1f4">
+  <w:style w:type="character" w:customStyle="1" w:styleId="1f5">
     <w:name w:val="Обычный1 Знак"/>
     <w:basedOn w:val="af0"/>
     <w:link w:val="13"/>
@@ -18866,7 +18464,7 @@
     </w:rPr>
     <w:tblPr/>
   </w:style>
-  <w:style w:type="paragraph" w:customStyle="1" w:styleId="1f5">
+  <w:style w:type="paragraph" w:customStyle="1" w:styleId="1f6">
     <w:name w:val="ЮИ_Заголовок_1"/>
     <w:basedOn w:val="af"/>
     <w:next w:val="af"/>

</xml_diff>

<commit_message>
v0.2 autoumerate section by word
</commit_message>
<xml_diff>
--- a/templates/title_page.docx
+++ b/templates/title_page.docx
@@ -4057,7 +4057,7 @@
     </w:tbl>
     <w:p>
       <w:pPr>
-        <w:pStyle w:val="1f6"/>
+        <w:pStyle w:val="1f5"/>
         <w:rPr>
           <w:lang w:val="ru-RU"/>
         </w:rPr>
@@ -4251,6 +4251,10 @@
     <w:p>
       <w:pPr>
         <w:pStyle w:val="afffff1"/>
+        <w:numPr>
+          <w:ilvl w:val="0"/>
+          <w:numId w:val="0"/>
+        </w:numPr>
         <w:rPr>
           <w:lang w:val="ru-RU"/>
         </w:rPr>
@@ -4490,15 +4494,11 @@
     </w:p>
     <w:p>
       <w:pPr>
-        <w:pStyle w:val="14"/>
+        <w:pStyle w:val="12"/>
       </w:pPr>
       <w:bookmarkStart w:id="0" w:name="X6df0dc407ac9d0d35d77f3b02cf3de2e76409b0"/>
       <w:r>
         <w:lastRenderedPageBreak/>
-        <w:t>1</w:t>
-      </w:r>
-      <w:r>
-        <w:tab/>
         <w:t>Климатические условия проведения испытаний</w:t>
       </w:r>
     </w:p>
@@ -4560,15 +4560,11 @@
     </w:p>
     <w:p>
       <w:pPr>
-        <w:pStyle w:val="14"/>
+        <w:pStyle w:val="12"/>
       </w:pPr>
       <w:bookmarkStart w:id="1" w:name="основные-технические-данные"/>
       <w:bookmarkEnd w:id="0"/>
       <w:r>
-        <w:t>2</w:t>
-      </w:r>
-      <w:r>
-        <w:tab/>
         <w:t>Основные технические данные устройств</w:t>
       </w:r>
     </w:p>
@@ -5302,17 +5298,13 @@
     </w:tbl>
     <w:p>
       <w:pPr>
-        <w:pStyle w:val="14"/>
+        <w:pStyle w:val="12"/>
       </w:pPr>
       <w:bookmarkStart w:id="7" w:name="дополнительные-сведения"/>
       <w:bookmarkEnd w:id="4"/>
       <w:bookmarkEnd w:id="5"/>
       <w:bookmarkEnd w:id="6"/>
       <w:r>
-        <w:t>3</w:t>
-      </w:r>
-      <w:r>
-        <w:tab/>
         <w:t>Дополнительные сведения</w:t>
       </w:r>
     </w:p>
@@ -5351,15 +5343,11 @@
     </w:p>
     <w:p>
       <w:pPr>
-        <w:pStyle w:val="14"/>
+        <w:pStyle w:val="12"/>
       </w:pPr>
       <w:bookmarkStart w:id="8" w:name="уставки-и-конфигурация"/>
       <w:bookmarkEnd w:id="7"/>
       <w:r>
-        <w:t>4</w:t>
-      </w:r>
-      <w:r>
-        <w:tab/>
         <w:t>Уставки и конфигурация</w:t>
       </w:r>
     </w:p>
@@ -5457,15 +5445,11 @@
     </w:p>
     <w:p>
       <w:pPr>
-        <w:pStyle w:val="14"/>
+        <w:pStyle w:val="12"/>
       </w:pPr>
       <w:bookmarkStart w:id="9" w:name="внешний-осмотр"/>
       <w:bookmarkEnd w:id="8"/>
       <w:r>
-        <w:t>5</w:t>
-      </w:r>
-      <w:r>
-        <w:tab/>
         <w:t>Внешний осмотр</w:t>
       </w:r>
     </w:p>
@@ -5738,15 +5722,11 @@
     </w:p>
     <w:p>
       <w:pPr>
-        <w:pStyle w:val="14"/>
+        <w:pStyle w:val="12"/>
       </w:pPr>
       <w:bookmarkStart w:id="10" w:name="X0e50c966c55b2f6f4209c430f930650427220e2"/>
       <w:bookmarkEnd w:id="9"/>
       <w:r>
-        <w:t>6</w:t>
-      </w:r>
-      <w:r>
-        <w:tab/>
         <w:t xml:space="preserve">Проверка конфигурирования и </w:t>
       </w:r>
       <w:proofErr w:type="spellStart"/>
@@ -5845,13 +5825,9 @@
     </w:p>
     <w:p>
       <w:pPr>
-        <w:pStyle w:val="14"/>
-      </w:pPr>
-      <w:r>
-        <w:t>7</w:t>
-      </w:r>
-      <w:r>
-        <w:tab/>
+        <w:pStyle w:val="12"/>
+      </w:pPr>
+      <w:r>
         <w:t>Проверка состояния изоляции</w:t>
       </w:r>
     </w:p>
@@ -5861,10 +5837,6 @@
       </w:pPr>
       <w:bookmarkStart w:id="12" w:name="X9687952bc1d30db593d75bc5681b56e0d46ca55"/>
       <w:r>
-        <w:t>7.1</w:t>
-      </w:r>
-      <w:r>
-        <w:tab/>
         <w:t xml:space="preserve">Измерение сопротивления изоляции </w:t>
       </w:r>
       <w:r>
@@ -6200,10 +6172,6 @@
         <w:pStyle w:val="22"/>
       </w:pPr>
       <w:r>
-        <w:t>7.2</w:t>
-      </w:r>
-      <w:r>
-        <w:tab/>
         <w:t>Измерение сопротивления изоляции шкафа с подключенными внешними цепями</w:t>
       </w:r>
     </w:p>
@@ -6514,17 +6482,13 @@
     </w:tbl>
     <w:p>
       <w:pPr>
-        <w:pStyle w:val="14"/>
+        <w:pStyle w:val="12"/>
       </w:pPr>
       <w:bookmarkStart w:id="16" w:name="X242d87850b64568d08d7180295cac2ddaededb8"/>
       <w:bookmarkEnd w:id="13"/>
       <w:bookmarkEnd w:id="14"/>
       <w:bookmarkEnd w:id="15"/>
       <w:r>
-        <w:t>8</w:t>
-      </w:r>
-      <w:r>
-        <w:tab/>
         <w:t>Проверка на соответствие проектным решениям</w:t>
       </w:r>
     </w:p>
@@ -6574,13 +6538,9 @@
     </w:p>
     <w:p>
       <w:pPr>
-        <w:pStyle w:val="14"/>
-      </w:pPr>
-      <w:r>
-        <w:t>9</w:t>
-      </w:r>
-      <w:r>
-        <w:tab/>
+        <w:pStyle w:val="12"/>
+      </w:pPr>
+      <w:r>
         <w:t>Задание требуемой конфигурации, уставок и режимов работы (</w:t>
       </w:r>
       <w:proofErr w:type="spellStart"/>
@@ -6689,7 +6649,6 @@
       </w:r>
       <w:bookmarkEnd w:id="17"/>
     </w:p>
-    <w:p/>
     <w:sectPr>
       <w:pgSz w:w="11907" w:h="16839" w:code="9"/>
       <w:pgMar w:top="567" w:right="567" w:bottom="567" w:left="1418" w:header="227" w:footer="227" w:gutter="0"/>
@@ -8198,6 +8157,95 @@
     </w:lvl>
   </w:abstractNum>
   <w:abstractNum w:abstractNumId="5" w15:restartNumberingAfterBreak="0">
+    <w:nsid w:val="06EB1B77"/>
+    <w:multiLevelType w:val="hybridMultilevel"/>
+    <w:tmpl w:val="347E0C6A"/>
+    <w:lvl w:ilvl="0" w:tplc="680C28DA">
+      <w:start w:val="1"/>
+      <w:numFmt w:val="decimal"/>
+      <w:lvlText w:val="%1"/>
+      <w:lvlJc w:val="left"/>
+      <w:pPr>
+        <w:ind w:left="720" w:hanging="360"/>
+      </w:pPr>
+      <w:rPr>
+        <w:rFonts w:hint="default"/>
+      </w:rPr>
+    </w:lvl>
+    <w:lvl w:ilvl="1" w:tplc="04190019" w:tentative="1">
+      <w:start w:val="1"/>
+      <w:numFmt w:val="lowerLetter"/>
+      <w:lvlText w:val="%2."/>
+      <w:lvlJc w:val="left"/>
+      <w:pPr>
+        <w:ind w:left="1440" w:hanging="360"/>
+      </w:pPr>
+    </w:lvl>
+    <w:lvl w:ilvl="2" w:tplc="0419001B" w:tentative="1">
+      <w:start w:val="1"/>
+      <w:numFmt w:val="lowerRoman"/>
+      <w:lvlText w:val="%3."/>
+      <w:lvlJc w:val="right"/>
+      <w:pPr>
+        <w:ind w:left="2160" w:hanging="180"/>
+      </w:pPr>
+    </w:lvl>
+    <w:lvl w:ilvl="3" w:tplc="0419000F" w:tentative="1">
+      <w:start w:val="1"/>
+      <w:numFmt w:val="decimal"/>
+      <w:lvlText w:val="%4."/>
+      <w:lvlJc w:val="left"/>
+      <w:pPr>
+        <w:ind w:left="2880" w:hanging="360"/>
+      </w:pPr>
+    </w:lvl>
+    <w:lvl w:ilvl="4" w:tplc="04190019" w:tentative="1">
+      <w:start w:val="1"/>
+      <w:numFmt w:val="lowerLetter"/>
+      <w:lvlText w:val="%5."/>
+      <w:lvlJc w:val="left"/>
+      <w:pPr>
+        <w:ind w:left="3600" w:hanging="360"/>
+      </w:pPr>
+    </w:lvl>
+    <w:lvl w:ilvl="5" w:tplc="0419001B" w:tentative="1">
+      <w:start w:val="1"/>
+      <w:numFmt w:val="lowerRoman"/>
+      <w:lvlText w:val="%6."/>
+      <w:lvlJc w:val="right"/>
+      <w:pPr>
+        <w:ind w:left="4320" w:hanging="180"/>
+      </w:pPr>
+    </w:lvl>
+    <w:lvl w:ilvl="6" w:tplc="0419000F" w:tentative="1">
+      <w:start w:val="1"/>
+      <w:numFmt w:val="decimal"/>
+      <w:lvlText w:val="%7."/>
+      <w:lvlJc w:val="left"/>
+      <w:pPr>
+        <w:ind w:left="5040" w:hanging="360"/>
+      </w:pPr>
+    </w:lvl>
+    <w:lvl w:ilvl="7" w:tplc="04190019" w:tentative="1">
+      <w:start w:val="1"/>
+      <w:numFmt w:val="lowerLetter"/>
+      <w:lvlText w:val="%8."/>
+      <w:lvlJc w:val="left"/>
+      <w:pPr>
+        <w:ind w:left="5760" w:hanging="360"/>
+      </w:pPr>
+    </w:lvl>
+    <w:lvl w:ilvl="8" w:tplc="0419001B" w:tentative="1">
+      <w:start w:val="1"/>
+      <w:numFmt w:val="lowerRoman"/>
+      <w:lvlText w:val="%9."/>
+      <w:lvlJc w:val="right"/>
+      <w:pPr>
+        <w:ind w:left="6480" w:hanging="180"/>
+      </w:pPr>
+    </w:lvl>
+  </w:abstractNum>
+  <w:abstractNum w:abstractNumId="6" w15:restartNumberingAfterBreak="0">
     <w:nsid w:val="0B5B4EDF"/>
     <w:multiLevelType w:val="hybridMultilevel"/>
     <w:tmpl w:val="9C90D258"/>
@@ -8285,7 +8333,7 @@
       </w:pPr>
     </w:lvl>
   </w:abstractNum>
-  <w:abstractNum w:abstractNumId="6" w15:restartNumberingAfterBreak="0">
+  <w:abstractNum w:abstractNumId="7" w15:restartNumberingAfterBreak="0">
     <w:nsid w:val="0B6C6D48"/>
     <w:multiLevelType w:val="hybridMultilevel"/>
     <w:tmpl w:val="78DCF446"/>
@@ -8400,7 +8448,7 @@
       </w:rPr>
     </w:lvl>
   </w:abstractNum>
-  <w:abstractNum w:abstractNumId="7" w15:restartNumberingAfterBreak="0">
+  <w:abstractNum w:abstractNumId="8" w15:restartNumberingAfterBreak="0">
     <w:nsid w:val="0EEF1815"/>
     <w:multiLevelType w:val="hybridMultilevel"/>
     <w:tmpl w:val="55A8637A"/>
@@ -8490,7 +8538,7 @@
       </w:pPr>
     </w:lvl>
   </w:abstractNum>
-  <w:abstractNum w:abstractNumId="8" w15:restartNumberingAfterBreak="0">
+  <w:abstractNum w:abstractNumId="9" w15:restartNumberingAfterBreak="0">
     <w:nsid w:val="19352F2E"/>
     <w:multiLevelType w:val="hybridMultilevel"/>
     <w:tmpl w:val="55A8637A"/>
@@ -8580,7 +8628,7 @@
       </w:pPr>
     </w:lvl>
   </w:abstractNum>
-  <w:abstractNum w:abstractNumId="9" w15:restartNumberingAfterBreak="0">
+  <w:abstractNum w:abstractNumId="10" w15:restartNumberingAfterBreak="0">
     <w:nsid w:val="1B6E0CFC"/>
     <w:multiLevelType w:val="multilevel"/>
     <w:tmpl w:val="8A6273DA"/>
@@ -8705,7 +8753,7 @@
       </w:rPr>
     </w:lvl>
   </w:abstractNum>
-  <w:abstractNum w:abstractNumId="10" w15:restartNumberingAfterBreak="0">
+  <w:abstractNum w:abstractNumId="11" w15:restartNumberingAfterBreak="0">
     <w:nsid w:val="1C4D6F6B"/>
     <w:multiLevelType w:val="multilevel"/>
     <w:tmpl w:val="0419001D"/>
@@ -8821,7 +8869,7 @@
       </w:rPr>
     </w:lvl>
   </w:abstractNum>
-  <w:abstractNum w:abstractNumId="11" w15:restartNumberingAfterBreak="0">
+  <w:abstractNum w:abstractNumId="12" w15:restartNumberingAfterBreak="0">
     <w:nsid w:val="228D3DFB"/>
     <w:multiLevelType w:val="hybridMultilevel"/>
     <w:tmpl w:val="ECFC4378"/>
@@ -8909,7 +8957,7 @@
       </w:pPr>
     </w:lvl>
   </w:abstractNum>
-  <w:abstractNum w:abstractNumId="12" w15:restartNumberingAfterBreak="0">
+  <w:abstractNum w:abstractNumId="13" w15:restartNumberingAfterBreak="0">
     <w:nsid w:val="234A0748"/>
     <w:multiLevelType w:val="hybridMultilevel"/>
     <w:tmpl w:val="40C2D860"/>
@@ -9000,7 +9048,7 @@
       </w:pPr>
     </w:lvl>
   </w:abstractNum>
-  <w:abstractNum w:abstractNumId="13" w15:restartNumberingAfterBreak="0">
+  <w:abstractNum w:abstractNumId="14" w15:restartNumberingAfterBreak="0">
     <w:nsid w:val="26750966"/>
     <w:multiLevelType w:val="multilevel"/>
     <w:tmpl w:val="9F5ADA7C"/>
@@ -9132,7 +9180,7 @@
       </w:rPr>
     </w:lvl>
   </w:abstractNum>
-  <w:abstractNum w:abstractNumId="14" w15:restartNumberingAfterBreak="0">
+  <w:abstractNum w:abstractNumId="15" w15:restartNumberingAfterBreak="0">
     <w:nsid w:val="272A29AD"/>
     <w:multiLevelType w:val="hybridMultilevel"/>
     <w:tmpl w:val="E7322A34"/>
@@ -9244,7 +9292,7 @@
       </w:rPr>
     </w:lvl>
   </w:abstractNum>
-  <w:abstractNum w:abstractNumId="15" w15:restartNumberingAfterBreak="0">
+  <w:abstractNum w:abstractNumId="16" w15:restartNumberingAfterBreak="0">
     <w:nsid w:val="274423DD"/>
     <w:multiLevelType w:val="hybridMultilevel"/>
     <w:tmpl w:val="1CFC491A"/>
@@ -9357,7 +9405,7 @@
       </w:rPr>
     </w:lvl>
   </w:abstractNum>
-  <w:abstractNum w:abstractNumId="16" w15:restartNumberingAfterBreak="0">
+  <w:abstractNum w:abstractNumId="17" w15:restartNumberingAfterBreak="0">
     <w:nsid w:val="277C019C"/>
     <w:multiLevelType w:val="multilevel"/>
     <w:tmpl w:val="3050EF66"/>
@@ -9606,7 +9654,93 @@
       </w:rPr>
     </w:lvl>
   </w:abstractNum>
-  <w:abstractNum w:abstractNumId="17" w15:restartNumberingAfterBreak="0">
+  <w:abstractNum w:abstractNumId="18" w15:restartNumberingAfterBreak="0">
+    <w:nsid w:val="2C6302E2"/>
+    <w:multiLevelType w:val="multilevel"/>
+    <w:tmpl w:val="0419001D"/>
+    <w:lvl w:ilvl="0">
+      <w:start w:val="1"/>
+      <w:numFmt w:val="decimal"/>
+      <w:lvlText w:val="%1)"/>
+      <w:lvlJc w:val="left"/>
+      <w:pPr>
+        <w:ind w:left="360" w:hanging="360"/>
+      </w:pPr>
+    </w:lvl>
+    <w:lvl w:ilvl="1">
+      <w:start w:val="1"/>
+      <w:numFmt w:val="lowerLetter"/>
+      <w:lvlText w:val="%2)"/>
+      <w:lvlJc w:val="left"/>
+      <w:pPr>
+        <w:ind w:left="720" w:hanging="360"/>
+      </w:pPr>
+    </w:lvl>
+    <w:lvl w:ilvl="2">
+      <w:start w:val="1"/>
+      <w:numFmt w:val="lowerRoman"/>
+      <w:lvlText w:val="%3)"/>
+      <w:lvlJc w:val="left"/>
+      <w:pPr>
+        <w:ind w:left="1080" w:hanging="360"/>
+      </w:pPr>
+    </w:lvl>
+    <w:lvl w:ilvl="3">
+      <w:start w:val="1"/>
+      <w:numFmt w:val="decimal"/>
+      <w:lvlText w:val="(%4)"/>
+      <w:lvlJc w:val="left"/>
+      <w:pPr>
+        <w:ind w:left="1440" w:hanging="360"/>
+      </w:pPr>
+    </w:lvl>
+    <w:lvl w:ilvl="4">
+      <w:start w:val="1"/>
+      <w:numFmt w:val="lowerLetter"/>
+      <w:lvlText w:val="(%5)"/>
+      <w:lvlJc w:val="left"/>
+      <w:pPr>
+        <w:ind w:left="1800" w:hanging="360"/>
+      </w:pPr>
+    </w:lvl>
+    <w:lvl w:ilvl="5">
+      <w:start w:val="1"/>
+      <w:numFmt w:val="lowerRoman"/>
+      <w:lvlText w:val="(%6)"/>
+      <w:lvlJc w:val="left"/>
+      <w:pPr>
+        <w:ind w:left="2160" w:hanging="360"/>
+      </w:pPr>
+    </w:lvl>
+    <w:lvl w:ilvl="6">
+      <w:start w:val="1"/>
+      <w:numFmt w:val="decimal"/>
+      <w:lvlText w:val="%7."/>
+      <w:lvlJc w:val="left"/>
+      <w:pPr>
+        <w:ind w:left="2520" w:hanging="360"/>
+      </w:pPr>
+    </w:lvl>
+    <w:lvl w:ilvl="7">
+      <w:start w:val="1"/>
+      <w:numFmt w:val="lowerLetter"/>
+      <w:lvlText w:val="%8."/>
+      <w:lvlJc w:val="left"/>
+      <w:pPr>
+        <w:ind w:left="2880" w:hanging="360"/>
+      </w:pPr>
+    </w:lvl>
+    <w:lvl w:ilvl="8">
+      <w:start w:val="1"/>
+      <w:numFmt w:val="lowerRoman"/>
+      <w:lvlText w:val="%9."/>
+      <w:lvlJc w:val="left"/>
+      <w:pPr>
+        <w:ind w:left="3240" w:hanging="360"/>
+      </w:pPr>
+    </w:lvl>
+  </w:abstractNum>
+  <w:abstractNum w:abstractNumId="19" w15:restartNumberingAfterBreak="0">
     <w:nsid w:val="2E744211"/>
     <w:multiLevelType w:val="multilevel"/>
     <w:tmpl w:val="D47AFD2E"/>
@@ -9816,7 +9950,7 @@
       </w:pPr>
     </w:lvl>
   </w:abstractNum>
-  <w:abstractNum w:abstractNumId="18" w15:restartNumberingAfterBreak="0">
+  <w:abstractNum w:abstractNumId="20" w15:restartNumberingAfterBreak="0">
     <w:nsid w:val="30C070CE"/>
     <w:multiLevelType w:val="multilevel"/>
     <w:tmpl w:val="60AE836C"/>
@@ -10093,7 +10227,7 @@
       </w:rPr>
     </w:lvl>
   </w:abstractNum>
-  <w:abstractNum w:abstractNumId="19" w15:restartNumberingAfterBreak="0">
+  <w:abstractNum w:abstractNumId="21" w15:restartNumberingAfterBreak="0">
     <w:nsid w:val="3363183B"/>
     <w:multiLevelType w:val="hybridMultilevel"/>
     <w:tmpl w:val="77F6A802"/>
@@ -10179,7 +10313,105 @@
       </w:pPr>
     </w:lvl>
   </w:abstractNum>
-  <w:abstractNum w:abstractNumId="20" w15:restartNumberingAfterBreak="0">
+  <w:abstractNum w:abstractNumId="22" w15:restartNumberingAfterBreak="0">
+    <w:nsid w:val="33CE1A7C"/>
+    <w:multiLevelType w:val="multilevel"/>
+    <w:tmpl w:val="04190025"/>
+    <w:lvl w:ilvl="0">
+      <w:start w:val="1"/>
+      <w:numFmt w:val="decimal"/>
+      <w:pStyle w:val="12"/>
+      <w:lvlText w:val="%1"/>
+      <w:lvlJc w:val="left"/>
+      <w:pPr>
+        <w:ind w:left="432" w:hanging="432"/>
+      </w:pPr>
+      <w:rPr>
+        <w:rFonts w:hint="default"/>
+      </w:rPr>
+    </w:lvl>
+    <w:lvl w:ilvl="1">
+      <w:start w:val="1"/>
+      <w:numFmt w:val="decimal"/>
+      <w:pStyle w:val="22"/>
+      <w:lvlText w:val="%1.%2"/>
+      <w:lvlJc w:val="left"/>
+      <w:pPr>
+        <w:ind w:left="576" w:hanging="576"/>
+      </w:pPr>
+    </w:lvl>
+    <w:lvl w:ilvl="2">
+      <w:start w:val="1"/>
+      <w:numFmt w:val="decimal"/>
+      <w:pStyle w:val="31"/>
+      <w:lvlText w:val="%1.%2.%3"/>
+      <w:lvlJc w:val="left"/>
+      <w:pPr>
+        <w:ind w:left="720" w:hanging="720"/>
+      </w:pPr>
+    </w:lvl>
+    <w:lvl w:ilvl="3">
+      <w:start w:val="1"/>
+      <w:numFmt w:val="decimal"/>
+      <w:pStyle w:val="40"/>
+      <w:lvlText w:val="%1.%2.%3.%4"/>
+      <w:lvlJc w:val="left"/>
+      <w:pPr>
+        <w:ind w:left="864" w:hanging="864"/>
+      </w:pPr>
+    </w:lvl>
+    <w:lvl w:ilvl="4">
+      <w:start w:val="1"/>
+      <w:numFmt w:val="decimal"/>
+      <w:pStyle w:val="50"/>
+      <w:lvlText w:val="%1.%2.%3.%4.%5"/>
+      <w:lvlJc w:val="left"/>
+      <w:pPr>
+        <w:ind w:left="1008" w:hanging="1008"/>
+      </w:pPr>
+    </w:lvl>
+    <w:lvl w:ilvl="5">
+      <w:start w:val="1"/>
+      <w:numFmt w:val="decimal"/>
+      <w:pStyle w:val="6"/>
+      <w:lvlText w:val="%1.%2.%3.%4.%5.%6"/>
+      <w:lvlJc w:val="left"/>
+      <w:pPr>
+        <w:ind w:left="1152" w:hanging="1152"/>
+      </w:pPr>
+    </w:lvl>
+    <w:lvl w:ilvl="6">
+      <w:start w:val="1"/>
+      <w:numFmt w:val="decimal"/>
+      <w:pStyle w:val="7"/>
+      <w:lvlText w:val="%1.%2.%3.%4.%5.%6.%7"/>
+      <w:lvlJc w:val="left"/>
+      <w:pPr>
+        <w:ind w:left="1296" w:hanging="1296"/>
+      </w:pPr>
+    </w:lvl>
+    <w:lvl w:ilvl="7">
+      <w:start w:val="1"/>
+      <w:numFmt w:val="decimal"/>
+      <w:pStyle w:val="8"/>
+      <w:lvlText w:val="%1.%2.%3.%4.%5.%6.%7.%8"/>
+      <w:lvlJc w:val="left"/>
+      <w:pPr>
+        <w:ind w:left="1440" w:hanging="1440"/>
+      </w:pPr>
+    </w:lvl>
+    <w:lvl w:ilvl="8">
+      <w:start w:val="1"/>
+      <w:numFmt w:val="decimal"/>
+      <w:pStyle w:val="9"/>
+      <w:lvlText w:val="%1.%2.%3.%4.%5.%6.%7.%8.%9"/>
+      <w:lvlJc w:val="left"/>
+      <w:pPr>
+        <w:ind w:left="1584" w:hanging="1584"/>
+      </w:pPr>
+    </w:lvl>
+  </w:abstractNum>
+  <w:abstractNum w:abstractNumId="23" w15:restartNumberingAfterBreak="0">
     <w:nsid w:val="349329F9"/>
     <w:multiLevelType w:val="multilevel"/>
     <w:tmpl w:val="5770D028"/>
@@ -10270,7 +10502,7 @@
       </w:pPr>
     </w:lvl>
   </w:abstractNum>
-  <w:abstractNum w:abstractNumId="21" w15:restartNumberingAfterBreak="0">
+  <w:abstractNum w:abstractNumId="24" w15:restartNumberingAfterBreak="0">
     <w:nsid w:val="34DB61DB"/>
     <w:multiLevelType w:val="multilevel"/>
     <w:tmpl w:val="E1A2C20A"/>
@@ -10361,7 +10593,7 @@
       </w:pPr>
     </w:lvl>
   </w:abstractNum>
-  <w:abstractNum w:abstractNumId="22" w15:restartNumberingAfterBreak="0">
+  <w:abstractNum w:abstractNumId="25" w15:restartNumberingAfterBreak="0">
     <w:nsid w:val="37601EE1"/>
     <w:multiLevelType w:val="hybridMultilevel"/>
     <w:tmpl w:val="C7D24832"/>
@@ -10453,7 +10685,7 @@
       </w:pPr>
     </w:lvl>
   </w:abstractNum>
-  <w:abstractNum w:abstractNumId="23" w15:restartNumberingAfterBreak="0">
+  <w:abstractNum w:abstractNumId="26" w15:restartNumberingAfterBreak="0">
     <w:nsid w:val="37782466"/>
     <w:multiLevelType w:val="hybridMultilevel"/>
     <w:tmpl w:val="55A8637A"/>
@@ -10543,11 +10775,11 @@
       </w:pPr>
     </w:lvl>
   </w:abstractNum>
-  <w:abstractNum w:abstractNumId="24" w15:restartNumberingAfterBreak="0">
+  <w:abstractNum w:abstractNumId="27" w15:restartNumberingAfterBreak="0">
     <w:nsid w:val="38654138"/>
     <w:multiLevelType w:val="multilevel"/>
     <w:tmpl w:val="AA96CC38"/>
-    <w:styleLink w:val="6"/>
+    <w:styleLink w:val="60"/>
     <w:lvl w:ilvl="0">
       <w:start w:val="1"/>
       <w:numFmt w:val="decimal"/>
@@ -10678,7 +10910,7 @@
       </w:rPr>
     </w:lvl>
   </w:abstractNum>
-  <w:abstractNum w:abstractNumId="25" w15:restartNumberingAfterBreak="0">
+  <w:abstractNum w:abstractNumId="28" w15:restartNumberingAfterBreak="0">
     <w:nsid w:val="3A806FE2"/>
     <w:multiLevelType w:val="hybridMultilevel"/>
     <w:tmpl w:val="55A8637A"/>
@@ -10768,7 +11000,7 @@
       </w:pPr>
     </w:lvl>
   </w:abstractNum>
-  <w:abstractNum w:abstractNumId="26" w15:restartNumberingAfterBreak="0">
+  <w:abstractNum w:abstractNumId="29" w15:restartNumberingAfterBreak="0">
     <w:nsid w:val="3F9B6C2E"/>
     <w:multiLevelType w:val="hybridMultilevel"/>
     <w:tmpl w:val="55A8637A"/>
@@ -10858,7 +11090,7 @@
       </w:pPr>
     </w:lvl>
   </w:abstractNum>
-  <w:abstractNum w:abstractNumId="27" w15:restartNumberingAfterBreak="0">
+  <w:abstractNum w:abstractNumId="30" w15:restartNumberingAfterBreak="0">
     <w:nsid w:val="41CF6D96"/>
     <w:multiLevelType w:val="hybridMultilevel"/>
     <w:tmpl w:val="55A8637A"/>
@@ -10948,7 +11180,7 @@
       </w:pPr>
     </w:lvl>
   </w:abstractNum>
-  <w:abstractNum w:abstractNumId="28" w15:restartNumberingAfterBreak="0">
+  <w:abstractNum w:abstractNumId="31" w15:restartNumberingAfterBreak="0">
     <w:nsid w:val="42F73AF4"/>
     <w:multiLevelType w:val="hybridMultilevel"/>
     <w:tmpl w:val="55A8637A"/>
@@ -11038,7 +11270,7 @@
       </w:pPr>
     </w:lvl>
   </w:abstractNum>
-  <w:abstractNum w:abstractNumId="29" w15:restartNumberingAfterBreak="0">
+  <w:abstractNum w:abstractNumId="32" w15:restartNumberingAfterBreak="0">
     <w:nsid w:val="459F2701"/>
     <w:multiLevelType w:val="multilevel"/>
     <w:tmpl w:val="A48036AE"/>
@@ -11181,7 +11413,7 @@
       </w:rPr>
     </w:lvl>
   </w:abstractNum>
-  <w:abstractNum w:abstractNumId="30" w15:restartNumberingAfterBreak="0">
+  <w:abstractNum w:abstractNumId="33" w15:restartNumberingAfterBreak="0">
     <w:nsid w:val="4AE45126"/>
     <w:multiLevelType w:val="multilevel"/>
     <w:tmpl w:val="7E8E8020"/>
@@ -11323,7 +11555,7 @@
       </w:rPr>
     </w:lvl>
   </w:abstractNum>
-  <w:abstractNum w:abstractNumId="31" w15:restartNumberingAfterBreak="0">
+  <w:abstractNum w:abstractNumId="34" w15:restartNumberingAfterBreak="0">
     <w:nsid w:val="4F012B3F"/>
     <w:multiLevelType w:val="hybridMultilevel"/>
     <w:tmpl w:val="55A8637A"/>
@@ -11413,11 +11645,11 @@
       </w:pPr>
     </w:lvl>
   </w:abstractNum>
-  <w:abstractNum w:abstractNumId="32" w15:restartNumberingAfterBreak="0">
+  <w:abstractNum w:abstractNumId="35" w15:restartNumberingAfterBreak="0">
     <w:nsid w:val="53BE5BDD"/>
     <w:multiLevelType w:val="multilevel"/>
     <w:tmpl w:val="763A0C4E"/>
-    <w:styleLink w:val="40"/>
+    <w:styleLink w:val="41"/>
     <w:lvl w:ilvl="0">
       <w:start w:val="1"/>
       <w:numFmt w:val="bullet"/>
@@ -11546,7 +11778,7 @@
       </w:rPr>
     </w:lvl>
   </w:abstractNum>
-  <w:abstractNum w:abstractNumId="33" w15:restartNumberingAfterBreak="0">
+  <w:abstractNum w:abstractNumId="36" w15:restartNumberingAfterBreak="0">
     <w:nsid w:val="543F35AD"/>
     <w:multiLevelType w:val="multilevel"/>
     <w:tmpl w:val="051ED0C4"/>
@@ -11637,11 +11869,100 @@
       </w:pPr>
     </w:lvl>
   </w:abstractNum>
-  <w:abstractNum w:abstractNumId="34" w15:restartNumberingAfterBreak="0">
+  <w:abstractNum w:abstractNumId="37" w15:restartNumberingAfterBreak="0">
+    <w:nsid w:val="5ACA3F80"/>
+    <w:multiLevelType w:val="multilevel"/>
+    <w:tmpl w:val="04190025"/>
+    <w:lvl w:ilvl="0">
+      <w:start w:val="1"/>
+      <w:numFmt w:val="decimal"/>
+      <w:lvlText w:val="%1"/>
+      <w:lvlJc w:val="left"/>
+      <w:pPr>
+        <w:ind w:left="432" w:hanging="432"/>
+      </w:pPr>
+      <w:rPr>
+        <w:rFonts w:hint="default"/>
+      </w:rPr>
+    </w:lvl>
+    <w:lvl w:ilvl="1">
+      <w:start w:val="1"/>
+      <w:numFmt w:val="decimal"/>
+      <w:lvlText w:val="%1.%2"/>
+      <w:lvlJc w:val="left"/>
+      <w:pPr>
+        <w:ind w:left="576" w:hanging="576"/>
+      </w:pPr>
+    </w:lvl>
+    <w:lvl w:ilvl="2">
+      <w:start w:val="1"/>
+      <w:numFmt w:val="decimal"/>
+      <w:lvlText w:val="%1.%2.%3"/>
+      <w:lvlJc w:val="left"/>
+      <w:pPr>
+        <w:ind w:left="720" w:hanging="720"/>
+      </w:pPr>
+    </w:lvl>
+    <w:lvl w:ilvl="3">
+      <w:start w:val="1"/>
+      <w:numFmt w:val="decimal"/>
+      <w:lvlText w:val="%1.%2.%3.%4"/>
+      <w:lvlJc w:val="left"/>
+      <w:pPr>
+        <w:ind w:left="864" w:hanging="864"/>
+      </w:pPr>
+    </w:lvl>
+    <w:lvl w:ilvl="4">
+      <w:start w:val="1"/>
+      <w:numFmt w:val="decimal"/>
+      <w:lvlText w:val="%1.%2.%3.%4.%5"/>
+      <w:lvlJc w:val="left"/>
+      <w:pPr>
+        <w:ind w:left="1008" w:hanging="1008"/>
+      </w:pPr>
+    </w:lvl>
+    <w:lvl w:ilvl="5">
+      <w:start w:val="1"/>
+      <w:numFmt w:val="decimal"/>
+      <w:lvlText w:val="%1.%2.%3.%4.%5.%6"/>
+      <w:lvlJc w:val="left"/>
+      <w:pPr>
+        <w:ind w:left="1152" w:hanging="1152"/>
+      </w:pPr>
+    </w:lvl>
+    <w:lvl w:ilvl="6">
+      <w:start w:val="1"/>
+      <w:numFmt w:val="decimal"/>
+      <w:lvlText w:val="%1.%2.%3.%4.%5.%6.%7"/>
+      <w:lvlJc w:val="left"/>
+      <w:pPr>
+        <w:ind w:left="1296" w:hanging="1296"/>
+      </w:pPr>
+    </w:lvl>
+    <w:lvl w:ilvl="7">
+      <w:start w:val="1"/>
+      <w:numFmt w:val="decimal"/>
+      <w:lvlText w:val="%1.%2.%3.%4.%5.%6.%7.%8"/>
+      <w:lvlJc w:val="left"/>
+      <w:pPr>
+        <w:ind w:left="1440" w:hanging="1440"/>
+      </w:pPr>
+    </w:lvl>
+    <w:lvl w:ilvl="8">
+      <w:start w:val="1"/>
+      <w:numFmt w:val="decimal"/>
+      <w:lvlText w:val="%1.%2.%3.%4.%5.%6.%7.%8.%9"/>
+      <w:lvlJc w:val="left"/>
+      <w:pPr>
+        <w:ind w:left="1584" w:hanging="1584"/>
+      </w:pPr>
+    </w:lvl>
+  </w:abstractNum>
+  <w:abstractNum w:abstractNumId="38" w15:restartNumberingAfterBreak="0">
     <w:nsid w:val="65D74793"/>
     <w:multiLevelType w:val="multilevel"/>
     <w:tmpl w:val="E0A0DCC2"/>
-    <w:styleLink w:val="12"/>
+    <w:styleLink w:val="120"/>
     <w:lvl w:ilvl="0">
       <w:start w:val="1"/>
       <w:numFmt w:val="decimal"/>
@@ -11728,7 +12049,7 @@
       </w:pPr>
     </w:lvl>
   </w:abstractNum>
-  <w:abstractNum w:abstractNumId="35" w15:restartNumberingAfterBreak="0">
+  <w:abstractNum w:abstractNumId="39" w15:restartNumberingAfterBreak="0">
     <w:nsid w:val="67631314"/>
     <w:multiLevelType w:val="hybridMultilevel"/>
     <w:tmpl w:val="55A8637A"/>
@@ -11818,7 +12139,7 @@
       </w:pPr>
     </w:lvl>
   </w:abstractNum>
-  <w:abstractNum w:abstractNumId="36" w15:restartNumberingAfterBreak="0">
+  <w:abstractNum w:abstractNumId="40" w15:restartNumberingAfterBreak="0">
     <w:nsid w:val="689562AF"/>
     <w:multiLevelType w:val="multilevel"/>
     <w:tmpl w:val="4F5E5844"/>
@@ -11923,7 +12244,7 @@
       </w:rPr>
     </w:lvl>
   </w:abstractNum>
-  <w:abstractNum w:abstractNumId="37" w15:restartNumberingAfterBreak="0">
+  <w:abstractNum w:abstractNumId="41" w15:restartNumberingAfterBreak="0">
     <w:nsid w:val="69DF5FAE"/>
     <w:multiLevelType w:val="hybridMultilevel"/>
     <w:tmpl w:val="55A8637A"/>
@@ -12013,7 +12334,7 @@
       </w:pPr>
     </w:lvl>
   </w:abstractNum>
-  <w:abstractNum w:abstractNumId="38" w15:restartNumberingAfterBreak="0">
+  <w:abstractNum w:abstractNumId="42" w15:restartNumberingAfterBreak="0">
     <w:nsid w:val="746926BE"/>
     <w:multiLevelType w:val="hybridMultilevel"/>
     <w:tmpl w:val="55A8637A"/>
@@ -12103,7 +12424,7 @@
       </w:pPr>
     </w:lvl>
   </w:abstractNum>
-  <w:abstractNum w:abstractNumId="39" w15:restartNumberingAfterBreak="0">
+  <w:abstractNum w:abstractNumId="43" w15:restartNumberingAfterBreak="0">
     <w:nsid w:val="74DD0F5E"/>
     <w:multiLevelType w:val="hybridMultilevel"/>
     <w:tmpl w:val="81CC108C"/>
@@ -12216,7 +12537,7 @@
       </w:rPr>
     </w:lvl>
   </w:abstractNum>
-  <w:abstractNum w:abstractNumId="40" w15:restartNumberingAfterBreak="0">
+  <w:abstractNum w:abstractNumId="44" w15:restartNumberingAfterBreak="0">
     <w:nsid w:val="796153C0"/>
     <w:multiLevelType w:val="hybridMultilevel"/>
     <w:tmpl w:val="456CB3DC"/>
@@ -12307,7 +12628,7 @@
       </w:pPr>
     </w:lvl>
   </w:abstractNum>
-  <w:abstractNum w:abstractNumId="41" w15:restartNumberingAfterBreak="0">
+  <w:abstractNum w:abstractNumId="45" w15:restartNumberingAfterBreak="0">
     <w:nsid w:val="79E2341E"/>
     <w:multiLevelType w:val="hybridMultilevel"/>
     <w:tmpl w:val="55A8637A"/>
@@ -12398,25 +12719,25 @@
     </w:lvl>
   </w:abstractNum>
   <w:num w:numId="1" w16cid:durableId="898707020">
-    <w:abstractNumId w:val="9"/>
+    <w:abstractNumId w:val="10"/>
   </w:num>
   <w:num w:numId="2" w16cid:durableId="1770389669">
-    <w:abstractNumId w:val="24"/>
+    <w:abstractNumId w:val="27"/>
   </w:num>
   <w:num w:numId="3" w16cid:durableId="440416075">
+    <w:abstractNumId w:val="35"/>
+  </w:num>
+  <w:num w:numId="4" w16cid:durableId="832531979">
+    <w:abstractNumId w:val="14"/>
+  </w:num>
+  <w:num w:numId="5" w16cid:durableId="1616206315">
     <w:abstractNumId w:val="32"/>
   </w:num>
-  <w:num w:numId="4" w16cid:durableId="832531979">
-    <w:abstractNumId w:val="13"/>
-  </w:num>
-  <w:num w:numId="5" w16cid:durableId="1616206315">
-    <w:abstractNumId w:val="29"/>
-  </w:num>
   <w:num w:numId="6" w16cid:durableId="241379521">
-    <w:abstractNumId w:val="18"/>
+    <w:abstractNumId w:val="20"/>
   </w:num>
   <w:num w:numId="7" w16cid:durableId="1009064325">
-    <w:abstractNumId w:val="6"/>
+    <w:abstractNumId w:val="7"/>
   </w:num>
   <w:num w:numId="8" w16cid:durableId="1343166565">
     <w:abstractNumId w:val="2"/>
@@ -12425,13 +12746,13 @@
     </w:lvlOverride>
   </w:num>
   <w:num w:numId="9" w16cid:durableId="1985620233">
-    <w:abstractNumId w:val="40"/>
+    <w:abstractNumId w:val="44"/>
   </w:num>
   <w:num w:numId="10" w16cid:durableId="1193109343">
-    <w:abstractNumId w:val="10"/>
+    <w:abstractNumId w:val="11"/>
   </w:num>
   <w:num w:numId="11" w16cid:durableId="182060031">
-    <w:abstractNumId w:val="30"/>
+    <w:abstractNumId w:val="33"/>
     <w:lvlOverride w:ilvl="0">
       <w:lvl w:ilvl="0">
         <w:start w:val="1"/>
@@ -12453,7 +12774,7 @@
     </w:lvlOverride>
   </w:num>
   <w:num w:numId="12" w16cid:durableId="1357583848">
-    <w:abstractNumId w:val="16"/>
+    <w:abstractNumId w:val="17"/>
     <w:lvlOverride w:ilvl="0">
       <w:lvl w:ilvl="0">
         <w:start w:val="1"/>
@@ -12716,7 +13037,7 @@
     </w:lvlOverride>
   </w:num>
   <w:num w:numId="13" w16cid:durableId="859322964">
-    <w:abstractNumId w:val="12"/>
+    <w:abstractNumId w:val="13"/>
   </w:num>
   <w:num w:numId="14" w16cid:durableId="715281109">
     <w:abstractNumId w:val="4"/>
@@ -12749,37 +13070,37 @@
     </w:lvlOverride>
   </w:num>
   <w:num w:numId="15" w16cid:durableId="593130490">
-    <w:abstractNumId w:val="17"/>
+    <w:abstractNumId w:val="19"/>
   </w:num>
   <w:num w:numId="16" w16cid:durableId="2018262411">
     <w:abstractNumId w:val="1"/>
   </w:num>
   <w:num w:numId="17" w16cid:durableId="631207072">
-    <w:abstractNumId w:val="11"/>
+    <w:abstractNumId w:val="12"/>
   </w:num>
   <w:num w:numId="18" w16cid:durableId="1030764800">
-    <w:abstractNumId w:val="5"/>
+    <w:abstractNumId w:val="6"/>
   </w:num>
   <w:num w:numId="19" w16cid:durableId="1720126100">
-    <w:abstractNumId w:val="20"/>
+    <w:abstractNumId w:val="23"/>
   </w:num>
   <w:num w:numId="20" w16cid:durableId="737676300">
-    <w:abstractNumId w:val="21"/>
+    <w:abstractNumId w:val="24"/>
   </w:num>
   <w:num w:numId="21" w16cid:durableId="1799834727">
+    <w:abstractNumId w:val="36"/>
+  </w:num>
+  <w:num w:numId="22" w16cid:durableId="613056206">
+    <w:abstractNumId w:val="38"/>
+  </w:num>
+  <w:num w:numId="23" w16cid:durableId="1713378219">
+    <w:abstractNumId w:val="17"/>
+  </w:num>
+  <w:num w:numId="24" w16cid:durableId="146166759">
     <w:abstractNumId w:val="33"/>
   </w:num>
-  <w:num w:numId="22" w16cid:durableId="613056206">
-    <w:abstractNumId w:val="34"/>
-  </w:num>
-  <w:num w:numId="23" w16cid:durableId="1713378219">
-    <w:abstractNumId w:val="16"/>
-  </w:num>
-  <w:num w:numId="24" w16cid:durableId="146166759">
-    <w:abstractNumId w:val="30"/>
-  </w:num>
   <w:num w:numId="25" w16cid:durableId="902376188">
-    <w:abstractNumId w:val="18"/>
+    <w:abstractNumId w:val="20"/>
     <w:lvlOverride w:ilvl="0">
       <w:startOverride w:val="1"/>
     </w:lvlOverride>
@@ -12809,7 +13130,7 @@
     </w:lvlOverride>
   </w:num>
   <w:num w:numId="26" w16cid:durableId="920215584">
-    <w:abstractNumId w:val="18"/>
+    <w:abstractNumId w:val="20"/>
     <w:lvlOverride w:ilvl="0">
       <w:startOverride w:val="2"/>
     </w:lvlOverride>
@@ -12839,67 +13160,109 @@
     </w:lvlOverride>
   </w:num>
   <w:num w:numId="27" w16cid:durableId="2141142806">
-    <w:abstractNumId w:val="25"/>
+    <w:abstractNumId w:val="28"/>
   </w:num>
   <w:num w:numId="28" w16cid:durableId="124858556">
-    <w:abstractNumId w:val="7"/>
+    <w:abstractNumId w:val="8"/>
   </w:num>
   <w:num w:numId="29" w16cid:durableId="1223638431">
-    <w:abstractNumId w:val="28"/>
+    <w:abstractNumId w:val="31"/>
   </w:num>
   <w:num w:numId="30" w16cid:durableId="824785319">
-    <w:abstractNumId w:val="35"/>
+    <w:abstractNumId w:val="39"/>
   </w:num>
   <w:num w:numId="31" w16cid:durableId="75783541">
-    <w:abstractNumId w:val="23"/>
+    <w:abstractNumId w:val="26"/>
   </w:num>
   <w:num w:numId="32" w16cid:durableId="1494029657">
     <w:abstractNumId w:val="3"/>
   </w:num>
   <w:num w:numId="33" w16cid:durableId="444814678">
-    <w:abstractNumId w:val="8"/>
+    <w:abstractNumId w:val="9"/>
   </w:num>
   <w:num w:numId="34" w16cid:durableId="1543862904">
-    <w:abstractNumId w:val="27"/>
+    <w:abstractNumId w:val="30"/>
   </w:num>
   <w:num w:numId="35" w16cid:durableId="1560436928">
-    <w:abstractNumId w:val="41"/>
+    <w:abstractNumId w:val="45"/>
   </w:num>
   <w:num w:numId="36" w16cid:durableId="2082675221">
-    <w:abstractNumId w:val="31"/>
+    <w:abstractNumId w:val="34"/>
   </w:num>
   <w:num w:numId="37" w16cid:durableId="1160149076">
-    <w:abstractNumId w:val="26"/>
+    <w:abstractNumId w:val="29"/>
   </w:num>
   <w:num w:numId="38" w16cid:durableId="240452958">
-    <w:abstractNumId w:val="38"/>
+    <w:abstractNumId w:val="42"/>
   </w:num>
   <w:num w:numId="39" w16cid:durableId="689185366">
-    <w:abstractNumId w:val="37"/>
+    <w:abstractNumId w:val="41"/>
   </w:num>
   <w:num w:numId="40" w16cid:durableId="319189690">
     <w:abstractNumId w:val="2"/>
   </w:num>
   <w:num w:numId="41" w16cid:durableId="1968314173">
-    <w:abstractNumId w:val="22"/>
+    <w:abstractNumId w:val="25"/>
   </w:num>
   <w:num w:numId="42" w16cid:durableId="2070573373">
-    <w:abstractNumId w:val="19"/>
+    <w:abstractNumId w:val="21"/>
   </w:num>
   <w:num w:numId="43" w16cid:durableId="1041445229">
-    <w:abstractNumId w:val="39"/>
+    <w:abstractNumId w:val="43"/>
   </w:num>
   <w:num w:numId="44" w16cid:durableId="1172139746">
-    <w:abstractNumId w:val="15"/>
+    <w:abstractNumId w:val="16"/>
   </w:num>
   <w:num w:numId="45" w16cid:durableId="2061784379">
-    <w:abstractNumId w:val="14"/>
+    <w:abstractNumId w:val="15"/>
   </w:num>
   <w:num w:numId="46" w16cid:durableId="2093431927">
     <w:abstractNumId w:val="0"/>
   </w:num>
   <w:num w:numId="47" w16cid:durableId="575482443">
-    <w:abstractNumId w:val="36"/>
+    <w:abstractNumId w:val="40"/>
+  </w:num>
+  <w:num w:numId="48" w16cid:durableId="1406608562">
+    <w:abstractNumId w:val="5"/>
+  </w:num>
+  <w:num w:numId="49" w16cid:durableId="553809325">
+    <w:abstractNumId w:val="22"/>
+  </w:num>
+  <w:num w:numId="50" w16cid:durableId="838547143">
+    <w:abstractNumId w:val="18"/>
+  </w:num>
+  <w:num w:numId="51" w16cid:durableId="203490227">
+    <w:abstractNumId w:val="22"/>
+    <w:lvlOverride w:ilvl="0">
+      <w:startOverride w:val="1"/>
+    </w:lvlOverride>
+    <w:lvlOverride w:ilvl="1">
+      <w:startOverride w:val="1"/>
+    </w:lvlOverride>
+    <w:lvlOverride w:ilvl="2">
+      <w:startOverride w:val="1"/>
+    </w:lvlOverride>
+    <w:lvlOverride w:ilvl="3">
+      <w:startOverride w:val="1"/>
+    </w:lvlOverride>
+    <w:lvlOverride w:ilvl="4">
+      <w:startOverride w:val="1"/>
+    </w:lvlOverride>
+    <w:lvlOverride w:ilvl="5">
+      <w:startOverride w:val="1"/>
+    </w:lvlOverride>
+    <w:lvlOverride w:ilvl="6">
+      <w:startOverride w:val="1"/>
+    </w:lvlOverride>
+    <w:lvlOverride w:ilvl="7">
+      <w:startOverride w:val="1"/>
+    </w:lvlOverride>
+    <w:lvlOverride w:ilvl="8">
+      <w:startOverride w:val="1"/>
+    </w:lvlOverride>
+  </w:num>
+  <w:num w:numId="52" w16cid:durableId="609900721">
+    <w:abstractNumId w:val="37"/>
   </w:num>
   <w:numIdMacAtCleanup w:val="22"/>
 </w:numbering>
@@ -13315,22 +13678,26 @@
       <w:lang w:eastAsia="ru-RU"/>
     </w:rPr>
   </w:style>
-  <w:style w:type="paragraph" w:styleId="14">
+  <w:style w:type="paragraph" w:styleId="12">
     <w:name w:val="heading 1"/>
     <w:basedOn w:val="af"/>
     <w:next w:val="af"/>
-    <w:link w:val="15"/>
+    <w:link w:val="14"/>
     <w:uiPriority w:val="9"/>
     <w:unhideWhenUsed/>
     <w:qFormat/>
-    <w:rsid w:val="00401E80"/>
+    <w:rsid w:val="00876500"/>
     <w:pPr>
       <w:keepNext/>
       <w:keepLines/>
+      <w:numPr>
+        <w:numId w:val="49"/>
+      </w:numPr>
       <w:tabs>
         <w:tab w:val="left" w:pos="567"/>
       </w:tabs>
       <w:spacing w:before="480"/>
+      <w:ind w:left="0" w:firstLine="0"/>
       <w:outlineLvl w:val="0"/>
     </w:pPr>
     <w:rPr>
@@ -13350,14 +13717,19 @@
     <w:uiPriority w:val="9"/>
     <w:unhideWhenUsed/>
     <w:qFormat/>
-    <w:rsid w:val="00401E80"/>
+    <w:rsid w:val="00934734"/>
     <w:pPr>
       <w:keepNext/>
       <w:keepLines/>
+      <w:numPr>
+        <w:ilvl w:val="1"/>
+        <w:numId w:val="49"/>
+      </w:numPr>
       <w:tabs>
         <w:tab w:val="left" w:pos="567"/>
       </w:tabs>
       <w:spacing w:before="200"/>
+      <w:ind w:left="0" w:firstLine="0"/>
       <w:outlineLvl w:val="1"/>
     </w:pPr>
     <w:rPr>
@@ -13377,11 +13749,16 @@
     <w:uiPriority w:val="9"/>
     <w:unhideWhenUsed/>
     <w:qFormat/>
-    <w:rsid w:val="00663057"/>
+    <w:rsid w:val="00934734"/>
     <w:pPr>
       <w:keepNext/>
       <w:keepLines/>
+      <w:numPr>
+        <w:ilvl w:val="2"/>
+        <w:numId w:val="49"/>
+      </w:numPr>
       <w:spacing w:before="200"/>
+      <w:ind w:left="0" w:firstLine="0"/>
       <w:outlineLvl w:val="2"/>
     </w:pPr>
     <w:rPr>
@@ -13391,7 +13768,7 @@
       <w:color w:val="365F91" w:themeColor="accent1" w:themeShade="BF"/>
     </w:rPr>
   </w:style>
-  <w:style w:type="paragraph" w:styleId="41">
+  <w:style w:type="paragraph" w:styleId="40">
     <w:name w:val="heading 4"/>
     <w:basedOn w:val="af"/>
     <w:next w:val="af"/>
@@ -13403,6 +13780,10 @@
     <w:pPr>
       <w:keepNext/>
       <w:keepLines/>
+      <w:numPr>
+        <w:ilvl w:val="3"/>
+        <w:numId w:val="49"/>
+      </w:numPr>
       <w:spacing w:before="200"/>
       <w:outlineLvl w:val="3"/>
     </w:pPr>
@@ -13427,6 +13808,10 @@
     <w:pPr>
       <w:keepNext/>
       <w:keepLines/>
+      <w:numPr>
+        <w:ilvl w:val="4"/>
+        <w:numId w:val="49"/>
+      </w:numPr>
       <w:spacing w:before="200"/>
       <w:outlineLvl w:val="4"/>
     </w:pPr>
@@ -13435,7 +13820,7 @@
       <w:color w:val="243F60" w:themeColor="accent1" w:themeShade="7F"/>
     </w:rPr>
   </w:style>
-  <w:style w:type="paragraph" w:styleId="60">
+  <w:style w:type="paragraph" w:styleId="6">
     <w:name w:val="heading 6"/>
     <w:basedOn w:val="af"/>
     <w:next w:val="af"/>
@@ -13447,6 +13832,10 @@
     <w:pPr>
       <w:keepNext/>
       <w:keepLines/>
+      <w:numPr>
+        <w:ilvl w:val="5"/>
+        <w:numId w:val="49"/>
+      </w:numPr>
       <w:spacing w:before="200"/>
       <w:outlineLvl w:val="5"/>
     </w:pPr>
@@ -13469,6 +13858,10 @@
     <w:pPr>
       <w:keepNext/>
       <w:keepLines/>
+      <w:numPr>
+        <w:ilvl w:val="6"/>
+        <w:numId w:val="49"/>
+      </w:numPr>
       <w:spacing w:before="200"/>
       <w:outlineLvl w:val="6"/>
     </w:pPr>
@@ -13490,6 +13883,10 @@
     <w:qFormat/>
     <w:rsid w:val="00667F78"/>
     <w:pPr>
+      <w:numPr>
+        <w:ilvl w:val="7"/>
+        <w:numId w:val="49"/>
+      </w:numPr>
       <w:spacing w:before="240" w:after="60" w:line="240" w:lineRule="auto"/>
       <w:outlineLvl w:val="7"/>
     </w:pPr>
@@ -13512,6 +13909,10 @@
     <w:qFormat/>
     <w:rsid w:val="00667F78"/>
     <w:pPr>
+      <w:numPr>
+        <w:ilvl w:val="8"/>
+        <w:numId w:val="49"/>
+      </w:numPr>
       <w:spacing w:before="240" w:after="60" w:line="240" w:lineRule="auto"/>
       <w:outlineLvl w:val="8"/>
     </w:pPr>
@@ -13566,7 +13967,7 @@
   <w:style w:type="character" w:customStyle="1" w:styleId="61">
     <w:name w:val="Заголовок 6 Знак"/>
     <w:basedOn w:val="af0"/>
-    <w:link w:val="60"/>
+    <w:link w:val="6"/>
     <w:uiPriority w:val="9"/>
     <w:rsid w:val="00295CFA"/>
     <w:rPr>
@@ -13632,9 +14033,9 @@
   <w:style w:type="paragraph" w:customStyle="1" w:styleId="11">
     <w:name w:val="ДОК Заголовок 1"/>
     <w:basedOn w:val="af"/>
-    <w:link w:val="16"/>
+    <w:link w:val="15"/>
     <w:qFormat/>
-    <w:rsid w:val="00A92DC4"/>
+    <w:rsid w:val="00410A2A"/>
     <w:pPr>
       <w:pageBreakBefore/>
       <w:numPr>
@@ -13649,22 +14050,23 @@
       <w:bCs/>
       <w:noProof/>
       <w:color w:val="365F91" w:themeColor="accent1" w:themeShade="BF"/>
+      <w:sz w:val="28"/>
       <w:szCs w:val="22"/>
       <w:lang w:val="en-US"/>
     </w:rPr>
   </w:style>
-  <w:style w:type="character" w:customStyle="1" w:styleId="16">
+  <w:style w:type="character" w:customStyle="1" w:styleId="15">
     <w:name w:val="ДОК Заголовок 1 Знак"/>
     <w:basedOn w:val="af0"/>
     <w:link w:val="11"/>
-    <w:rsid w:val="00A92DC4"/>
+    <w:rsid w:val="00410A2A"/>
     <w:rPr>
       <w:rFonts w:ascii="Arial Narrow" w:eastAsia="Times New Roman" w:hAnsi="Arial Narrow" w:cs="Times New Roman"/>
       <w:b/>
       <w:bCs/>
       <w:noProof/>
       <w:color w:val="365F91" w:themeColor="accent1" w:themeShade="BF"/>
-      <w:sz w:val="24"/>
+      <w:sz w:val="28"/>
       <w:lang w:val="en-US" w:eastAsia="ru-RU"/>
     </w:rPr>
   </w:style>
@@ -14010,12 +14412,12 @@
       </w:tblBorders>
     </w:tblPr>
   </w:style>
-  <w:style w:type="character" w:customStyle="1" w:styleId="15">
+  <w:style w:type="character" w:customStyle="1" w:styleId="14">
     <w:name w:val="Заголовок 1 Знак"/>
     <w:basedOn w:val="af0"/>
-    <w:link w:val="14"/>
+    <w:link w:val="12"/>
     <w:uiPriority w:val="9"/>
-    <w:rsid w:val="00401E80"/>
+    <w:rsid w:val="00876500"/>
     <w:rPr>
       <w:rFonts w:ascii="Arial Narrow" w:eastAsiaTheme="majorEastAsia" w:hAnsi="Arial Narrow" w:cstheme="majorBidi"/>
       <w:b/>
@@ -14059,7 +14461,7 @@
     <w:basedOn w:val="af0"/>
     <w:link w:val="31"/>
     <w:uiPriority w:val="9"/>
-    <w:rsid w:val="00663057"/>
+    <w:rsid w:val="00934734"/>
     <w:rPr>
       <w:rFonts w:ascii="Arial Narrow" w:eastAsiaTheme="majorEastAsia" w:hAnsi="Arial Narrow" w:cstheme="majorBidi"/>
       <w:b/>
@@ -14085,7 +14487,7 @@
     <w:basedOn w:val="af0"/>
     <w:link w:val="22"/>
     <w:uiPriority w:val="9"/>
-    <w:rsid w:val="00401E80"/>
+    <w:rsid w:val="00934734"/>
     <w:rPr>
       <w:rFonts w:ascii="Arial Narrow" w:eastAsiaTheme="majorEastAsia" w:hAnsi="Arial Narrow" w:cstheme="majorBidi"/>
       <w:b/>
@@ -14099,7 +14501,7 @@
   <w:style w:type="character" w:customStyle="1" w:styleId="42">
     <w:name w:val="Заголовок 4 Знак"/>
     <w:basedOn w:val="af0"/>
-    <w:link w:val="41"/>
+    <w:link w:val="40"/>
     <w:uiPriority w:val="9"/>
     <w:rsid w:val="00951190"/>
     <w:rPr>
@@ -14236,7 +14638,7 @@
       <w:jc w:val="both"/>
     </w:pPr>
   </w:style>
-  <w:style w:type="paragraph" w:styleId="17">
+  <w:style w:type="paragraph" w:styleId="16">
     <w:name w:val="toc 1"/>
     <w:basedOn w:val="11"/>
     <w:next w:val="af"/>
@@ -14624,7 +15026,7 @@
     <w:semiHidden/>
     <w:rsid w:val="002E399C"/>
   </w:style>
-  <w:style w:type="character" w:customStyle="1" w:styleId="18">
+  <w:style w:type="character" w:customStyle="1" w:styleId="17">
     <w:name w:val="Неразрешенное упоминание1"/>
     <w:basedOn w:val="af0"/>
     <w:uiPriority w:val="99"/>
@@ -14972,7 +15374,7 @@
   </w:style>
   <w:style w:type="paragraph" w:styleId="afffff1">
     <w:name w:val="TOC Heading"/>
-    <w:basedOn w:val="14"/>
+    <w:basedOn w:val="12"/>
     <w:next w:val="af"/>
     <w:uiPriority w:val="39"/>
     <w:unhideWhenUsed/>
@@ -15213,7 +15615,7 @@
     <w:unhideWhenUsed/>
     <w:rsid w:val="00D76C1B"/>
   </w:style>
-  <w:style w:type="table" w:customStyle="1" w:styleId="19">
+  <w:style w:type="table" w:customStyle="1" w:styleId="18">
     <w:name w:val="Сетка таблицы1"/>
     <w:basedOn w:val="af1"/>
     <w:uiPriority w:val="59"/>
@@ -15506,7 +15908,7 @@
       <w:szCs w:val="20"/>
     </w:rPr>
   </w:style>
-  <w:style w:type="paragraph" w:customStyle="1" w:styleId="120">
+  <w:style w:type="paragraph" w:customStyle="1" w:styleId="121">
     <w:name w:val="ДОК Текст 12"/>
     <w:basedOn w:val="afff2"/>
     <w:uiPriority w:val="99"/>
@@ -15520,9 +15922,9 @@
       <w:szCs w:val="28"/>
     </w:rPr>
   </w:style>
-  <w:style w:type="paragraph" w:customStyle="1" w:styleId="121">
+  <w:style w:type="paragraph" w:customStyle="1" w:styleId="122">
     <w:name w:val="ДОК Текст 12 Центр"/>
-    <w:basedOn w:val="120"/>
+    <w:basedOn w:val="121"/>
     <w:uiPriority w:val="99"/>
     <w:rsid w:val="00D76C1B"/>
     <w:pPr>
@@ -15939,7 +16341,7 @@
       </w:tblBorders>
     </w:tblPr>
   </w:style>
-  <w:style w:type="table" w:customStyle="1" w:styleId="122">
+  <w:style w:type="table" w:customStyle="1" w:styleId="123">
     <w:name w:val="Сетка таблицы12"/>
     <w:basedOn w:val="af1"/>
     <w:uiPriority w:val="59"/>
@@ -16392,11 +16794,11 @@
       <w:szCs w:val="28"/>
     </w:rPr>
   </w:style>
-  <w:style w:type="paragraph" w:customStyle="1" w:styleId="1a">
+  <w:style w:type="paragraph" w:customStyle="1" w:styleId="19">
     <w:name w:val="ДОК Текст ур1 раздел"/>
     <w:basedOn w:val="af"/>
     <w:next w:val="2a"/>
-    <w:link w:val="1b"/>
+    <w:link w:val="1a"/>
     <w:qFormat/>
     <w:rsid w:val="00D76C1B"/>
     <w:pPr>
@@ -16654,10 +17056,10 @@
       <w:lang w:eastAsia="ru-RU"/>
     </w:rPr>
   </w:style>
-  <w:style w:type="character" w:customStyle="1" w:styleId="1b">
+  <w:style w:type="character" w:customStyle="1" w:styleId="1a">
     <w:name w:val="ДОК Текст ур1 раздел Знак"/>
     <w:basedOn w:val="af0"/>
-    <w:link w:val="1a"/>
+    <w:link w:val="19"/>
     <w:locked/>
     <w:rsid w:val="00D76C1B"/>
     <w:rPr>
@@ -17090,7 +17492,7 @@
   </w:style>
   <w:style w:type="paragraph" w:customStyle="1" w:styleId="1614">
     <w:name w:val="Стиль ДОК Текст ур1 раздел + После:  6 пт кернинг от 14 пт"/>
-    <w:basedOn w:val="1a"/>
+    <w:basedOn w:val="19"/>
     <w:rsid w:val="00D76C1B"/>
     <w:pPr>
       <w:keepNext w:val="0"/>
@@ -17101,10 +17503,10 @@
       <w:szCs w:val="20"/>
     </w:rPr>
   </w:style>
-  <w:style w:type="character" w:customStyle="1" w:styleId="123">
+  <w:style w:type="character" w:customStyle="1" w:styleId="124">
     <w:name w:val="ДОК Таблица Текст 12 Знак"/>
     <w:basedOn w:val="affa"/>
-    <w:link w:val="124"/>
+    <w:link w:val="125"/>
     <w:locked/>
     <w:rsid w:val="00D76C1B"/>
     <w:rPr>
@@ -17115,10 +17517,10 @@
       <w:lang w:eastAsia="ru-RU"/>
     </w:rPr>
   </w:style>
-  <w:style w:type="paragraph" w:customStyle="1" w:styleId="124">
+  <w:style w:type="paragraph" w:customStyle="1" w:styleId="125">
     <w:name w:val="ДОК Таблица Текст 12"/>
     <w:basedOn w:val="af7"/>
-    <w:link w:val="123"/>
+    <w:link w:val="124"/>
     <w:qFormat/>
     <w:rsid w:val="00D76C1B"/>
     <w:pPr>
@@ -17131,18 +17533,18 @@
       <w:szCs w:val="20"/>
     </w:rPr>
   </w:style>
-  <w:style w:type="paragraph" w:customStyle="1" w:styleId="125">
+  <w:style w:type="paragraph" w:customStyle="1" w:styleId="126">
     <w:name w:val="ДОК Таблица Текст Центр 12"/>
-    <w:basedOn w:val="124"/>
+    <w:basedOn w:val="125"/>
     <w:qFormat/>
     <w:rsid w:val="00D76C1B"/>
     <w:pPr>
       <w:jc w:val="center"/>
     </w:pPr>
   </w:style>
-  <w:style w:type="paragraph" w:customStyle="1" w:styleId="126">
+  <w:style w:type="paragraph" w:customStyle="1" w:styleId="127">
     <w:name w:val="ДОК Таблица Заголовок 12"/>
-    <w:basedOn w:val="124"/>
+    <w:basedOn w:val="125"/>
     <w:qFormat/>
     <w:rsid w:val="00D76C1B"/>
     <w:pPr>
@@ -17166,7 +17568,7 @@
       <w:vertAlign w:val="superscript"/>
     </w:rPr>
   </w:style>
-  <w:style w:type="character" w:customStyle="1" w:styleId="1c">
+  <w:style w:type="character" w:customStyle="1" w:styleId="1b">
     <w:name w:val="Знак Знак1"/>
     <w:uiPriority w:val="99"/>
     <w:semiHidden/>
@@ -17607,7 +18009,7 @@
       </w:numPr>
     </w:pPr>
   </w:style>
-  <w:style w:type="numbering" w:customStyle="1" w:styleId="12">
+  <w:style w:type="numbering" w:customStyle="1" w:styleId="120">
     <w:name w:val="Стиль нумерованный 12 пт"/>
     <w:rsid w:val="00D76C1B"/>
     <w:pPr>
@@ -17621,7 +18023,7 @@
     <w:uiPriority w:val="99"/>
     <w:rsid w:val="00D76C1B"/>
   </w:style>
-  <w:style w:type="numbering" w:customStyle="1" w:styleId="1d">
+  <w:style w:type="numbering" w:customStyle="1" w:styleId="1c">
     <w:name w:val="Приложенине1"/>
     <w:next w:val="afffffff3"/>
     <w:uiPriority w:val="99"/>
@@ -17637,7 +18039,7 @@
     <w:uiPriority w:val="99"/>
     <w:rsid w:val="00D76C1B"/>
   </w:style>
-  <w:style w:type="numbering" w:customStyle="1" w:styleId="1e">
+  <w:style w:type="numbering" w:customStyle="1" w:styleId="1d">
     <w:name w:val="ДОК Список Заголовков1"/>
     <w:uiPriority w:val="99"/>
     <w:rsid w:val="00D76C1B"/>
@@ -17652,18 +18054,18 @@
     <w:uiPriority w:val="99"/>
     <w:rsid w:val="00D76C1B"/>
   </w:style>
-  <w:style w:type="numbering" w:customStyle="1" w:styleId="1f">
+  <w:style w:type="numbering" w:customStyle="1" w:styleId="1e">
     <w:name w:val="ДОК Список Текст Нумерованный1"/>
     <w:basedOn w:val="af2"/>
     <w:uiPriority w:val="99"/>
     <w:rsid w:val="00D76C1B"/>
   </w:style>
-  <w:style w:type="numbering" w:customStyle="1" w:styleId="1f0">
+  <w:style w:type="numbering" w:customStyle="1" w:styleId="1f">
     <w:name w:val="ДОК Список Текст Маркированный1"/>
     <w:basedOn w:val="afd"/>
     <w:rsid w:val="00D76C1B"/>
   </w:style>
-  <w:style w:type="numbering" w:customStyle="1" w:styleId="1f1">
+  <w:style w:type="numbering" w:customStyle="1" w:styleId="1f0">
     <w:name w:val="Нет списка1"/>
     <w:next w:val="af2"/>
     <w:uiPriority w:val="99"/>
@@ -17676,7 +18078,7 @@
     <w:uiPriority w:val="99"/>
     <w:rsid w:val="00D76C1B"/>
   </w:style>
-  <w:style w:type="numbering" w:customStyle="1" w:styleId="1f2">
+  <w:style w:type="numbering" w:customStyle="1" w:styleId="1f1">
     <w:name w:val="ДОК Список Нумерованный1"/>
     <w:basedOn w:val="af2"/>
     <w:uiPriority w:val="99"/>
@@ -17742,7 +18144,7 @@
     <w:uiPriority w:val="99"/>
     <w:rsid w:val="00D76C1B"/>
   </w:style>
-  <w:style w:type="numbering" w:customStyle="1" w:styleId="127">
+  <w:style w:type="numbering" w:customStyle="1" w:styleId="128">
     <w:name w:val="Стиль12"/>
     <w:rsid w:val="00D76C1B"/>
   </w:style>
@@ -17781,7 +18183,7 @@
     <w:uiPriority w:val="99"/>
     <w:rsid w:val="00D76C1B"/>
   </w:style>
-  <w:style w:type="numbering" w:customStyle="1" w:styleId="40">
+  <w:style w:type="numbering" w:customStyle="1" w:styleId="41">
     <w:name w:val="ДОК Список Текст Маркированный4"/>
     <w:basedOn w:val="afd"/>
     <w:uiPriority w:val="99"/>
@@ -17806,7 +18208,7 @@
     <w:uiPriority w:val="99"/>
     <w:rsid w:val="00D76C1B"/>
   </w:style>
-  <w:style w:type="numbering" w:customStyle="1" w:styleId="128">
+  <w:style w:type="numbering" w:customStyle="1" w:styleId="129">
     <w:name w:val="Приложенине12"/>
     <w:next w:val="afffffff3"/>
     <w:uiPriority w:val="99"/>
@@ -18109,7 +18511,7 @@
     <w:uiPriority w:val="99"/>
     <w:rsid w:val="00D76C1B"/>
   </w:style>
-  <w:style w:type="numbering" w:customStyle="1" w:styleId="6">
+  <w:style w:type="numbering" w:customStyle="1" w:styleId="60">
     <w:name w:val="ДОК Список Текст Маркированный6"/>
     <w:basedOn w:val="afd"/>
     <w:uiPriority w:val="99"/>
@@ -18120,12 +18522,12 @@
       </w:numPr>
     </w:pPr>
   </w:style>
-  <w:style w:type="numbering" w:customStyle="1" w:styleId="1f3">
+  <w:style w:type="numbering" w:customStyle="1" w:styleId="1f2">
     <w:name w:val="ПРИЛОЖЕНИЕ1"/>
     <w:uiPriority w:val="99"/>
     <w:rsid w:val="00D76C1B"/>
   </w:style>
-  <w:style w:type="numbering" w:customStyle="1" w:styleId="1f4">
+  <w:style w:type="numbering" w:customStyle="1" w:styleId="1f3">
     <w:name w:val="Приложение1"/>
     <w:uiPriority w:val="99"/>
     <w:rsid w:val="00D76C1B"/>
@@ -18359,7 +18761,7 @@
   <w:style w:type="paragraph" w:customStyle="1" w:styleId="13">
     <w:name w:val="Обычный1"/>
     <w:basedOn w:val="af"/>
-    <w:link w:val="1f5"/>
+    <w:link w:val="1f4"/>
     <w:qFormat/>
     <w:rsid w:val="00537D18"/>
     <w:pPr>
@@ -18370,7 +18772,7 @@
       <w:snapToGrid w:val="0"/>
     </w:rPr>
   </w:style>
-  <w:style w:type="character" w:customStyle="1" w:styleId="1f5">
+  <w:style w:type="character" w:customStyle="1" w:styleId="1f4">
     <w:name w:val="Обычный1 Знак"/>
     <w:basedOn w:val="af0"/>
     <w:link w:val="13"/>
@@ -18464,7 +18866,7 @@
     </w:rPr>
     <w:tblPr/>
   </w:style>
-  <w:style w:type="paragraph" w:customStyle="1" w:styleId="1f6">
+  <w:style w:type="paragraph" w:customStyle="1" w:styleId="1f5">
     <w:name w:val="ЮИ_Заголовок_1"/>
     <w:basedOn w:val="af"/>
     <w:next w:val="af"/>

</xml_diff>